<commit_message>
the mobile companion app
the mobile companion app as a deferred, standalone project (its own codebase/repo, not folded into this one). Covers why it must be separate, the two approaches (web-companion/PWA vs native Avalonia), the key constraints (APRS-IS-only by default, BLE TNC as the only realistic RF path, app-store notes), and a recommendation to start with the web-companion path. The full feature-comparison table + strengths/gaps + sources are included as an appendix.
</commit_message>
<xml_diff>
--- a/docs/USER_MANUAL.docx
+++ b/docs/USER_MANUAL.docx
@@ -110,7 +110,7 @@
         <w:t>Bob Bruninga WB4APR</w:t>
       </w:r>
       <w:r>
-        <w:t xml:space="preserve"> invented APRS in the early 1990s. He spent decades building and refining it, and he was always clear about what it was for. APRS is not a tracking system. It is a </w:t>
+        <w:t xml:space="preserve"> began building what became APRS in the early 1980s — his first position-mapping software ran on an Apple II in 1982, and a 1984 version tracked riders in a 100-mile endurance run — and he spent the following decades refining it into the system we use today. He was always clear about what it was for. APRS is not a tracking system. It is a </w:t>
       </w:r>
       <w:r>
         <w:rPr>
@@ -2201,6 +2201,3605 @@
           <w:color w:val="1F4E79"/>
           <w:sz w:val="56"/>
         </w:rPr>
+        <w:t>Installing APRS Command</w:t>
+      </w:r>
+    </w:p>
+    <w:p>
+      <w:pPr>
+        <w:pBdr>
+          <w:bottom w:val="single" w:sz="12" w:space="8" w:color="1F4E79"/>
+        </w:pBdr>
+      </w:pPr>
+      <w:r>
+        <w:rPr>
+          <w:i/>
+          <w:color w:val="64748B"/>
+          <w:sz w:val="23"/>
+        </w:rPr>
+        <w:t>Getting the program onto your computer — Windows, macOS, Linux, or a Raspberry Pi.</w:t>
+      </w:r>
+    </w:p>
+    <w:p>
+      <w:pPr>
+        <w:spacing w:after="0"/>
+      </w:pPr>
+    </w:p>
+    <w:p>
+      <w:pPr>
+        <w:spacing w:after="40"/>
+      </w:pPr>
+      <w:r>
+        <w:rPr>
+          <w:rFonts w:ascii="Segoe UI Semibold" w:hAnsi="Segoe UI Semibold"/>
+          <w:b/>
+          <w:color w:val="64748B"/>
+          <w:sz w:val="18"/>
+        </w:rPr>
+        <w:t>IN THIS CHAPTER</w:t>
+      </w:r>
+    </w:p>
+    <w:p>
+      <w:pPr>
+        <w:spacing w:after="20"/>
+        <w:ind w:left="288"/>
+      </w:pPr>
+      <w:r>
+        <w:rPr>
+          <w:color w:val="222B38"/>
+          <w:sz w:val="20"/>
+        </w:rPr>
+        <w:t>•  Two ways to install</w:t>
+      </w:r>
+    </w:p>
+    <w:p>
+      <w:pPr>
+        <w:spacing w:after="20"/>
+        <w:ind w:left="288"/>
+      </w:pPr>
+      <w:r>
+        <w:rPr>
+          <w:color w:val="222B38"/>
+          <w:sz w:val="20"/>
+        </w:rPr>
+        <w:t>•  Windows</w:t>
+      </w:r>
+    </w:p>
+    <w:p>
+      <w:pPr>
+        <w:spacing w:after="20"/>
+        <w:ind w:left="288"/>
+      </w:pPr>
+      <w:r>
+        <w:rPr>
+          <w:color w:val="222B38"/>
+          <w:sz w:val="20"/>
+        </w:rPr>
+        <w:t>•  macOS</w:t>
+      </w:r>
+    </w:p>
+    <w:p>
+      <w:pPr>
+        <w:spacing w:after="20"/>
+        <w:ind w:left="288"/>
+      </w:pPr>
+      <w:r>
+        <w:rPr>
+          <w:color w:val="222B38"/>
+          <w:sz w:val="20"/>
+        </w:rPr>
+        <w:t>•  Linux</w:t>
+      </w:r>
+    </w:p>
+    <w:p>
+      <w:pPr>
+        <w:spacing w:after="20"/>
+        <w:ind w:left="288"/>
+      </w:pPr>
+      <w:r>
+        <w:rPr>
+          <w:color w:val="222B38"/>
+          <w:sz w:val="20"/>
+        </w:rPr>
+        <w:t>•  Raspberry Pi</w:t>
+      </w:r>
+    </w:p>
+    <w:p>
+      <w:pPr>
+        <w:spacing w:after="20"/>
+        <w:ind w:left="288"/>
+      </w:pPr>
+      <w:r>
+        <w:rPr>
+          <w:color w:val="222B38"/>
+          <w:sz w:val="20"/>
+        </w:rPr>
+        <w:t>•  Why you may see a security warning</w:t>
+      </w:r>
+    </w:p>
+    <w:p>
+      <w:pPr>
+        <w:spacing w:after="20"/>
+        <w:ind w:left="288"/>
+      </w:pPr>
+      <w:r>
+        <w:rPr>
+          <w:color w:val="222B38"/>
+          <w:sz w:val="20"/>
+        </w:rPr>
+        <w:t>•  Running from source</w:t>
+      </w:r>
+    </w:p>
+    <w:p>
+      <w:pPr>
+        <w:spacing w:after="40"/>
+      </w:pPr>
+    </w:p>
+    <w:tbl>
+      <w:tblPr>
+        <w:tblW w:type="auto" w:w="0"/>
+        <w:jc w:val="center"/>
+        <w:tblLayout w:type="fixed"/>
+        <w:tblLook w:firstColumn="1" w:firstRow="1" w:lastColumn="0" w:lastRow="0" w:noHBand="0" w:noVBand="1" w:val="04A0"/>
+      </w:tblPr>
+      <w:tblGrid>
+        <w:gridCol w:w="9360"/>
+      </w:tblGrid>
+      <w:tr>
+        <w:tc>
+          <w:tcPr>
+            <w:tcW w:type="dxa" w:w="9360"/>
+            <w:shd w:val="clear" w:color="auto" w:fill="E7F0FA"/>
+            <w:tcBorders>
+              <w:top w:val="single" w:sz="4" w:space="0" w:color="2E6DA4"/>
+              <w:left w:val="single" w:sz="30" w:space="0" w:color="2E6DA4"/>
+              <w:bottom w:val="single" w:sz="4" w:space="0" w:color="2E6DA4"/>
+              <w:right w:val="single" w:sz="4" w:space="0" w:color="2E6DA4"/>
+            </w:tcBorders>
+            <w:tcMar>
+              <w:top w:w="110" w:type="dxa"/>
+              <w:start w:w="170" w:type="dxa"/>
+              <w:bottom w:w="110" w:type="dxa"/>
+              <w:end w:w="170" w:type="dxa"/>
+            </w:tcMar>
+          </w:tcPr>
+          <w:p>
+            <w:pPr>
+              <w:spacing w:after="0"/>
+            </w:pPr>
+            <w:r>
+              <w:rPr>
+                <w:b/>
+                <w:color w:val="1F4E79"/>
+                <w:sz w:val="21"/>
+              </w:rPr>
+              <w:t xml:space="preserve">Provisional chapter — installer details are being finalized.   </w:t>
+            </w:r>
+            <w:r>
+              <w:rPr>
+                <w:color w:val="222B38"/>
+              </w:rPr>
+              <w:t>The steps below are accurate for the current builds. The macOS and Windows steps are expected to get simpler soon, once the app ships digitally signed (see “Why You May See a Security Warning”). This chapter will be updated when that happens.</w:t>
+            </w:r>
+          </w:p>
+        </w:tc>
+      </w:tr>
+    </w:tbl>
+    <w:p>
+      <w:pPr>
+        <w:spacing w:after="80"/>
+      </w:pPr>
+    </w:p>
+    <w:p>
+      <w:pPr>
+        <w:pStyle w:val="Heading1"/>
+      </w:pPr>
+      <w:r>
+        <w:t>Before You Start</w:t>
+      </w:r>
+    </w:p>
+    <w:p>
+      <w:r>
+        <w:t xml:space="preserve">Make sure your computer meets the </w:t>
+      </w:r>
+      <w:r>
+        <w:rPr>
+          <w:i/>
+        </w:rPr>
+        <w:t>System Requirements</w:t>
+      </w:r>
+      <w:r>
+        <w:t xml:space="preserve"> in the previous chapter — in short, a 64-bit Windows, macOS 14+, modern Linux, or a 64-bit Raspberry Pi. You do </w:t>
+      </w:r>
+      <w:r>
+        <w:rPr>
+          <w:i/>
+        </w:rPr>
+        <w:t>not</w:t>
+      </w:r>
+      <w:r>
+        <w:t xml:space="preserve"> need an administrator account to run APRS Command; only the installer needs one, to copy the program into place.</w:t>
+      </w:r>
+    </w:p>
+    <w:tbl>
+      <w:tblPr>
+        <w:tblW w:type="auto" w:w="0"/>
+        <w:jc w:val="center"/>
+        <w:tblLayout w:type="fixed"/>
+        <w:tblLook w:firstColumn="1" w:firstRow="1" w:lastColumn="0" w:lastRow="0" w:noHBand="0" w:noVBand="1" w:val="04A0"/>
+      </w:tblPr>
+      <w:tblGrid>
+        <w:gridCol w:w="9360"/>
+      </w:tblGrid>
+      <w:tr>
+        <w:tc>
+          <w:tcPr>
+            <w:tcW w:type="dxa" w:w="9360"/>
+            <w:shd w:val="clear" w:color="auto" w:fill="E7F0FA"/>
+            <w:tcBorders>
+              <w:top w:val="single" w:sz="4" w:space="0" w:color="2E6DA4"/>
+              <w:left w:val="single" w:sz="30" w:space="0" w:color="2E6DA4"/>
+              <w:bottom w:val="single" w:sz="4" w:space="0" w:color="2E6DA4"/>
+              <w:right w:val="single" w:sz="4" w:space="0" w:color="2E6DA4"/>
+            </w:tcBorders>
+            <w:tcMar>
+              <w:top w:w="110" w:type="dxa"/>
+              <w:start w:w="170" w:type="dxa"/>
+              <w:bottom w:w="110" w:type="dxa"/>
+              <w:end w:w="170" w:type="dxa"/>
+            </w:tcMar>
+          </w:tcPr>
+          <w:p>
+            <w:pPr>
+              <w:spacing w:after="0"/>
+            </w:pPr>
+            <w:r>
+              <w:rPr>
+                <w:b/>
+                <w:color w:val="1F4E79"/>
+                <w:sz w:val="21"/>
+              </w:rPr>
+              <w:t xml:space="preserve">Two ways to install.   </w:t>
+            </w:r>
+            <w:r>
+              <w:rPr>
+                <w:color w:val="222B38"/>
+              </w:rPr>
+              <w:t>Every platform offers an installer (the simplest choice — double-click and go) and a portable archive (a .zip or .tar.gz you unpack and run in place, with no installation). Pick whichever you prefer; both give you the same program.</w:t>
+            </w:r>
+          </w:p>
+        </w:tc>
+      </w:tr>
+    </w:tbl>
+    <w:p>
+      <w:pPr>
+        <w:spacing w:after="80"/>
+      </w:pPr>
+    </w:p>
+    <w:p>
+      <w:pPr>
+        <w:pStyle w:val="Heading1"/>
+      </w:pPr>
+      <w:r>
+        <w:t>Windows</w:t>
+      </w:r>
+    </w:p>
+    <w:p>
+      <w:pPr>
+        <w:pStyle w:val="Heading2"/>
+      </w:pPr>
+      <w:r>
+        <w:t>Installer (recommended)</w:t>
+      </w:r>
+    </w:p>
+    <w:p>
+      <w:pPr>
+        <w:tabs>
+          <w:tab w:pos="547" w:val="left"/>
+        </w:tabs>
+        <w:spacing w:after="100"/>
+        <w:ind w:left="547" w:hanging="547"/>
+      </w:pPr>
+      <w:r>
+        <w:rPr>
+          <w:b/>
+          <w:color w:val="1F4E79"/>
+        </w:rPr>
+        <w:t>1.</w:t>
+        <w:tab/>
+      </w:r>
+      <w:r>
+        <w:t xml:space="preserve">Download the Windows installer — </w:t>
+      </w:r>
+      <w:r>
+        <w:rPr>
+          <w:rFonts w:ascii="Consolas" w:hAnsi="Consolas"/>
+          <w:sz w:val="19"/>
+        </w:rPr>
+        <w:t>APRSCommand-…-windows-x64-Setup.exe</w:t>
+      </w:r>
+      <w:r>
+        <w:t>.</w:t>
+      </w:r>
+    </w:p>
+    <w:p>
+      <w:pPr>
+        <w:tabs>
+          <w:tab w:pos="547" w:val="left"/>
+        </w:tabs>
+        <w:spacing w:after="100"/>
+        <w:ind w:left="547" w:hanging="547"/>
+      </w:pPr>
+      <w:r>
+        <w:rPr>
+          <w:b/>
+          <w:color w:val="1F4E79"/>
+        </w:rPr>
+        <w:t>2.</w:t>
+        <w:tab/>
+      </w:r>
+      <w:r>
+        <w:t>Double-click it to run.</w:t>
+      </w:r>
+    </w:p>
+    <w:p>
+      <w:pPr>
+        <w:tabs>
+          <w:tab w:pos="547" w:val="left"/>
+        </w:tabs>
+        <w:spacing w:after="100"/>
+        <w:ind w:left="547" w:hanging="547"/>
+      </w:pPr>
+      <w:r>
+        <w:rPr>
+          <w:b/>
+          <w:color w:val="1F4E79"/>
+        </w:rPr>
+        <w:t>3.</w:t>
+        <w:tab/>
+      </w:r>
+      <w:r>
+        <w:t xml:space="preserve">The first time, Windows may show </w:t>
+      </w:r>
+      <w:r>
+        <w:rPr>
+          <w:b/>
+        </w:rPr>
+        <w:t>“Windows protected your PC.”</w:t>
+      </w:r>
+      <w:r>
+        <w:t xml:space="preserve"> Click </w:t>
+      </w:r>
+      <w:r>
+        <w:rPr>
+          <w:b/>
+        </w:rPr>
+        <w:t>More info</w:t>
+      </w:r>
+      <w:r>
+        <w:t xml:space="preserve">, then </w:t>
+      </w:r>
+      <w:r>
+        <w:rPr>
+          <w:b/>
+        </w:rPr>
+        <w:t>Run anyway</w:t>
+      </w:r>
+      <w:r>
+        <w:t xml:space="preserve"> (this is expected — see “Why you may see a security warning” below).</w:t>
+      </w:r>
+    </w:p>
+    <w:p>
+      <w:pPr>
+        <w:tabs>
+          <w:tab w:pos="547" w:val="left"/>
+        </w:tabs>
+        <w:spacing w:after="100"/>
+        <w:ind w:left="547" w:hanging="547"/>
+      </w:pPr>
+      <w:r>
+        <w:rPr>
+          <w:b/>
+          <w:color w:val="1F4E79"/>
+        </w:rPr>
+        <w:t>4.</w:t>
+        <w:tab/>
+      </w:r>
+      <w:r>
+        <w:t xml:space="preserve">APRS Command installs to </w:t>
+      </w:r>
+      <w:r>
+        <w:rPr>
+          <w:rFonts w:ascii="Consolas" w:hAnsi="Consolas"/>
+          <w:sz w:val="19"/>
+        </w:rPr>
+        <w:t>C:\Program Files\APRS Command</w:t>
+      </w:r>
+      <w:r>
+        <w:t xml:space="preserve"> with Start-menu and desktop shortcuts.</w:t>
+      </w:r>
+    </w:p>
+    <w:p>
+      <w:r>
+        <w:t xml:space="preserve">To remove it later: </w:t>
+      </w:r>
+      <w:r>
+        <w:rPr>
+          <w:b/>
+        </w:rPr>
+        <w:t>Settings → Apps → APRS Command → Uninstall</w:t>
+      </w:r>
+      <w:r>
+        <w:t>.</w:t>
+      </w:r>
+    </w:p>
+    <w:p>
+      <w:pPr>
+        <w:pStyle w:val="Heading2"/>
+      </w:pPr>
+      <w:r>
+        <w:t>Portable (no installation)</w:t>
+      </w:r>
+    </w:p>
+    <w:p>
+      <w:pPr>
+        <w:tabs>
+          <w:tab w:pos="547" w:val="left"/>
+        </w:tabs>
+        <w:spacing w:after="100"/>
+        <w:ind w:left="547" w:hanging="547"/>
+      </w:pPr>
+      <w:r>
+        <w:rPr>
+          <w:b/>
+          <w:color w:val="1F4E79"/>
+        </w:rPr>
+        <w:t>1.</w:t>
+        <w:tab/>
+      </w:r>
+      <w:r>
+        <w:t xml:space="preserve">Download </w:t>
+      </w:r>
+      <w:r>
+        <w:rPr>
+          <w:rFonts w:ascii="Consolas" w:hAnsi="Consolas"/>
+          <w:sz w:val="19"/>
+        </w:rPr>
+        <w:t>APRSCommand-…-windows-x64.zip</w:t>
+      </w:r>
+      <w:r>
+        <w:t xml:space="preserve"> and extract it to any folder.</w:t>
+      </w:r>
+    </w:p>
+    <w:p>
+      <w:pPr>
+        <w:tabs>
+          <w:tab w:pos="547" w:val="left"/>
+        </w:tabs>
+        <w:spacing w:after="100"/>
+        <w:ind w:left="547" w:hanging="547"/>
+      </w:pPr>
+      <w:r>
+        <w:rPr>
+          <w:b/>
+          <w:color w:val="1F4E79"/>
+        </w:rPr>
+        <w:t>2.</w:t>
+        <w:tab/>
+      </w:r>
+      <w:r>
+        <w:t xml:space="preserve">Run </w:t>
+      </w:r>
+      <w:r>
+        <w:rPr>
+          <w:rFonts w:ascii="Consolas" w:hAnsi="Consolas"/>
+          <w:sz w:val="19"/>
+        </w:rPr>
+        <w:t>Aprs.Desktop.exe</w:t>
+      </w:r>
+      <w:r>
+        <w:t xml:space="preserve">. If the security prompt appears, click </w:t>
+      </w:r>
+      <w:r>
+        <w:rPr>
+          <w:b/>
+        </w:rPr>
+        <w:t>More info → Run anyway</w:t>
+      </w:r>
+      <w:r>
+        <w:t>.</w:t>
+      </w:r>
+    </w:p>
+    <w:tbl>
+      <w:tblPr>
+        <w:tblW w:type="auto" w:w="0"/>
+        <w:jc w:val="center"/>
+        <w:tblLayout w:type="fixed"/>
+        <w:tblLook w:firstColumn="1" w:firstRow="1" w:lastColumn="0" w:lastRow="0" w:noHBand="0" w:noVBand="1" w:val="04A0"/>
+      </w:tblPr>
+      <w:tblGrid>
+        <w:gridCol w:w="9360"/>
+      </w:tblGrid>
+      <w:tr>
+        <w:tc>
+          <w:tcPr>
+            <w:tcW w:type="dxa" w:w="9360"/>
+            <w:shd w:val="clear" w:color="auto" w:fill="F1F5F9"/>
+            <w:tcBorders>
+              <w:top w:val="dashed" w:sz="8" w:space="0" w:color="94A3B8"/>
+              <w:left w:val="dashed" w:sz="8" w:space="0" w:color="94A3B8"/>
+              <w:bottom w:val="dashed" w:sz="8" w:space="0" w:color="94A3B8"/>
+              <w:right w:val="dashed" w:sz="8" w:space="0" w:color="94A3B8"/>
+            </w:tcBorders>
+            <w:tcMar>
+              <w:top w:w="220" w:type="dxa"/>
+              <w:start w:w="170" w:type="dxa"/>
+              <w:bottom w:w="220" w:type="dxa"/>
+              <w:end w:w="170" w:type="dxa"/>
+            </w:tcMar>
+          </w:tcPr>
+          <w:p>
+            <w:pPr>
+              <w:spacing w:after="40"/>
+              <w:jc w:val="center"/>
+            </w:pPr>
+            <w:r>
+              <w:rPr>
+                <w:b/>
+                <w:color w:val="64748B"/>
+                <w:sz w:val="18"/>
+              </w:rPr>
+              <w:t>SCREENSHOT</w:t>
+            </w:r>
+          </w:p>
+          <w:p>
+            <w:pPr>
+              <w:spacing w:after="0"/>
+              <w:jc w:val="center"/>
+            </w:pPr>
+            <w:r>
+              <w:rPr>
+                <w:i/>
+                <w:color w:val="64748B"/>
+                <w:sz w:val="20"/>
+              </w:rPr>
+              <w:t>The Windows SmartScreen prompt with the More info / Run anyway choice highlighted</w:t>
+            </w:r>
+          </w:p>
+        </w:tc>
+      </w:tr>
+    </w:tbl>
+    <w:p>
+      <w:pPr>
+        <w:spacing w:after="80"/>
+      </w:pPr>
+    </w:p>
+    <w:p>
+      <w:pPr>
+        <w:pStyle w:val="Heading1"/>
+      </w:pPr>
+      <w:r>
+        <w:t>macOS</w:t>
+      </w:r>
+    </w:p>
+    <w:p>
+      <w:pPr>
+        <w:pStyle w:val="Heading2"/>
+      </w:pPr>
+      <w:r>
+        <w:t>Installer (.dmg, recommended)</w:t>
+      </w:r>
+    </w:p>
+    <w:p>
+      <w:pPr>
+        <w:tabs>
+          <w:tab w:pos="547" w:val="left"/>
+        </w:tabs>
+        <w:spacing w:after="100"/>
+        <w:ind w:left="547" w:hanging="547"/>
+      </w:pPr>
+      <w:r>
+        <w:rPr>
+          <w:b/>
+          <w:color w:val="1F4E79"/>
+        </w:rPr>
+        <w:t>1.</w:t>
+        <w:tab/>
+      </w:r>
+      <w:r>
+        <w:t xml:space="preserve">Download the disk image for your Mac — </w:t>
+      </w:r>
+      <w:r>
+        <w:rPr>
+          <w:rFonts w:ascii="Consolas" w:hAnsi="Consolas"/>
+          <w:sz w:val="19"/>
+        </w:rPr>
+        <w:t>…-macos-arm64.dmg</w:t>
+      </w:r>
+      <w:r>
+        <w:t xml:space="preserve"> for Apple Silicon (M1–M4) or </w:t>
+      </w:r>
+      <w:r>
+        <w:rPr>
+          <w:rFonts w:ascii="Consolas" w:hAnsi="Consolas"/>
+          <w:sz w:val="19"/>
+        </w:rPr>
+        <w:t>…-macos-x64.dmg</w:t>
+      </w:r>
+      <w:r>
+        <w:t xml:space="preserve"> for an Intel Mac.</w:t>
+      </w:r>
+    </w:p>
+    <w:p>
+      <w:pPr>
+        <w:tabs>
+          <w:tab w:pos="547" w:val="left"/>
+        </w:tabs>
+        <w:spacing w:after="100"/>
+        <w:ind w:left="547" w:hanging="547"/>
+      </w:pPr>
+      <w:r>
+        <w:rPr>
+          <w:b/>
+          <w:color w:val="1F4E79"/>
+        </w:rPr>
+        <w:t>2.</w:t>
+        <w:tab/>
+      </w:r>
+      <w:r>
+        <w:t xml:space="preserve">Double-click the </w:t>
+      </w:r>
+      <w:r>
+        <w:rPr>
+          <w:rFonts w:ascii="Consolas" w:hAnsi="Consolas"/>
+          <w:sz w:val="19"/>
+        </w:rPr>
+        <w:t>.dmg</w:t>
+      </w:r>
+      <w:r>
+        <w:t xml:space="preserve"> to open it, then drag </w:t>
+      </w:r>
+      <w:r>
+        <w:rPr>
+          <w:b/>
+        </w:rPr>
+        <w:t>APRS Command</w:t>
+      </w:r>
+      <w:r>
+        <w:t xml:space="preserve"> into your </w:t>
+      </w:r>
+      <w:r>
+        <w:rPr>
+          <w:b/>
+        </w:rPr>
+        <w:t>Applications</w:t>
+      </w:r>
+      <w:r>
+        <w:t xml:space="preserve"> folder.</w:t>
+      </w:r>
+    </w:p>
+    <w:p>
+      <w:pPr>
+        <w:tabs>
+          <w:tab w:pos="547" w:val="left"/>
+        </w:tabs>
+        <w:spacing w:after="100"/>
+        <w:ind w:left="547" w:hanging="547"/>
+      </w:pPr>
+      <w:r>
+        <w:rPr>
+          <w:b/>
+          <w:color w:val="1F4E79"/>
+        </w:rPr>
+        <w:t>3.</w:t>
+        <w:tab/>
+      </w:r>
+      <w:r>
+        <w:t xml:space="preserve">The first time only: in Applications, </w:t>
+      </w:r>
+      <w:r>
+        <w:rPr>
+          <w:b/>
+        </w:rPr>
+        <w:t>right-click</w:t>
+      </w:r>
+      <w:r>
+        <w:t xml:space="preserve"> (or Control-click) APRS Command, choose </w:t>
+      </w:r>
+      <w:r>
+        <w:rPr>
+          <w:b/>
+        </w:rPr>
+        <w:t>Open</w:t>
+      </w:r>
+      <w:r>
+        <w:t xml:space="preserve">, then click </w:t>
+      </w:r>
+      <w:r>
+        <w:rPr>
+          <w:b/>
+        </w:rPr>
+        <w:t>Open</w:t>
+      </w:r>
+      <w:r>
+        <w:t xml:space="preserve"> again. macOS remembers the exception, and it launches normally afterward.</w:t>
+      </w:r>
+    </w:p>
+    <w:tbl>
+      <w:tblPr>
+        <w:tblW w:type="auto" w:w="0"/>
+        <w:jc w:val="center"/>
+        <w:tblLayout w:type="fixed"/>
+        <w:tblLook w:firstColumn="1" w:firstRow="1" w:lastColumn="0" w:lastRow="0" w:noHBand="0" w:noVBand="1" w:val="04A0"/>
+      </w:tblPr>
+      <w:tblGrid>
+        <w:gridCol w:w="9360"/>
+      </w:tblGrid>
+      <w:tr>
+        <w:tc>
+          <w:tcPr>
+            <w:tcW w:type="dxa" w:w="9360"/>
+            <w:shd w:val="clear" w:color="auto" w:fill="E7F0FA"/>
+            <w:tcBorders>
+              <w:top w:val="single" w:sz="4" w:space="0" w:color="2E6DA4"/>
+              <w:left w:val="single" w:sz="30" w:space="0" w:color="2E6DA4"/>
+              <w:bottom w:val="single" w:sz="4" w:space="0" w:color="2E6DA4"/>
+              <w:right w:val="single" w:sz="4" w:space="0" w:color="2E6DA4"/>
+            </w:tcBorders>
+            <w:tcMar>
+              <w:top w:w="110" w:type="dxa"/>
+              <w:start w:w="170" w:type="dxa"/>
+              <w:bottom w:w="110" w:type="dxa"/>
+              <w:end w:w="170" w:type="dxa"/>
+            </w:tcMar>
+          </w:tcPr>
+          <w:p>
+            <w:pPr>
+              <w:spacing w:after="0"/>
+            </w:pPr>
+            <w:r>
+              <w:rPr>
+                <w:b/>
+                <w:color w:val="1F4E79"/>
+                <w:sz w:val="21"/>
+              </w:rPr>
+              <w:t xml:space="preserve">Why the right-click-Open dance?   </w:t>
+            </w:r>
+            <w:r>
+              <w:rPr>
+                <w:color w:val="222B38"/>
+              </w:rPr>
+              <w:t>APRS Command is not code-signed (see below), so a normal double-click on first launch is blocked by macOS Gatekeeper. Right-click → Open is the standard one-time approval for unsigned open-source apps.</w:t>
+            </w:r>
+          </w:p>
+        </w:tc>
+      </w:tr>
+    </w:tbl>
+    <w:p>
+      <w:pPr>
+        <w:spacing w:after="80"/>
+      </w:pPr>
+    </w:p>
+    <w:p>
+      <w:pPr>
+        <w:pStyle w:val="Heading2"/>
+      </w:pPr>
+      <w:r>
+        <w:t>Portable (.zip)</w:t>
+      </w:r>
+    </w:p>
+    <w:p>
+      <w:r>
+        <w:t xml:space="preserve">Unzip the archive, then in Terminal run </w:t>
+      </w:r>
+      <w:r>
+        <w:rPr>
+          <w:rFonts w:ascii="Consolas" w:hAnsi="Consolas"/>
+          <w:sz w:val="19"/>
+        </w:rPr>
+        <w:t>xattr -cr .</w:t>
+      </w:r>
+      <w:r>
+        <w:t xml:space="preserve"> inside the extracted folder (to clear the download-quarantine flag) and launch </w:t>
+      </w:r>
+      <w:r>
+        <w:rPr>
+          <w:rFonts w:ascii="Consolas" w:hAnsi="Consolas"/>
+          <w:sz w:val="19"/>
+        </w:rPr>
+        <w:t>./Aprs.Desktop</w:t>
+      </w:r>
+      <w:r>
+        <w:t>.</w:t>
+      </w:r>
+    </w:p>
+    <w:p>
+      <w:pPr>
+        <w:pStyle w:val="Heading1"/>
+      </w:pPr>
+      <w:r>
+        <w:t>Linux</w:t>
+      </w:r>
+    </w:p>
+    <w:p>
+      <w:r>
+        <w:t>Choose the package that matches your distribution:</w:t>
+      </w:r>
+    </w:p>
+    <w:p>
+      <w:pPr>
+        <w:tabs>
+          <w:tab w:pos="547" w:val="left"/>
+        </w:tabs>
+        <w:spacing w:after="80"/>
+        <w:ind w:left="547" w:hanging="288"/>
+      </w:pPr>
+      <w:r>
+        <w:rPr>
+          <w:color w:val="2E6DA4"/>
+        </w:rPr>
+        <w:t>▪</w:t>
+        <w:tab/>
+      </w:r>
+      <w:r>
+        <w:rPr>
+          <w:b/>
+        </w:rPr>
+        <w:t>Debian / Ubuntu / Mint / Raspberry Pi OS</w:t>
+      </w:r>
+      <w:r>
+        <w:t xml:space="preserve"> — the </w:t>
+      </w:r>
+      <w:r>
+        <w:rPr>
+          <w:rFonts w:ascii="Consolas" w:hAnsi="Consolas"/>
+          <w:sz w:val="19"/>
+        </w:rPr>
+        <w:t>.deb</w:t>
+      </w:r>
+      <w:r>
+        <w:t xml:space="preserve"> package: </w:t>
+      </w:r>
+      <w:r>
+        <w:rPr>
+          <w:rFonts w:ascii="Consolas" w:hAnsi="Consolas"/>
+          <w:sz w:val="19"/>
+        </w:rPr>
+        <w:t>sudo dpkg -i aprs-command_…_amd64.deb</w:t>
+      </w:r>
+      <w:r>
+        <w:t xml:space="preserve"> (or </w:t>
+      </w:r>
+      <w:r>
+        <w:rPr>
+          <w:rFonts w:ascii="Consolas" w:hAnsi="Consolas"/>
+          <w:sz w:val="19"/>
+        </w:rPr>
+        <w:t>…_arm64.deb</w:t>
+      </w:r>
+      <w:r>
+        <w:t xml:space="preserve"> on ARM).</w:t>
+      </w:r>
+    </w:p>
+    <w:p>
+      <w:pPr>
+        <w:tabs>
+          <w:tab w:pos="547" w:val="left"/>
+        </w:tabs>
+        <w:spacing w:after="80"/>
+        <w:ind w:left="547" w:hanging="288"/>
+      </w:pPr>
+      <w:r>
+        <w:rPr>
+          <w:color w:val="2E6DA4"/>
+        </w:rPr>
+        <w:t>▪</w:t>
+        <w:tab/>
+      </w:r>
+      <w:r>
+        <w:rPr>
+          <w:b/>
+        </w:rPr>
+        <w:t>Fedora / RHEL / openSUSE</w:t>
+      </w:r>
+      <w:r>
+        <w:t xml:space="preserve"> — the </w:t>
+      </w:r>
+      <w:r>
+        <w:rPr>
+          <w:rFonts w:ascii="Consolas" w:hAnsi="Consolas"/>
+          <w:sz w:val="19"/>
+        </w:rPr>
+        <w:t>.rpm</w:t>
+      </w:r>
+      <w:r>
+        <w:t xml:space="preserve"> package: </w:t>
+      </w:r>
+      <w:r>
+        <w:rPr>
+          <w:rFonts w:ascii="Consolas" w:hAnsi="Consolas"/>
+          <w:sz w:val="19"/>
+        </w:rPr>
+        <w:t>sudo rpm -i aprs-command-…-1.x86_64.rpm</w:t>
+      </w:r>
+      <w:r>
+        <w:t xml:space="preserve"> (or </w:t>
+      </w:r>
+      <w:r>
+        <w:rPr>
+          <w:rFonts w:ascii="Consolas" w:hAnsi="Consolas"/>
+          <w:sz w:val="19"/>
+        </w:rPr>
+        <w:t>…aarch64.rpm</w:t>
+      </w:r>
+      <w:r>
+        <w:t xml:space="preserve"> on ARM).</w:t>
+      </w:r>
+    </w:p>
+    <w:p>
+      <w:pPr>
+        <w:tabs>
+          <w:tab w:pos="547" w:val="left"/>
+        </w:tabs>
+        <w:spacing w:after="80"/>
+        <w:ind w:left="547" w:hanging="288"/>
+      </w:pPr>
+      <w:r>
+        <w:rPr>
+          <w:color w:val="2E6DA4"/>
+        </w:rPr>
+        <w:t>▪</w:t>
+        <w:tab/>
+      </w:r>
+      <w:r>
+        <w:rPr>
+          <w:b/>
+        </w:rPr>
+        <w:t>Any distribution</w:t>
+      </w:r>
+      <w:r>
+        <w:t xml:space="preserve"> — the portable </w:t>
+      </w:r>
+      <w:r>
+        <w:rPr>
+          <w:rFonts w:ascii="Consolas" w:hAnsi="Consolas"/>
+          <w:sz w:val="19"/>
+        </w:rPr>
+        <w:t>.tar.gz</w:t>
+      </w:r>
+      <w:r>
+        <w:t xml:space="preserve">: extract it, </w:t>
+      </w:r>
+      <w:r>
+        <w:rPr>
+          <w:rFonts w:ascii="Consolas" w:hAnsi="Consolas"/>
+          <w:sz w:val="19"/>
+        </w:rPr>
+        <w:t>chmod +x Aprs.Desktop</w:t>
+      </w:r>
+      <w:r>
+        <w:t xml:space="preserve">, then run </w:t>
+      </w:r>
+      <w:r>
+        <w:rPr>
+          <w:rFonts w:ascii="Consolas" w:hAnsi="Consolas"/>
+          <w:sz w:val="19"/>
+        </w:rPr>
+        <w:t>./Aprs.Desktop</w:t>
+      </w:r>
+      <w:r>
+        <w:t>.</w:t>
+      </w:r>
+    </w:p>
+    <w:p>
+      <w:r>
+        <w:t xml:space="preserve">Installed packages place the program at </w:t>
+      </w:r>
+      <w:r>
+        <w:rPr>
+          <w:rFonts w:ascii="Consolas" w:hAnsi="Consolas"/>
+          <w:sz w:val="19"/>
+        </w:rPr>
+        <w:t>/opt/aprs-command/</w:t>
+      </w:r>
+      <w:r>
+        <w:t xml:space="preserve">, add a launcher command </w:t>
+      </w:r>
+      <w:r>
+        <w:rPr>
+          <w:rFonts w:ascii="Consolas" w:hAnsi="Consolas"/>
+          <w:sz w:val="19"/>
+        </w:rPr>
+        <w:t>aprs-command</w:t>
+      </w:r>
+      <w:r>
+        <w:t>, and create an entry in your application menu.</w:t>
+      </w:r>
+    </w:p>
+    <w:tbl>
+      <w:tblPr>
+        <w:tblW w:type="auto" w:w="0"/>
+        <w:jc w:val="center"/>
+        <w:tblLayout w:type="fixed"/>
+        <w:tblLook w:firstColumn="1" w:firstRow="1" w:lastColumn="0" w:lastRow="0" w:noHBand="0" w:noVBand="1" w:val="04A0"/>
+      </w:tblPr>
+      <w:tblGrid>
+        <w:gridCol w:w="9360"/>
+      </w:tblGrid>
+      <w:tr>
+        <w:tc>
+          <w:tcPr>
+            <w:tcW w:type="dxa" w:w="9360"/>
+            <w:shd w:val="clear" w:color="auto" w:fill="E8F5E9"/>
+            <w:tcBorders>
+              <w:top w:val="single" w:sz="4" w:space="0" w:color="43A047"/>
+              <w:left w:val="single" w:sz="30" w:space="0" w:color="43A047"/>
+              <w:bottom w:val="single" w:sz="4" w:space="0" w:color="43A047"/>
+              <w:right w:val="single" w:sz="4" w:space="0" w:color="43A047"/>
+            </w:tcBorders>
+            <w:tcMar>
+              <w:top w:w="110" w:type="dxa"/>
+              <w:start w:w="170" w:type="dxa"/>
+              <w:bottom w:w="110" w:type="dxa"/>
+              <w:end w:w="170" w:type="dxa"/>
+            </w:tcMar>
+          </w:tcPr>
+          <w:p>
+            <w:pPr>
+              <w:spacing w:after="0"/>
+            </w:pPr>
+            <w:r>
+              <w:rPr>
+                <w:b/>
+                <w:color w:val="2E7D32"/>
+                <w:sz w:val="21"/>
+              </w:rPr>
+              <w:t xml:space="preserve">Using a hardware TNC over serial?   </w:t>
+            </w:r>
+            <w:r>
+              <w:rPr>
+                <w:color w:val="222B38"/>
+              </w:rPr>
+              <w:t>On Linux and macOS your user must belong to the “dialout” group to open serial ports: run “sudo usermod -aG dialout $USER”, then log out and back in. On Windows no extra step is needed. This is covered fully in the RF / TNC Connections chapter.</w:t>
+            </w:r>
+          </w:p>
+        </w:tc>
+      </w:tr>
+    </w:tbl>
+    <w:p>
+      <w:pPr>
+        <w:spacing w:after="80"/>
+      </w:pPr>
+    </w:p>
+    <w:p>
+      <w:pPr>
+        <w:pStyle w:val="Heading1"/>
+      </w:pPr>
+      <w:r>
+        <w:t>Raspberry Pi</w:t>
+      </w:r>
+    </w:p>
+    <w:p>
+      <w:pPr>
+        <w:tabs>
+          <w:tab w:pos="547" w:val="left"/>
+        </w:tabs>
+        <w:spacing w:after="100"/>
+        <w:ind w:left="547" w:hanging="547"/>
+      </w:pPr>
+      <w:r>
+        <w:rPr>
+          <w:b/>
+          <w:color w:val="1F4E79"/>
+        </w:rPr>
+        <w:t>1.</w:t>
+        <w:tab/>
+      </w:r>
+      <w:r>
+        <w:t xml:space="preserve">Install the </w:t>
+      </w:r>
+      <w:r>
+        <w:rPr>
+          <w:b/>
+        </w:rPr>
+        <w:t>64-bit</w:t>
+      </w:r>
+      <w:r>
+        <w:t xml:space="preserve"> Raspberry Pi OS (the tested version is “Bookworm”). The 32-bit OS will not run APRS Command.</w:t>
+      </w:r>
+    </w:p>
+    <w:p>
+      <w:pPr>
+        <w:tabs>
+          <w:tab w:pos="547" w:val="left"/>
+        </w:tabs>
+        <w:spacing w:after="100"/>
+        <w:ind w:left="547" w:hanging="547"/>
+      </w:pPr>
+      <w:r>
+        <w:rPr>
+          <w:b/>
+          <w:color w:val="1F4E79"/>
+        </w:rPr>
+        <w:t>2.</w:t>
+        <w:tab/>
+      </w:r>
+      <w:r>
+        <w:t xml:space="preserve">Use the ARM64 package: </w:t>
+      </w:r>
+      <w:r>
+        <w:rPr>
+          <w:rFonts w:ascii="Consolas" w:hAnsi="Consolas"/>
+          <w:sz w:val="19"/>
+        </w:rPr>
+        <w:t>sudo dpkg -i aprs-command_…_arm64.deb</w:t>
+      </w:r>
+      <w:r>
+        <w:t>.</w:t>
+      </w:r>
+    </w:p>
+    <w:p>
+      <w:pPr>
+        <w:tabs>
+          <w:tab w:pos="547" w:val="left"/>
+        </w:tabs>
+        <w:spacing w:after="100"/>
+        <w:ind w:left="547" w:hanging="547"/>
+      </w:pPr>
+      <w:r>
+        <w:rPr>
+          <w:b/>
+          <w:color w:val="1F4E79"/>
+        </w:rPr>
+        <w:t>3.</w:t>
+        <w:tab/>
+      </w:r>
+      <w:r>
+        <w:t xml:space="preserve">Launch it from the application menu, or by running </w:t>
+      </w:r>
+      <w:r>
+        <w:rPr>
+          <w:rFonts w:ascii="Consolas" w:hAnsi="Consolas"/>
+          <w:sz w:val="19"/>
+        </w:rPr>
+        <w:t>aprs-command</w:t>
+      </w:r>
+      <w:r>
+        <w:t>.</w:t>
+      </w:r>
+    </w:p>
+    <w:tbl>
+      <w:tblPr>
+        <w:tblW w:type="auto" w:w="0"/>
+        <w:jc w:val="center"/>
+        <w:tblLayout w:type="fixed"/>
+        <w:tblLook w:firstColumn="1" w:firstRow="1" w:lastColumn="0" w:lastRow="0" w:noHBand="0" w:noVBand="1" w:val="04A0"/>
+      </w:tblPr>
+      <w:tblGrid>
+        <w:gridCol w:w="9360"/>
+      </w:tblGrid>
+      <w:tr>
+        <w:tc>
+          <w:tcPr>
+            <w:tcW w:type="dxa" w:w="9360"/>
+            <w:shd w:val="clear" w:color="auto" w:fill="E7F0FA"/>
+            <w:tcBorders>
+              <w:top w:val="single" w:sz="4" w:space="0" w:color="2E6DA4"/>
+              <w:left w:val="single" w:sz="30" w:space="0" w:color="2E6DA4"/>
+              <w:bottom w:val="single" w:sz="4" w:space="0" w:color="2E6DA4"/>
+              <w:right w:val="single" w:sz="4" w:space="0" w:color="2E6DA4"/>
+            </w:tcBorders>
+            <w:tcMar>
+              <w:top w:w="110" w:type="dxa"/>
+              <w:start w:w="170" w:type="dxa"/>
+              <w:bottom w:w="110" w:type="dxa"/>
+              <w:end w:w="170" w:type="dxa"/>
+            </w:tcMar>
+          </w:tcPr>
+          <w:p>
+            <w:pPr>
+              <w:spacing w:after="0"/>
+            </w:pPr>
+            <w:r>
+              <w:rPr>
+                <w:b/>
+                <w:color w:val="1F4E79"/>
+                <w:sz w:val="21"/>
+              </w:rPr>
+              <w:t xml:space="preserve">NOTE   </w:t>
+            </w:r>
+            <w:r>
+              <w:rPr>
+                <w:color w:val="222B38"/>
+              </w:rPr>
+              <w:t>Keep your logs and the offline map cache on storage with room to spare — on a Pi, avoid filling the boot SD card with downloaded map tiles. A Pi 4 or Pi 5 gives the smoothest map.</w:t>
+            </w:r>
+          </w:p>
+        </w:tc>
+      </w:tr>
+    </w:tbl>
+    <w:p>
+      <w:pPr>
+        <w:spacing w:after="80"/>
+      </w:pPr>
+    </w:p>
+    <w:p>
+      <w:pPr>
+        <w:pStyle w:val="Heading1"/>
+      </w:pPr>
+      <w:r>
+        <w:t>Why You May See a Security Warning</w:t>
+      </w:r>
+    </w:p>
+    <w:p>
+      <w:r>
+        <w:t>On Windows and macOS you may see a warning the first time you launch APRS Command — SmartScreen on Windows, or Gatekeeper on macOS. This is normal and expected.</w:t>
+      </w:r>
+    </w:p>
+    <w:p>
+      <w:r>
+        <w:t xml:space="preserve">Today's builds are </w:t>
+      </w:r>
+      <w:r>
+        <w:rPr>
+          <w:b/>
+        </w:rPr>
+        <w:t>not code-signed</w:t>
+      </w:r>
+      <w:r>
+        <w:t>. Code-signing certificates cost money, and this is a free, open-source amateur-radio project maintained by volunteers. The one-time bypass described above is safe and is standard practice for unsigned open-source software.</w:t>
+      </w:r>
+    </w:p>
+    <w:tbl>
+      <w:tblPr>
+        <w:tblW w:type="auto" w:w="0"/>
+        <w:jc w:val="center"/>
+        <w:tblLayout w:type="fixed"/>
+        <w:tblLook w:firstColumn="1" w:firstRow="1" w:lastColumn="0" w:lastRow="0" w:noHBand="0" w:noVBand="1" w:val="04A0"/>
+      </w:tblPr>
+      <w:tblGrid>
+        <w:gridCol w:w="9360"/>
+      </w:tblGrid>
+      <w:tr>
+        <w:tc>
+          <w:tcPr>
+            <w:tcW w:type="dxa" w:w="9360"/>
+            <w:shd w:val="clear" w:color="auto" w:fill="E7F0FA"/>
+            <w:tcBorders>
+              <w:top w:val="single" w:sz="4" w:space="0" w:color="2E6DA4"/>
+              <w:left w:val="single" w:sz="30" w:space="0" w:color="2E6DA4"/>
+              <w:bottom w:val="single" w:sz="4" w:space="0" w:color="2E6DA4"/>
+              <w:right w:val="single" w:sz="4" w:space="0" w:color="2E6DA4"/>
+            </w:tcBorders>
+            <w:tcMar>
+              <w:top w:w="110" w:type="dxa"/>
+              <w:start w:w="170" w:type="dxa"/>
+              <w:bottom w:w="110" w:type="dxa"/>
+              <w:end w:w="170" w:type="dxa"/>
+            </w:tcMar>
+          </w:tcPr>
+          <w:p>
+            <w:pPr>
+              <w:spacing w:after="0"/>
+            </w:pPr>
+            <w:r>
+              <w:rPr>
+                <w:b/>
+                <w:color w:val="1F4E79"/>
+                <w:sz w:val="21"/>
+              </w:rPr>
+              <w:t xml:space="preserve">This is changing.   </w:t>
+            </w:r>
+            <w:r>
+              <w:rPr>
+                <w:color w:val="222B38"/>
+              </w:rPr>
+              <w:t>The project now has an Apple Developer account, so a signed and notarized macOS build is planned — once it ships, the macOS right-click → Open step goes away and it becomes a normal double-click. Windows code-signing is also being arranged; if it comes through, the SmartScreen warning will no longer appear. This chapter will be updated at that point.</w:t>
+            </w:r>
+          </w:p>
+        </w:tc>
+      </w:tr>
+    </w:tbl>
+    <w:p>
+      <w:pPr>
+        <w:spacing w:after="80"/>
+      </w:pPr>
+    </w:p>
+    <w:p>
+      <w:pPr>
+        <w:pStyle w:val="Heading1"/>
+      </w:pPr>
+      <w:r>
+        <w:t>Running from Source (Optional)</w:t>
+      </w:r>
+    </w:p>
+    <w:p>
+      <w:r>
+        <w:t>If you would rather build it yourself — for example to try the very latest changes — install the .NET 10 SDK and run:</w:t>
+      </w:r>
+    </w:p>
+    <w:p>
+      <w:r>
+        <w:rPr>
+          <w:rFonts w:ascii="Consolas" w:hAnsi="Consolas"/>
+          <w:sz w:val="19"/>
+        </w:rPr>
+        <w:t>git clone https://github.com/KE4CON/APRS-Command.git</w:t>
+      </w:r>
+    </w:p>
+    <w:p>
+      <w:r>
+        <w:rPr>
+          <w:rFonts w:ascii="Consolas" w:hAnsi="Consolas"/>
+          <w:sz w:val="19"/>
+        </w:rPr>
+        <w:t>cd APRS-Command</w:t>
+      </w:r>
+    </w:p>
+    <w:p>
+      <w:r>
+        <w:rPr>
+          <w:rFonts w:ascii="Consolas" w:hAnsi="Consolas"/>
+          <w:sz w:val="19"/>
+        </w:rPr>
+        <w:t>dotnet run --project src/Aprs.Desktop/Aprs.Desktop.csproj</w:t>
+      </w:r>
+    </w:p>
+    <w:p>
+      <w:r>
+        <w:t xml:space="preserve">With APRS Command installed, the next chapter walks through your </w:t>
+      </w:r>
+      <w:r>
+        <w:rPr>
+          <w:i/>
+        </w:rPr>
+        <w:t>first launch and first-run setup</w:t>
+      </w:r>
+      <w:r>
+        <w:t>.</w:t>
+      </w:r>
+    </w:p>
+    <w:p>
+      <w:r>
+        <w:br w:type="page"/>
+      </w:r>
+    </w:p>
+    <w:p>
+      <w:pPr>
+        <w:spacing w:after="40"/>
+      </w:pPr>
+      <w:r>
+        <w:rPr>
+          <w:rFonts w:ascii="Segoe UI Semibold" w:hAnsi="Segoe UI Semibold"/>
+          <w:b/>
+          <w:color w:val="2E6DA4"/>
+          <w:sz w:val="20"/>
+        </w:rPr>
+        <w:t>CHAPTER 3</w:t>
+      </w:r>
+    </w:p>
+    <w:p>
+      <w:pPr>
+        <w:pStyle w:val="Heading1"/>
+        <w:spacing w:after="40"/>
+        <w:outlineLvl w:val="0"/>
+      </w:pPr>
+      <w:r>
+        <w:rPr>
+          <w:rFonts w:ascii="Segoe UI Semibold" w:hAnsi="Segoe UI Semibold"/>
+          <w:color w:val="1F4E79"/>
+          <w:sz w:val="56"/>
+        </w:rPr>
+        <w:t>A Tour of the Map Page</w:t>
+      </w:r>
+    </w:p>
+    <w:p>
+      <w:pPr>
+        <w:pBdr>
+          <w:bottom w:val="single" w:sz="12" w:space="8" w:color="1F4E79"/>
+        </w:pBdr>
+      </w:pPr>
+      <w:r>
+        <w:rPr>
+          <w:i/>
+          <w:color w:val="64748B"/>
+          <w:sz w:val="23"/>
+        </w:rPr>
+        <w:t>Every part of the main screen, named — so the rest of this manual always makes sense.</w:t>
+      </w:r>
+    </w:p>
+    <w:p>
+      <w:pPr>
+        <w:spacing w:after="0"/>
+      </w:pPr>
+    </w:p>
+    <w:p>
+      <w:pPr>
+        <w:spacing w:after="40"/>
+      </w:pPr>
+      <w:r>
+        <w:rPr>
+          <w:rFonts w:ascii="Segoe UI Semibold" w:hAnsi="Segoe UI Semibold"/>
+          <w:b/>
+          <w:color w:val="64748B"/>
+          <w:sz w:val="18"/>
+        </w:rPr>
+        <w:t>IN THIS CHAPTER</w:t>
+      </w:r>
+    </w:p>
+    <w:p>
+      <w:pPr>
+        <w:spacing w:after="20"/>
+        <w:ind w:left="288"/>
+      </w:pPr>
+      <w:r>
+        <w:rPr>
+          <w:color w:val="222B38"/>
+          <w:sz w:val="20"/>
+        </w:rPr>
+        <w:t>•  The map page at a glance</w:t>
+      </w:r>
+    </w:p>
+    <w:p>
+      <w:pPr>
+        <w:spacing w:after="20"/>
+        <w:ind w:left="288"/>
+      </w:pPr>
+      <w:r>
+        <w:rPr>
+          <w:color w:val="222B38"/>
+          <w:sz w:val="20"/>
+        </w:rPr>
+        <w:t>•  Title bar &amp; status badges</w:t>
+      </w:r>
+    </w:p>
+    <w:p>
+      <w:pPr>
+        <w:spacing w:after="20"/>
+        <w:ind w:left="288"/>
+      </w:pPr>
+      <w:r>
+        <w:rPr>
+          <w:color w:val="222B38"/>
+          <w:sz w:val="20"/>
+        </w:rPr>
+        <w:t>•  The menu bar</w:t>
+      </w:r>
+    </w:p>
+    <w:p>
+      <w:pPr>
+        <w:spacing w:after="20"/>
+        <w:ind w:left="288"/>
+      </w:pPr>
+      <w:r>
+        <w:rPr>
+          <w:color w:val="222B38"/>
+          <w:sz w:val="20"/>
+        </w:rPr>
+        <w:t>•  The icon sidebar</w:t>
+      </w:r>
+    </w:p>
+    <w:p>
+      <w:pPr>
+        <w:spacing w:after="20"/>
+        <w:ind w:left="288"/>
+      </w:pPr>
+      <w:r>
+        <w:rPr>
+          <w:color w:val="222B38"/>
+          <w:sz w:val="20"/>
+        </w:rPr>
+        <w:t>•  The map area</w:t>
+      </w:r>
+    </w:p>
+    <w:p>
+      <w:pPr>
+        <w:spacing w:after="20"/>
+        <w:ind w:left="288"/>
+      </w:pPr>
+      <w:r>
+        <w:rPr>
+          <w:color w:val="222B38"/>
+          <w:sz w:val="20"/>
+        </w:rPr>
+        <w:t>•  Panels that appear when needed</w:t>
+      </w:r>
+    </w:p>
+    <w:p>
+      <w:pPr>
+        <w:spacing w:after="20"/>
+        <w:ind w:left="288"/>
+      </w:pPr>
+      <w:r>
+        <w:rPr>
+          <w:color w:val="222B38"/>
+          <w:sz w:val="20"/>
+        </w:rPr>
+        <w:t>•  The status bar</w:t>
+      </w:r>
+    </w:p>
+    <w:p>
+      <w:pPr>
+        <w:spacing w:after="20"/>
+        <w:ind w:left="288"/>
+      </w:pPr>
+      <w:r>
+        <w:rPr>
+          <w:color w:val="222B38"/>
+          <w:sz w:val="20"/>
+        </w:rPr>
+        <w:t>•  How other features open</w:t>
+      </w:r>
+    </w:p>
+    <w:p>
+      <w:pPr>
+        <w:spacing w:after="40"/>
+      </w:pPr>
+    </w:p>
+    <w:p>
+      <w:pPr>
+        <w:pStyle w:val="Heading1"/>
+      </w:pPr>
+      <w:r>
+        <w:t>The Map Page at a Glance</w:t>
+      </w:r>
+    </w:p>
+    <w:p>
+      <w:r>
+        <w:t xml:space="preserve">When APRS Command opens, you land on the </w:t>
+      </w:r>
+      <w:r>
+        <w:rPr>
+          <w:b/>
+        </w:rPr>
+        <w:t>map page</w:t>
+      </w:r>
+      <w:r>
+        <w:t xml:space="preserve"> — the main screen you will spend most of your time on. It has a small number of fixed parts, and this chapter names every one. These names are used consistently throughout the manual, so a few minutes here pays off in every later chapter.</w:t>
+      </w:r>
+    </w:p>
+    <w:tbl>
+      <w:tblPr>
+        <w:tblW w:type="auto" w:w="0"/>
+        <w:jc w:val="center"/>
+        <w:tblLayout w:type="fixed"/>
+        <w:tblLook w:firstColumn="1" w:firstRow="1" w:lastColumn="0" w:lastRow="0" w:noHBand="0" w:noVBand="1" w:val="04A0"/>
+      </w:tblPr>
+      <w:tblGrid>
+        <w:gridCol w:w="9360"/>
+      </w:tblGrid>
+      <w:tr>
+        <w:tc>
+          <w:tcPr>
+            <w:tcW w:type="dxa" w:w="9360"/>
+            <w:shd w:val="clear" w:color="auto" w:fill="F1F5F9"/>
+            <w:tcBorders>
+              <w:top w:val="dashed" w:sz="8" w:space="0" w:color="94A3B8"/>
+              <w:left w:val="dashed" w:sz="8" w:space="0" w:color="94A3B8"/>
+              <w:bottom w:val="dashed" w:sz="8" w:space="0" w:color="94A3B8"/>
+              <w:right w:val="dashed" w:sz="8" w:space="0" w:color="94A3B8"/>
+            </w:tcBorders>
+            <w:tcMar>
+              <w:top w:w="220" w:type="dxa"/>
+              <w:start w:w="170" w:type="dxa"/>
+              <w:bottom w:w="220" w:type="dxa"/>
+              <w:end w:w="170" w:type="dxa"/>
+            </w:tcMar>
+          </w:tcPr>
+          <w:p>
+            <w:pPr>
+              <w:spacing w:after="40"/>
+              <w:jc w:val="center"/>
+            </w:pPr>
+            <w:r>
+              <w:rPr>
+                <w:b/>
+                <w:color w:val="64748B"/>
+                <w:sz w:val="18"/>
+              </w:rPr>
+              <w:t>SCREENSHOT</w:t>
+            </w:r>
+          </w:p>
+          <w:p>
+            <w:pPr>
+              <w:spacing w:after="0"/>
+              <w:jc w:val="center"/>
+            </w:pPr>
+            <w:r>
+              <w:rPr>
+                <w:i/>
+                <w:color w:val="64748B"/>
+                <w:sz w:val="20"/>
+              </w:rPr>
+              <w:t>The whole map page with each region labeled: title bar, menu bar, icon sidebar, map area, status bar</w:t>
+            </w:r>
+          </w:p>
+        </w:tc>
+      </w:tr>
+    </w:tbl>
+    <w:p>
+      <w:pPr>
+        <w:spacing w:after="80"/>
+      </w:pPr>
+    </w:p>
+    <w:p>
+      <w:pPr>
+        <w:pStyle w:val="Heading1"/>
+      </w:pPr>
+      <w:r>
+        <w:t>The Title Bar &amp; Status Badges</w:t>
+      </w:r>
+    </w:p>
+    <w:p>
+      <w:r>
+        <w:t xml:space="preserve">The </w:t>
+      </w:r>
+      <w:r>
+        <w:rPr>
+          <w:b/>
+        </w:rPr>
+        <w:t>title bar</w:t>
+      </w:r>
+      <w:r>
+        <w:t xml:space="preserve"> is the dark strip across the very top. It shows the app name, </w:t>
+      </w:r>
+      <w:r>
+        <w:rPr>
+          <w:b/>
+        </w:rPr>
+        <w:t>APRS Command</w:t>
+      </w:r>
+      <w:r>
+        <w:t xml:space="preserve">, and the subtitle “APRS station map.” At its right end sit two </w:t>
+      </w:r>
+      <w:r>
+        <w:rPr>
+          <w:b/>
+        </w:rPr>
+        <w:t>status badges</w:t>
+      </w:r>
+      <w:r>
+        <w:t xml:space="preserve"> that are always visible:</w:t>
+      </w:r>
+    </w:p>
+    <w:p>
+      <w:pPr>
+        <w:tabs>
+          <w:tab w:pos="547" w:val="left"/>
+        </w:tabs>
+        <w:spacing w:after="80"/>
+        <w:ind w:left="547" w:hanging="288"/>
+      </w:pPr>
+      <w:r>
+        <w:rPr>
+          <w:color w:val="2E6DA4"/>
+        </w:rPr>
+        <w:t>▪</w:t>
+        <w:tab/>
+      </w:r>
+      <w:r>
+        <w:rPr>
+          <w:b/>
+        </w:rPr>
+        <w:t>The APRS-IS badge</w:t>
+      </w:r>
+      <w:r>
+        <w:t xml:space="preserve"> — your connection to the APRS internet network: </w:t>
+      </w:r>
+      <w:r>
+        <w:rPr>
+          <w:rFonts w:ascii="Consolas" w:hAnsi="Consolas"/>
+          <w:sz w:val="19"/>
+        </w:rPr>
+        <w:t>APRS-IS Offline</w:t>
+      </w:r>
+      <w:r>
+        <w:t xml:space="preserve"> or connected.</w:t>
+      </w:r>
+    </w:p>
+    <w:p>
+      <w:pPr>
+        <w:tabs>
+          <w:tab w:pos="547" w:val="left"/>
+        </w:tabs>
+        <w:spacing w:after="80"/>
+        <w:ind w:left="547" w:hanging="288"/>
+      </w:pPr>
+      <w:r>
+        <w:rPr>
+          <w:color w:val="2E6DA4"/>
+        </w:rPr>
+        <w:t>▪</w:t>
+        <w:tab/>
+      </w:r>
+      <w:r>
+        <w:rPr>
+          <w:b/>
+        </w:rPr>
+        <w:t>The TX badge</w:t>
+      </w:r>
+      <w:r>
+        <w:t xml:space="preserve"> — your on-the-air transmit state. </w:t>
+      </w:r>
+      <w:r>
+        <w:rPr>
+          <w:rFonts w:ascii="Consolas" w:hAnsi="Consolas"/>
+          <w:sz w:val="19"/>
+        </w:rPr>
+        <w:t>TX Disabled</w:t>
+      </w:r>
+      <w:r>
+        <w:t xml:space="preserve"> means the program cannot key a radio, no matter what else is happening.</w:t>
+      </w:r>
+    </w:p>
+    <w:tbl>
+      <w:tblPr>
+        <w:tblW w:type="auto" w:w="0"/>
+        <w:jc w:val="center"/>
+        <w:tblLayout w:type="fixed"/>
+        <w:tblLook w:firstColumn="1" w:firstRow="1" w:lastColumn="0" w:lastRow="0" w:noHBand="0" w:noVBand="1" w:val="04A0"/>
+      </w:tblPr>
+      <w:tblGrid>
+        <w:gridCol w:w="9360"/>
+      </w:tblGrid>
+      <w:tr>
+        <w:tc>
+          <w:tcPr>
+            <w:tcW w:type="dxa" w:w="9360"/>
+            <w:shd w:val="clear" w:color="auto" w:fill="FFF4CC"/>
+            <w:tcBorders>
+              <w:top w:val="single" w:sz="4" w:space="0" w:color="E0A800"/>
+              <w:left w:val="single" w:sz="30" w:space="0" w:color="E0A800"/>
+              <w:bottom w:val="single" w:sz="4" w:space="0" w:color="E0A800"/>
+              <w:right w:val="single" w:sz="4" w:space="0" w:color="E0A800"/>
+            </w:tcBorders>
+            <w:tcMar>
+              <w:top w:w="110" w:type="dxa"/>
+              <w:start w:w="170" w:type="dxa"/>
+              <w:bottom w:w="110" w:type="dxa"/>
+              <w:end w:w="170" w:type="dxa"/>
+            </w:tcMar>
+          </w:tcPr>
+          <w:p>
+            <w:pPr>
+              <w:spacing w:after="0"/>
+            </w:pPr>
+            <w:r>
+              <w:rPr>
+                <w:b/>
+                <w:color w:val="8A6D00"/>
+                <w:sz w:val="21"/>
+              </w:rPr>
+              <w:t xml:space="preserve">Glance here whenever you are unsure.   </w:t>
+            </w:r>
+            <w:r>
+              <w:rPr>
+                <w:color w:val="222B38"/>
+              </w:rPr>
+              <w:t>These two badges are your at-a-glance truth about whether APRS Command can transmit. They are always in the same place, and they never lie. A whole later chapter is devoted to transmit safety and the TX badge.</w:t>
+            </w:r>
+          </w:p>
+        </w:tc>
+      </w:tr>
+    </w:tbl>
+    <w:p>
+      <w:pPr>
+        <w:spacing w:after="80"/>
+      </w:pPr>
+    </w:p>
+    <w:p>
+      <w:pPr>
+        <w:pStyle w:val="Heading1"/>
+      </w:pPr>
+      <w:r>
+        <w:t>The Menu Bar</w:t>
+      </w:r>
+    </w:p>
+    <w:p>
+      <w:r>
+        <w:t xml:space="preserve">Just below the title bar is the </w:t>
+      </w:r>
+      <w:r>
+        <w:rPr>
+          <w:b/>
+        </w:rPr>
+        <w:t>menu bar</w:t>
+      </w:r>
+      <w:r>
+        <w:t>. Almost every window and feature in APRS Command opens from one of its seven menus:</w:t>
+      </w:r>
+    </w:p>
+    <w:tbl>
+      <w:tblPr>
+        <w:tblW w:type="auto" w:w="0"/>
+        <w:jc w:val="center"/>
+        <w:tblLayout w:type="fixed"/>
+        <w:tblLook w:firstColumn="1" w:firstRow="1" w:lastColumn="0" w:lastRow="0" w:noHBand="0" w:noVBand="1" w:val="04A0"/>
+        <w:tblBorders>
+          <w:top w:val="single" w:sz="4" w:space="0" w:color="D7DEE7"/>
+          <w:left w:val="single" w:sz="4" w:space="0" w:color="D7DEE7"/>
+          <w:bottom w:val="single" w:sz="4" w:space="0" w:color="D7DEE7"/>
+          <w:right w:val="single" w:sz="4" w:space="0" w:color="D7DEE7"/>
+          <w:insideH w:val="single" w:sz="4" w:space="0" w:color="D7DEE7"/>
+          <w:insideV w:val="single" w:sz="4" w:space="0" w:color="D7DEE7"/>
+        </w:tblBorders>
+      </w:tblPr>
+      <w:tblGrid>
+        <w:gridCol w:w="4680"/>
+        <w:gridCol w:w="4680"/>
+      </w:tblGrid>
+      <w:tr>
+        <w:tc>
+          <w:tcPr>
+            <w:tcW w:type="dxa" w:w="1440"/>
+            <w:shd w:val="clear" w:color="auto" w:fill="1F4E79"/>
+            <w:tcMar>
+              <w:top w:w="70" w:type="dxa"/>
+              <w:start w:w="120" w:type="dxa"/>
+              <w:bottom w:w="70" w:type="dxa"/>
+              <w:end w:w="120" w:type="dxa"/>
+            </w:tcMar>
+          </w:tcPr>
+          <w:p>
+            <w:pPr>
+              <w:spacing w:after="0"/>
+            </w:pPr>
+            <w:r>
+              <w:rPr>
+                <w:rFonts w:ascii="Segoe UI Semibold" w:hAnsi="Segoe UI Semibold"/>
+                <w:b/>
+                <w:color w:val="FFFFFF"/>
+                <w:sz w:val="20"/>
+              </w:rPr>
+              <w:t>Menu</w:t>
+            </w:r>
+          </w:p>
+        </w:tc>
+        <w:tc>
+          <w:tcPr>
+            <w:tcW w:type="dxa" w:w="7920"/>
+            <w:shd w:val="clear" w:color="auto" w:fill="1F4E79"/>
+            <w:tcMar>
+              <w:top w:w="70" w:type="dxa"/>
+              <w:start w:w="120" w:type="dxa"/>
+              <w:bottom w:w="70" w:type="dxa"/>
+              <w:end w:w="120" w:type="dxa"/>
+            </w:tcMar>
+          </w:tcPr>
+          <w:p>
+            <w:pPr>
+              <w:spacing w:after="0"/>
+            </w:pPr>
+            <w:r>
+              <w:rPr>
+                <w:rFonts w:ascii="Segoe UI Semibold" w:hAnsi="Segoe UI Semibold"/>
+                <w:b/>
+                <w:color w:val="FFFFFF"/>
+                <w:sz w:val="20"/>
+              </w:rPr>
+              <w:t>What you'll find there</w:t>
+            </w:r>
+          </w:p>
+        </w:tc>
+      </w:tr>
+      <w:tr>
+        <w:tc>
+          <w:tcPr>
+            <w:tcW w:type="dxa" w:w="1440"/>
+            <w:tcMar>
+              <w:top w:w="60" w:type="dxa"/>
+              <w:start w:w="120" w:type="dxa"/>
+              <w:bottom w:w="60" w:type="dxa"/>
+              <w:end w:w="120" w:type="dxa"/>
+            </w:tcMar>
+          </w:tcPr>
+          <w:p>
+            <w:pPr>
+              <w:spacing w:after="0"/>
+            </w:pPr>
+            <w:r>
+              <w:rPr>
+                <w:sz w:val="19"/>
+              </w:rPr>
+              <w:t>Settings</w:t>
+            </w:r>
+          </w:p>
+        </w:tc>
+        <w:tc>
+          <w:tcPr>
+            <w:tcW w:type="dxa" w:w="7920"/>
+            <w:tcMar>
+              <w:top w:w="60" w:type="dxa"/>
+              <w:start w:w="120" w:type="dxa"/>
+              <w:bottom w:w="60" w:type="dxa"/>
+              <w:end w:w="120" w:type="dxa"/>
+            </w:tcMar>
+          </w:tcPr>
+          <w:p>
+            <w:pPr>
+              <w:spacing w:after="0"/>
+            </w:pPr>
+            <w:r>
+              <w:rPr>
+                <w:sz w:val="19"/>
+              </w:rPr>
+              <w:t>Opens the settings window (station identity, connections, first-run setup, safety, and more).</w:t>
+            </w:r>
+          </w:p>
+        </w:tc>
+      </w:tr>
+      <w:tr>
+        <w:tc>
+          <w:tcPr>
+            <w:tcW w:type="dxa" w:w="1440"/>
+            <w:shd w:val="clear" w:color="auto" w:fill="F3F6FA"/>
+            <w:tcMar>
+              <w:top w:w="60" w:type="dxa"/>
+              <w:start w:w="120" w:type="dxa"/>
+              <w:bottom w:w="60" w:type="dxa"/>
+              <w:end w:w="120" w:type="dxa"/>
+            </w:tcMar>
+          </w:tcPr>
+          <w:p>
+            <w:pPr>
+              <w:spacing w:after="0"/>
+            </w:pPr>
+            <w:r>
+              <w:rPr>
+                <w:sz w:val="19"/>
+              </w:rPr>
+              <w:t>View</w:t>
+            </w:r>
+          </w:p>
+        </w:tc>
+        <w:tc>
+          <w:tcPr>
+            <w:tcW w:type="dxa" w:w="7920"/>
+            <w:shd w:val="clear" w:color="auto" w:fill="F3F6FA"/>
+            <w:tcMar>
+              <w:top w:w="60" w:type="dxa"/>
+              <w:start w:w="120" w:type="dxa"/>
+              <w:bottom w:w="60" w:type="dxa"/>
+              <w:end w:w="120" w:type="dxa"/>
+            </w:tcMar>
+          </w:tcPr>
+          <w:p>
+            <w:pPr>
+              <w:spacing w:after="0"/>
+            </w:pPr>
+            <w:r>
+              <w:rPr>
+                <w:sz w:val="19"/>
+              </w:rPr>
+              <w:t>Station List, Raw Packets, Telemetry, Events, the Packet Statistics dashboard, and the dark-mode toggle.</w:t>
+            </w:r>
+          </w:p>
+        </w:tc>
+      </w:tr>
+      <w:tr>
+        <w:tc>
+          <w:tcPr>
+            <w:tcW w:type="dxa" w:w="1440"/>
+            <w:tcMar>
+              <w:top w:w="60" w:type="dxa"/>
+              <w:start w:w="120" w:type="dxa"/>
+              <w:bottom w:w="60" w:type="dxa"/>
+              <w:end w:w="120" w:type="dxa"/>
+            </w:tcMar>
+          </w:tcPr>
+          <w:p>
+            <w:pPr>
+              <w:spacing w:after="0"/>
+            </w:pPr>
+            <w:r>
+              <w:rPr>
+                <w:sz w:val="19"/>
+              </w:rPr>
+              <w:t>Map</w:t>
+            </w:r>
+          </w:p>
+        </w:tc>
+        <w:tc>
+          <w:tcPr>
+            <w:tcW w:type="dxa" w:w="7920"/>
+            <w:tcMar>
+              <w:top w:w="60" w:type="dxa"/>
+              <w:start w:w="120" w:type="dxa"/>
+              <w:bottom w:w="60" w:type="dxa"/>
+              <w:end w:w="120" w:type="dxa"/>
+            </w:tcMar>
+          </w:tcPr>
+          <w:p>
+            <w:pPr>
+              <w:spacing w:after="0"/>
+            </w:pPr>
+            <w:r>
+              <w:rPr>
+                <w:sz w:val="19"/>
+              </w:rPr>
+              <w:t>The drawing tools, weather (stations, alerts, radar), offline map download, coverage prediction, elevation profile, and the frequency reference.</w:t>
+            </w:r>
+          </w:p>
+        </w:tc>
+      </w:tr>
+      <w:tr>
+        <w:tc>
+          <w:tcPr>
+            <w:tcW w:type="dxa" w:w="1440"/>
+            <w:shd w:val="clear" w:color="auto" w:fill="F3F6FA"/>
+            <w:tcMar>
+              <w:top w:w="60" w:type="dxa"/>
+              <w:start w:w="120" w:type="dxa"/>
+              <w:bottom w:w="60" w:type="dxa"/>
+              <w:end w:w="120" w:type="dxa"/>
+            </w:tcMar>
+          </w:tcPr>
+          <w:p>
+            <w:pPr>
+              <w:spacing w:after="0"/>
+            </w:pPr>
+            <w:r>
+              <w:rPr>
+                <w:sz w:val="19"/>
+              </w:rPr>
+              <w:t>Messages</w:t>
+            </w:r>
+          </w:p>
+        </w:tc>
+        <w:tc>
+          <w:tcPr>
+            <w:tcW w:type="dxa" w:w="7920"/>
+            <w:shd w:val="clear" w:color="auto" w:fill="F3F6FA"/>
+            <w:tcMar>
+              <w:top w:w="60" w:type="dxa"/>
+              <w:start w:w="120" w:type="dxa"/>
+              <w:bottom w:w="60" w:type="dxa"/>
+              <w:end w:w="120" w:type="dxa"/>
+            </w:tcMar>
+          </w:tcPr>
+          <w:p>
+            <w:pPr>
+              <w:spacing w:after="0"/>
+            </w:pPr>
+            <w:r>
+              <w:rPr>
+                <w:sz w:val="19"/>
+              </w:rPr>
+              <w:t>The Message Center, message broadcast, scheduled messages, and the receipts dashboard.</w:t>
+            </w:r>
+          </w:p>
+        </w:tc>
+      </w:tr>
+      <w:tr>
+        <w:tc>
+          <w:tcPr>
+            <w:tcW w:type="dxa" w:w="1440"/>
+            <w:tcMar>
+              <w:top w:w="60" w:type="dxa"/>
+              <w:start w:w="120" w:type="dxa"/>
+              <w:bottom w:w="60" w:type="dxa"/>
+              <w:end w:w="120" w:type="dxa"/>
+            </w:tcMar>
+          </w:tcPr>
+          <w:p>
+            <w:pPr>
+              <w:spacing w:after="0"/>
+            </w:pPr>
+            <w:r>
+              <w:rPr>
+                <w:sz w:val="19"/>
+              </w:rPr>
+              <w:t>Operate</w:t>
+            </w:r>
+          </w:p>
+        </w:tc>
+        <w:tc>
+          <w:tcPr>
+            <w:tcW w:type="dxa" w:w="7920"/>
+            <w:tcMar>
+              <w:top w:w="60" w:type="dxa"/>
+              <w:start w:w="120" w:type="dxa"/>
+              <w:bottom w:w="60" w:type="dxa"/>
+              <w:end w:w="120" w:type="dxa"/>
+            </w:tcMar>
+          </w:tcPr>
+          <w:p>
+            <w:pPr>
+              <w:spacing w:after="0"/>
+            </w:pPr>
+            <w:r>
+              <w:rPr>
+                <w:sz w:val="19"/>
+              </w:rPr>
+              <w:t>Net Control, the net script editor, objects, session templates, scheduled and shadow beacons, and alerts.</w:t>
+            </w:r>
+          </w:p>
+        </w:tc>
+      </w:tr>
+      <w:tr>
+        <w:tc>
+          <w:tcPr>
+            <w:tcW w:type="dxa" w:w="1440"/>
+            <w:shd w:val="clear" w:color="auto" w:fill="F3F6FA"/>
+            <w:tcMar>
+              <w:top w:w="60" w:type="dxa"/>
+              <w:start w:w="120" w:type="dxa"/>
+              <w:bottom w:w="60" w:type="dxa"/>
+              <w:end w:w="120" w:type="dxa"/>
+            </w:tcMar>
+          </w:tcPr>
+          <w:p>
+            <w:pPr>
+              <w:spacing w:after="0"/>
+            </w:pPr>
+            <w:r>
+              <w:rPr>
+                <w:sz w:val="19"/>
+              </w:rPr>
+              <w:t>Tools</w:t>
+            </w:r>
+          </w:p>
+        </w:tc>
+        <w:tc>
+          <w:tcPr>
+            <w:tcW w:type="dxa" w:w="7920"/>
+            <w:shd w:val="clear" w:color="auto" w:fill="F3F6FA"/>
+            <w:tcMar>
+              <w:top w:w="60" w:type="dxa"/>
+              <w:start w:w="120" w:type="dxa"/>
+              <w:bottom w:w="60" w:type="dxa"/>
+              <w:end w:w="120" w:type="dxa"/>
+            </w:tcMar>
+          </w:tcPr>
+          <w:p>
+            <w:pPr>
+              <w:spacing w:after="0"/>
+            </w:pPr>
+            <w:r>
+              <w:rPr>
+                <w:sz w:val="19"/>
+              </w:rPr>
+              <w:t>Event Bus, Replay, RF Diagnostics, the After-Action report, the Mobile Companion web view, and Exercise Mode.</w:t>
+            </w:r>
+          </w:p>
+        </w:tc>
+      </w:tr>
+      <w:tr>
+        <w:tc>
+          <w:tcPr>
+            <w:tcW w:type="dxa" w:w="1440"/>
+            <w:tcMar>
+              <w:top w:w="60" w:type="dxa"/>
+              <w:start w:w="120" w:type="dxa"/>
+              <w:bottom w:w="60" w:type="dxa"/>
+              <w:end w:w="120" w:type="dxa"/>
+            </w:tcMar>
+          </w:tcPr>
+          <w:p>
+            <w:pPr>
+              <w:spacing w:after="0"/>
+            </w:pPr>
+            <w:r>
+              <w:rPr>
+                <w:sz w:val="19"/>
+              </w:rPr>
+              <w:t>Help</w:t>
+            </w:r>
+          </w:p>
+        </w:tc>
+        <w:tc>
+          <w:tcPr>
+            <w:tcW w:type="dxa" w:w="7920"/>
+            <w:tcMar>
+              <w:top w:w="60" w:type="dxa"/>
+              <w:start w:w="120" w:type="dxa"/>
+              <w:bottom w:w="60" w:type="dxa"/>
+              <w:end w:w="120" w:type="dxa"/>
+            </w:tcMar>
+          </w:tcPr>
+          <w:p>
+            <w:pPr>
+              <w:spacing w:after="0"/>
+            </w:pPr>
+            <w:r>
+              <w:rPr>
+                <w:sz w:val="19"/>
+              </w:rPr>
+              <w:t>The in-app Help viewer, the keyboard-shortcut list, and the About window.</w:t>
+            </w:r>
+          </w:p>
+        </w:tc>
+      </w:tr>
+    </w:tbl>
+    <w:p>
+      <w:pPr>
+        <w:spacing w:after="40"/>
+      </w:pPr>
+    </w:p>
+    <w:p>
+      <w:r>
+        <w:t>Each of those features has its own chapter later in this manual; here we are only naming where they live.</w:t>
+      </w:r>
+    </w:p>
+    <w:p>
+      <w:pPr>
+        <w:pStyle w:val="Heading1"/>
+      </w:pPr>
+      <w:r>
+        <w:t>The Icon Sidebar</w:t>
+      </w:r>
+    </w:p>
+    <w:p>
+      <w:r>
+        <w:t xml:space="preserve">Down the left edge is the </w:t>
+      </w:r>
+      <w:r>
+        <w:rPr>
+          <w:b/>
+        </w:rPr>
+        <w:t>icon sidebar</w:t>
+      </w:r>
+      <w:r>
+        <w:t xml:space="preserve"> — a vertical strip of icon buttons for the tools you reach for most. The buttons have no printed labels; </w:t>
+      </w:r>
+      <w:r>
+        <w:rPr>
+          <w:b/>
+        </w:rPr>
+        <w:t>hover over any icon to see its name in a tooltip</w:t>
+      </w:r>
+      <w:r>
+        <w:t>. A divider separates the map tools (top) from the operator tools (below).</w:t>
+      </w:r>
+    </w:p>
+    <w:tbl>
+      <w:tblPr>
+        <w:tblW w:type="auto" w:w="0"/>
+        <w:jc w:val="center"/>
+        <w:tblLayout w:type="fixed"/>
+        <w:tblLook w:firstColumn="1" w:firstRow="1" w:lastColumn="0" w:lastRow="0" w:noHBand="0" w:noVBand="1" w:val="04A0"/>
+        <w:tblBorders>
+          <w:top w:val="single" w:sz="4" w:space="0" w:color="D7DEE7"/>
+          <w:left w:val="single" w:sz="4" w:space="0" w:color="D7DEE7"/>
+          <w:bottom w:val="single" w:sz="4" w:space="0" w:color="D7DEE7"/>
+          <w:right w:val="single" w:sz="4" w:space="0" w:color="D7DEE7"/>
+          <w:insideH w:val="single" w:sz="4" w:space="0" w:color="D7DEE7"/>
+          <w:insideV w:val="single" w:sz="4" w:space="0" w:color="D7DEE7"/>
+        </w:tblBorders>
+      </w:tblPr>
+      <w:tblGrid>
+        <w:gridCol w:w="3120"/>
+        <w:gridCol w:w="3120"/>
+        <w:gridCol w:w="3120"/>
+      </w:tblGrid>
+      <w:tr>
+        <w:tc>
+          <w:tcPr>
+            <w:tcW w:type="dxa" w:w="720"/>
+            <w:shd w:val="clear" w:color="auto" w:fill="1F4E79"/>
+            <w:tcMar>
+              <w:top w:w="70" w:type="dxa"/>
+              <w:start w:w="120" w:type="dxa"/>
+              <w:bottom w:w="70" w:type="dxa"/>
+              <w:end w:w="120" w:type="dxa"/>
+            </w:tcMar>
+          </w:tcPr>
+          <w:p>
+            <w:pPr>
+              <w:spacing w:after="0"/>
+            </w:pPr>
+            <w:r>
+              <w:rPr>
+                <w:rFonts w:ascii="Segoe UI Semibold" w:hAnsi="Segoe UI Semibold"/>
+                <w:b/>
+                <w:color w:val="FFFFFF"/>
+                <w:sz w:val="20"/>
+              </w:rPr>
+              <w:t>Icon</w:t>
+            </w:r>
+          </w:p>
+        </w:tc>
+        <w:tc>
+          <w:tcPr>
+            <w:tcW w:type="dxa" w:w="2736"/>
+            <w:shd w:val="clear" w:color="auto" w:fill="1F4E79"/>
+            <w:tcMar>
+              <w:top w:w="70" w:type="dxa"/>
+              <w:start w:w="120" w:type="dxa"/>
+              <w:bottom w:w="70" w:type="dxa"/>
+              <w:end w:w="120" w:type="dxa"/>
+            </w:tcMar>
+          </w:tcPr>
+          <w:p>
+            <w:pPr>
+              <w:spacing w:after="0"/>
+            </w:pPr>
+            <w:r>
+              <w:rPr>
+                <w:rFonts w:ascii="Segoe UI Semibold" w:hAnsi="Segoe UI Semibold"/>
+                <w:b/>
+                <w:color w:val="FFFFFF"/>
+                <w:sz w:val="20"/>
+              </w:rPr>
+              <w:t>Name</w:t>
+            </w:r>
+          </w:p>
+        </w:tc>
+        <w:tc>
+          <w:tcPr>
+            <w:tcW w:type="dxa" w:w="5904"/>
+            <w:shd w:val="clear" w:color="auto" w:fill="1F4E79"/>
+            <w:tcMar>
+              <w:top w:w="70" w:type="dxa"/>
+              <w:start w:w="120" w:type="dxa"/>
+              <w:bottom w:w="70" w:type="dxa"/>
+              <w:end w:w="120" w:type="dxa"/>
+            </w:tcMar>
+          </w:tcPr>
+          <w:p>
+            <w:pPr>
+              <w:spacing w:after="0"/>
+            </w:pPr>
+            <w:r>
+              <w:rPr>
+                <w:rFonts w:ascii="Segoe UI Semibold" w:hAnsi="Segoe UI Semibold"/>
+                <w:b/>
+                <w:color w:val="FFFFFF"/>
+                <w:sz w:val="20"/>
+              </w:rPr>
+              <w:t>What it does</w:t>
+            </w:r>
+          </w:p>
+        </w:tc>
+      </w:tr>
+      <w:tr>
+        <w:tc>
+          <w:tcPr>
+            <w:tcW w:type="dxa" w:w="720"/>
+            <w:tcMar>
+              <w:top w:w="60" w:type="dxa"/>
+              <w:start w:w="120" w:type="dxa"/>
+              <w:bottom w:w="60" w:type="dxa"/>
+              <w:end w:w="120" w:type="dxa"/>
+            </w:tcMar>
+          </w:tcPr>
+          <w:p>
+            <w:pPr>
+              <w:spacing w:after="0"/>
+            </w:pPr>
+            <w:r>
+              <w:rPr>
+                <w:sz w:val="19"/>
+              </w:rPr>
+              <w:t>⌂</w:t>
+            </w:r>
+          </w:p>
+        </w:tc>
+        <w:tc>
+          <w:tcPr>
+            <w:tcW w:type="dxa" w:w="2736"/>
+            <w:tcMar>
+              <w:top w:w="60" w:type="dxa"/>
+              <w:start w:w="120" w:type="dxa"/>
+              <w:bottom w:w="60" w:type="dxa"/>
+              <w:end w:w="120" w:type="dxa"/>
+            </w:tcMar>
+          </w:tcPr>
+          <w:p>
+            <w:pPr>
+              <w:spacing w:after="0"/>
+            </w:pPr>
+            <w:r>
+              <w:rPr>
+                <w:sz w:val="19"/>
+              </w:rPr>
+              <w:t>Home</w:t>
+            </w:r>
+          </w:p>
+        </w:tc>
+        <w:tc>
+          <w:tcPr>
+            <w:tcW w:type="dxa" w:w="5904"/>
+            <w:tcMar>
+              <w:top w:w="60" w:type="dxa"/>
+              <w:start w:w="120" w:type="dxa"/>
+              <w:bottom w:w="60" w:type="dxa"/>
+              <w:end w:w="120" w:type="dxa"/>
+            </w:tcMar>
+          </w:tcPr>
+          <w:p>
+            <w:pPr>
+              <w:spacing w:after="0"/>
+            </w:pPr>
+            <w:r>
+              <w:rPr>
+                <w:sz w:val="19"/>
+              </w:rPr>
+              <w:t>Reset the map to the default overview.</w:t>
+            </w:r>
+          </w:p>
+        </w:tc>
+      </w:tr>
+      <w:tr>
+        <w:tc>
+          <w:tcPr>
+            <w:tcW w:type="dxa" w:w="720"/>
+            <w:shd w:val="clear" w:color="auto" w:fill="F3F6FA"/>
+            <w:tcMar>
+              <w:top w:w="60" w:type="dxa"/>
+              <w:start w:w="120" w:type="dxa"/>
+              <w:bottom w:w="60" w:type="dxa"/>
+              <w:end w:w="120" w:type="dxa"/>
+            </w:tcMar>
+          </w:tcPr>
+          <w:p>
+            <w:pPr>
+              <w:spacing w:after="0"/>
+            </w:pPr>
+            <w:r>
+              <w:rPr>
+                <w:sz w:val="19"/>
+              </w:rPr>
+              <w:t>◎</w:t>
+            </w:r>
+          </w:p>
+        </w:tc>
+        <w:tc>
+          <w:tcPr>
+            <w:tcW w:type="dxa" w:w="2736"/>
+            <w:shd w:val="clear" w:color="auto" w:fill="F3F6FA"/>
+            <w:tcMar>
+              <w:top w:w="60" w:type="dxa"/>
+              <w:start w:w="120" w:type="dxa"/>
+              <w:bottom w:w="60" w:type="dxa"/>
+              <w:end w:w="120" w:type="dxa"/>
+            </w:tcMar>
+          </w:tcPr>
+          <w:p>
+            <w:pPr>
+              <w:spacing w:after="0"/>
+            </w:pPr>
+            <w:r>
+              <w:rPr>
+                <w:sz w:val="19"/>
+              </w:rPr>
+              <w:t>Centre on my station</w:t>
+            </w:r>
+          </w:p>
+        </w:tc>
+        <w:tc>
+          <w:tcPr>
+            <w:tcW w:type="dxa" w:w="5904"/>
+            <w:shd w:val="clear" w:color="auto" w:fill="F3F6FA"/>
+            <w:tcMar>
+              <w:top w:w="60" w:type="dxa"/>
+              <w:start w:w="120" w:type="dxa"/>
+              <w:bottom w:w="60" w:type="dxa"/>
+              <w:end w:w="120" w:type="dxa"/>
+            </w:tcMar>
+          </w:tcPr>
+          <w:p>
+            <w:pPr>
+              <w:spacing w:after="0"/>
+            </w:pPr>
+            <w:r>
+              <w:rPr>
+                <w:sz w:val="19"/>
+              </w:rPr>
+              <w:t>Recenter the map on your own station.</w:t>
+            </w:r>
+          </w:p>
+        </w:tc>
+      </w:tr>
+      <w:tr>
+        <w:tc>
+          <w:tcPr>
+            <w:tcW w:type="dxa" w:w="720"/>
+            <w:tcMar>
+              <w:top w:w="60" w:type="dxa"/>
+              <w:start w:w="120" w:type="dxa"/>
+              <w:bottom w:w="60" w:type="dxa"/>
+              <w:end w:w="120" w:type="dxa"/>
+            </w:tcMar>
+          </w:tcPr>
+          <w:p>
+            <w:pPr>
+              <w:spacing w:after="0"/>
+            </w:pPr>
+            <w:r>
+              <w:rPr>
+                <w:sz w:val="19"/>
+              </w:rPr>
+              <w:t>🔍</w:t>
+            </w:r>
+          </w:p>
+        </w:tc>
+        <w:tc>
+          <w:tcPr>
+            <w:tcW w:type="dxa" w:w="2736"/>
+            <w:tcMar>
+              <w:top w:w="60" w:type="dxa"/>
+              <w:start w:w="120" w:type="dxa"/>
+              <w:bottom w:w="60" w:type="dxa"/>
+              <w:end w:w="120" w:type="dxa"/>
+            </w:tcMar>
+          </w:tcPr>
+          <w:p>
+            <w:pPr>
+              <w:spacing w:after="0"/>
+            </w:pPr>
+            <w:r>
+              <w:rPr>
+                <w:sz w:val="19"/>
+              </w:rPr>
+              <w:t>Find station</w:t>
+            </w:r>
+          </w:p>
+        </w:tc>
+        <w:tc>
+          <w:tcPr>
+            <w:tcW w:type="dxa" w:w="5904"/>
+            <w:tcMar>
+              <w:top w:w="60" w:type="dxa"/>
+              <w:start w:w="120" w:type="dxa"/>
+              <w:bottom w:w="60" w:type="dxa"/>
+              <w:end w:w="120" w:type="dxa"/>
+            </w:tcMar>
+          </w:tcPr>
+          <w:p>
+            <w:pPr>
+              <w:spacing w:after="0"/>
+            </w:pPr>
+            <w:r>
+              <w:rPr>
+                <w:sz w:val="19"/>
+              </w:rPr>
+              <w:t>Search for a callsign and jump to it.</w:t>
+            </w:r>
+          </w:p>
+        </w:tc>
+      </w:tr>
+      <w:tr>
+        <w:tc>
+          <w:tcPr>
+            <w:tcW w:type="dxa" w:w="720"/>
+            <w:shd w:val="clear" w:color="auto" w:fill="F3F6FA"/>
+            <w:tcMar>
+              <w:top w:w="60" w:type="dxa"/>
+              <w:start w:w="120" w:type="dxa"/>
+              <w:bottom w:w="60" w:type="dxa"/>
+              <w:end w:w="120" w:type="dxa"/>
+            </w:tcMar>
+          </w:tcPr>
+          <w:p>
+            <w:pPr>
+              <w:spacing w:after="0"/>
+            </w:pPr>
+            <w:r>
+              <w:rPr>
+                <w:sz w:val="19"/>
+              </w:rPr>
+              <w:t>📏</w:t>
+            </w:r>
+          </w:p>
+        </w:tc>
+        <w:tc>
+          <w:tcPr>
+            <w:tcW w:type="dxa" w:w="2736"/>
+            <w:shd w:val="clear" w:color="auto" w:fill="F3F6FA"/>
+            <w:tcMar>
+              <w:top w:w="60" w:type="dxa"/>
+              <w:start w:w="120" w:type="dxa"/>
+              <w:bottom w:w="60" w:type="dxa"/>
+              <w:end w:w="120" w:type="dxa"/>
+            </w:tcMar>
+          </w:tcPr>
+          <w:p>
+            <w:pPr>
+              <w:spacing w:after="0"/>
+            </w:pPr>
+            <w:r>
+              <w:rPr>
+                <w:sz w:val="19"/>
+              </w:rPr>
+              <w:t>Measure distance</w:t>
+            </w:r>
+          </w:p>
+        </w:tc>
+        <w:tc>
+          <w:tcPr>
+            <w:tcW w:type="dxa" w:w="5904"/>
+            <w:shd w:val="clear" w:color="auto" w:fill="F3F6FA"/>
+            <w:tcMar>
+              <w:top w:w="60" w:type="dxa"/>
+              <w:start w:w="120" w:type="dxa"/>
+              <w:bottom w:w="60" w:type="dxa"/>
+              <w:end w:w="120" w:type="dxa"/>
+            </w:tcMar>
+          </w:tcPr>
+          <w:p>
+            <w:pPr>
+              <w:spacing w:after="0"/>
+            </w:pPr>
+            <w:r>
+              <w:rPr>
+                <w:sz w:val="19"/>
+              </w:rPr>
+              <w:t>Measure the distance between points on the map.</w:t>
+            </w:r>
+          </w:p>
+        </w:tc>
+      </w:tr>
+      <w:tr>
+        <w:tc>
+          <w:tcPr>
+            <w:tcW w:type="dxa" w:w="720"/>
+            <w:tcMar>
+              <w:top w:w="60" w:type="dxa"/>
+              <w:start w:w="120" w:type="dxa"/>
+              <w:bottom w:w="60" w:type="dxa"/>
+              <w:end w:w="120" w:type="dxa"/>
+            </w:tcMar>
+          </w:tcPr>
+          <w:p>
+            <w:pPr>
+              <w:spacing w:after="0"/>
+            </w:pPr>
+            <w:r>
+              <w:rPr>
+                <w:sz w:val="19"/>
+              </w:rPr>
+              <w:t>🗺</w:t>
+            </w:r>
+          </w:p>
+        </w:tc>
+        <w:tc>
+          <w:tcPr>
+            <w:tcW w:type="dxa" w:w="2736"/>
+            <w:tcMar>
+              <w:top w:w="60" w:type="dxa"/>
+              <w:start w:w="120" w:type="dxa"/>
+              <w:bottom w:w="60" w:type="dxa"/>
+              <w:end w:w="120" w:type="dxa"/>
+            </w:tcMar>
+          </w:tcPr>
+          <w:p>
+            <w:pPr>
+              <w:spacing w:after="0"/>
+            </w:pPr>
+            <w:r>
+              <w:rPr>
+                <w:sz w:val="19"/>
+              </w:rPr>
+              <w:t>Map layer</w:t>
+            </w:r>
+          </w:p>
+        </w:tc>
+        <w:tc>
+          <w:tcPr>
+            <w:tcW w:type="dxa" w:w="5904"/>
+            <w:tcMar>
+              <w:top w:w="60" w:type="dxa"/>
+              <w:start w:w="120" w:type="dxa"/>
+              <w:bottom w:w="60" w:type="dxa"/>
+              <w:end w:w="120" w:type="dxa"/>
+            </w:tcMar>
+          </w:tcPr>
+          <w:p>
+            <w:pPr>
+              <w:spacing w:after="0"/>
+            </w:pPr>
+            <w:r>
+              <w:rPr>
+                <w:sz w:val="19"/>
+              </w:rPr>
+              <w:t>Switch the base-map layer (see below).</w:t>
+            </w:r>
+          </w:p>
+        </w:tc>
+      </w:tr>
+      <w:tr>
+        <w:tc>
+          <w:tcPr>
+            <w:tcW w:type="dxa" w:w="720"/>
+            <w:shd w:val="clear" w:color="auto" w:fill="F3F6FA"/>
+            <w:tcMar>
+              <w:top w:w="60" w:type="dxa"/>
+              <w:start w:w="120" w:type="dxa"/>
+              <w:bottom w:w="60" w:type="dxa"/>
+              <w:end w:w="120" w:type="dxa"/>
+            </w:tcMar>
+          </w:tcPr>
+          <w:p>
+            <w:pPr>
+              <w:spacing w:after="0"/>
+            </w:pPr>
+            <w:r>
+              <w:rPr>
+                <w:sz w:val="19"/>
+              </w:rPr>
+              <w:t>📡</w:t>
+            </w:r>
+          </w:p>
+        </w:tc>
+        <w:tc>
+          <w:tcPr>
+            <w:tcW w:type="dxa" w:w="2736"/>
+            <w:shd w:val="clear" w:color="auto" w:fill="F3F6FA"/>
+            <w:tcMar>
+              <w:top w:w="60" w:type="dxa"/>
+              <w:start w:w="120" w:type="dxa"/>
+              <w:bottom w:w="60" w:type="dxa"/>
+              <w:end w:w="120" w:type="dxa"/>
+            </w:tcMar>
+          </w:tcPr>
+          <w:p>
+            <w:pPr>
+              <w:spacing w:after="0"/>
+            </w:pPr>
+            <w:r>
+              <w:rPr>
+                <w:sz w:val="19"/>
+              </w:rPr>
+              <w:t>Beacon Now</w:t>
+            </w:r>
+          </w:p>
+        </w:tc>
+        <w:tc>
+          <w:tcPr>
+            <w:tcW w:type="dxa" w:w="5904"/>
+            <w:shd w:val="clear" w:color="auto" w:fill="F3F6FA"/>
+            <w:tcMar>
+              <w:top w:w="60" w:type="dxa"/>
+              <w:start w:w="120" w:type="dxa"/>
+              <w:bottom w:w="60" w:type="dxa"/>
+              <w:end w:w="120" w:type="dxa"/>
+            </w:tcMar>
+          </w:tcPr>
+          <w:p>
+            <w:pPr>
+              <w:spacing w:after="0"/>
+            </w:pPr>
+            <w:r>
+              <w:rPr>
+                <w:sz w:val="19"/>
+              </w:rPr>
+              <w:t xml:space="preserve">Transmit your position immediately. </w:t>
+            </w:r>
+            <w:r>
+              <w:rPr>
+                <w:i/>
+                <w:sz w:val="19"/>
+              </w:rPr>
+              <w:t>(Only works once you have set up and enabled transmit.)</w:t>
+            </w:r>
+          </w:p>
+        </w:tc>
+      </w:tr>
+      <w:tr>
+        <w:tc>
+          <w:tcPr>
+            <w:tcW w:type="dxa" w:w="720"/>
+            <w:tcMar>
+              <w:top w:w="60" w:type="dxa"/>
+              <w:start w:w="120" w:type="dxa"/>
+              <w:bottom w:w="60" w:type="dxa"/>
+              <w:end w:w="120" w:type="dxa"/>
+            </w:tcMar>
+          </w:tcPr>
+          <w:p>
+            <w:pPr>
+              <w:spacing w:after="0"/>
+            </w:pPr>
+            <w:r>
+              <w:rPr>
+                <w:sz w:val="19"/>
+              </w:rPr>
+              <w:t>🔔</w:t>
+            </w:r>
+          </w:p>
+        </w:tc>
+        <w:tc>
+          <w:tcPr>
+            <w:tcW w:type="dxa" w:w="2736"/>
+            <w:tcMar>
+              <w:top w:w="60" w:type="dxa"/>
+              <w:start w:w="120" w:type="dxa"/>
+              <w:bottom w:w="60" w:type="dxa"/>
+              <w:end w:w="120" w:type="dxa"/>
+            </w:tcMar>
+          </w:tcPr>
+          <w:p>
+            <w:pPr>
+              <w:spacing w:after="0"/>
+            </w:pPr>
+            <w:r>
+              <w:rPr>
+                <w:sz w:val="19"/>
+              </w:rPr>
+              <w:t>Alerts</w:t>
+            </w:r>
+          </w:p>
+        </w:tc>
+        <w:tc>
+          <w:tcPr>
+            <w:tcW w:type="dxa" w:w="5904"/>
+            <w:tcMar>
+              <w:top w:w="60" w:type="dxa"/>
+              <w:start w:w="120" w:type="dxa"/>
+              <w:bottom w:w="60" w:type="dxa"/>
+              <w:end w:w="120" w:type="dxa"/>
+            </w:tcMar>
+          </w:tcPr>
+          <w:p>
+            <w:pPr>
+              <w:spacing w:after="0"/>
+            </w:pPr>
+            <w:r>
+              <w:rPr>
+                <w:sz w:val="19"/>
+              </w:rPr>
+              <w:t>Show your alert status.</w:t>
+            </w:r>
+          </w:p>
+        </w:tc>
+      </w:tr>
+      <w:tr>
+        <w:tc>
+          <w:tcPr>
+            <w:tcW w:type="dxa" w:w="720"/>
+            <w:shd w:val="clear" w:color="auto" w:fill="F3F6FA"/>
+            <w:tcMar>
+              <w:top w:w="60" w:type="dxa"/>
+              <w:start w:w="120" w:type="dxa"/>
+              <w:bottom w:w="60" w:type="dxa"/>
+              <w:end w:w="120" w:type="dxa"/>
+            </w:tcMar>
+          </w:tcPr>
+          <w:p>
+            <w:pPr>
+              <w:spacing w:after="0"/>
+            </w:pPr>
+            <w:r>
+              <w:rPr>
+                <w:sz w:val="19"/>
+              </w:rPr>
+              <w:t>⊙</w:t>
+            </w:r>
+          </w:p>
+        </w:tc>
+        <w:tc>
+          <w:tcPr>
+            <w:tcW w:type="dxa" w:w="2736"/>
+            <w:shd w:val="clear" w:color="auto" w:fill="F3F6FA"/>
+            <w:tcMar>
+              <w:top w:w="60" w:type="dxa"/>
+              <w:start w:w="120" w:type="dxa"/>
+              <w:bottom w:w="60" w:type="dxa"/>
+              <w:end w:w="120" w:type="dxa"/>
+            </w:tcMar>
+          </w:tcPr>
+          <w:p>
+            <w:pPr>
+              <w:spacing w:after="0"/>
+            </w:pPr>
+            <w:r>
+              <w:rPr>
+                <w:sz w:val="19"/>
+              </w:rPr>
+              <w:t>Range rings</w:t>
+            </w:r>
+          </w:p>
+        </w:tc>
+        <w:tc>
+          <w:tcPr>
+            <w:tcW w:type="dxa" w:w="5904"/>
+            <w:shd w:val="clear" w:color="auto" w:fill="F3F6FA"/>
+            <w:tcMar>
+              <w:top w:w="60" w:type="dxa"/>
+              <w:start w:w="120" w:type="dxa"/>
+              <w:bottom w:w="60" w:type="dxa"/>
+              <w:end w:w="120" w:type="dxa"/>
+            </w:tcMar>
+          </w:tcPr>
+          <w:p>
+            <w:pPr>
+              <w:spacing w:after="0"/>
+            </w:pPr>
+            <w:r>
+              <w:rPr>
+                <w:sz w:val="19"/>
+              </w:rPr>
+              <w:t>Toggle distance range rings around a point.</w:t>
+            </w:r>
+          </w:p>
+        </w:tc>
+      </w:tr>
+      <w:tr>
+        <w:tc>
+          <w:tcPr>
+            <w:tcW w:type="dxa" w:w="720"/>
+            <w:tcMar>
+              <w:top w:w="60" w:type="dxa"/>
+              <w:start w:w="120" w:type="dxa"/>
+              <w:bottom w:w="60" w:type="dxa"/>
+              <w:end w:w="120" w:type="dxa"/>
+            </w:tcMar>
+          </w:tcPr>
+          <w:p>
+            <w:pPr>
+              <w:spacing w:after="0"/>
+            </w:pPr>
+            <w:r>
+              <w:rPr>
+                <w:sz w:val="19"/>
+              </w:rPr>
+              <w:t>🛤</w:t>
+            </w:r>
+          </w:p>
+        </w:tc>
+        <w:tc>
+          <w:tcPr>
+            <w:tcW w:type="dxa" w:w="2736"/>
+            <w:tcMar>
+              <w:top w:w="60" w:type="dxa"/>
+              <w:start w:w="120" w:type="dxa"/>
+              <w:bottom w:w="60" w:type="dxa"/>
+              <w:end w:w="120" w:type="dxa"/>
+            </w:tcMar>
+          </w:tcPr>
+          <w:p>
+            <w:pPr>
+              <w:spacing w:after="0"/>
+            </w:pPr>
+            <w:r>
+              <w:rPr>
+                <w:sz w:val="19"/>
+              </w:rPr>
+              <w:t>Trails</w:t>
+            </w:r>
+          </w:p>
+        </w:tc>
+        <w:tc>
+          <w:tcPr>
+            <w:tcW w:type="dxa" w:w="5904"/>
+            <w:tcMar>
+              <w:top w:w="60" w:type="dxa"/>
+              <w:start w:w="120" w:type="dxa"/>
+              <w:bottom w:w="60" w:type="dxa"/>
+              <w:end w:w="120" w:type="dxa"/>
+            </w:tcMar>
+          </w:tcPr>
+          <w:p>
+            <w:pPr>
+              <w:spacing w:after="0"/>
+            </w:pPr>
+            <w:r>
+              <w:rPr>
+                <w:sz w:val="19"/>
+              </w:rPr>
+              <w:t>Toggle station movement trails.</w:t>
+            </w:r>
+          </w:p>
+        </w:tc>
+      </w:tr>
+      <w:tr>
+        <w:tc>
+          <w:tcPr>
+            <w:tcW w:type="dxa" w:w="720"/>
+            <w:shd w:val="clear" w:color="auto" w:fill="F3F6FA"/>
+            <w:tcMar>
+              <w:top w:w="60" w:type="dxa"/>
+              <w:start w:w="120" w:type="dxa"/>
+              <w:bottom w:w="60" w:type="dxa"/>
+              <w:end w:w="120" w:type="dxa"/>
+            </w:tcMar>
+          </w:tcPr>
+          <w:p>
+            <w:pPr>
+              <w:spacing w:after="0"/>
+            </w:pPr>
+            <w:r>
+              <w:rPr>
+                <w:sz w:val="19"/>
+              </w:rPr>
+              <w:t>🌧</w:t>
+            </w:r>
+          </w:p>
+        </w:tc>
+        <w:tc>
+          <w:tcPr>
+            <w:tcW w:type="dxa" w:w="2736"/>
+            <w:shd w:val="clear" w:color="auto" w:fill="F3F6FA"/>
+            <w:tcMar>
+              <w:top w:w="60" w:type="dxa"/>
+              <w:start w:w="120" w:type="dxa"/>
+              <w:bottom w:w="60" w:type="dxa"/>
+              <w:end w:w="120" w:type="dxa"/>
+            </w:tcMar>
+          </w:tcPr>
+          <w:p>
+            <w:pPr>
+              <w:spacing w:after="0"/>
+            </w:pPr>
+            <w:r>
+              <w:rPr>
+                <w:sz w:val="19"/>
+              </w:rPr>
+              <w:t>Radar</w:t>
+            </w:r>
+          </w:p>
+        </w:tc>
+        <w:tc>
+          <w:tcPr>
+            <w:tcW w:type="dxa" w:w="5904"/>
+            <w:shd w:val="clear" w:color="auto" w:fill="F3F6FA"/>
+            <w:tcMar>
+              <w:top w:w="60" w:type="dxa"/>
+              <w:start w:w="120" w:type="dxa"/>
+              <w:bottom w:w="60" w:type="dxa"/>
+              <w:end w:w="120" w:type="dxa"/>
+            </w:tcMar>
+          </w:tcPr>
+          <w:p>
+            <w:pPr>
+              <w:spacing w:after="0"/>
+            </w:pPr>
+            <w:r>
+              <w:rPr>
+                <w:sz w:val="19"/>
+              </w:rPr>
+              <w:t>Toggle the weather-radar overlay.</w:t>
+            </w:r>
+          </w:p>
+        </w:tc>
+      </w:tr>
+    </w:tbl>
+    <w:p>
+      <w:pPr>
+        <w:spacing w:after="40"/>
+      </w:pPr>
+    </w:p>
+    <w:tbl>
+      <w:tblPr>
+        <w:tblW w:type="auto" w:w="0"/>
+        <w:jc w:val="center"/>
+        <w:tblLayout w:type="fixed"/>
+        <w:tblLook w:firstColumn="1" w:firstRow="1" w:lastColumn="0" w:lastRow="0" w:noHBand="0" w:noVBand="1" w:val="04A0"/>
+      </w:tblPr>
+      <w:tblGrid>
+        <w:gridCol w:w="9360"/>
+      </w:tblGrid>
+      <w:tr>
+        <w:tc>
+          <w:tcPr>
+            <w:tcW w:type="dxa" w:w="9360"/>
+            <w:shd w:val="clear" w:color="auto" w:fill="FDECEA"/>
+            <w:tcBorders>
+              <w:top w:val="single" w:sz="4" w:space="0" w:color="D9534F"/>
+              <w:left w:val="single" w:sz="30" w:space="0" w:color="D9534F"/>
+              <w:bottom w:val="single" w:sz="4" w:space="0" w:color="D9534F"/>
+              <w:right w:val="single" w:sz="4" w:space="0" w:color="D9534F"/>
+            </w:tcBorders>
+            <w:tcMar>
+              <w:top w:w="110" w:type="dxa"/>
+              <w:start w:w="170" w:type="dxa"/>
+              <w:bottom w:w="110" w:type="dxa"/>
+              <w:end w:w="170" w:type="dxa"/>
+            </w:tcMar>
+          </w:tcPr>
+          <w:p>
+            <w:pPr>
+              <w:spacing w:after="0"/>
+            </w:pPr>
+            <w:r>
+              <w:rPr>
+                <w:b/>
+                <w:color w:val="A32A2A"/>
+                <w:sz w:val="21"/>
+              </w:rPr>
+              <w:t xml:space="preserve">WARNING — Beacon Now transmits.   </w:t>
+            </w:r>
+            <w:r>
+              <w:rPr>
+                <w:color w:val="222B38"/>
+              </w:rPr>
+              <w:t>The Beacon Now button (📡) puts your position on the air the moment transmit is enabled. While you are learning receive-first, it does nothing — but treat it with respect once your station is configured.</w:t>
+            </w:r>
+          </w:p>
+        </w:tc>
+      </w:tr>
+    </w:tbl>
+    <w:p>
+      <w:pPr>
+        <w:spacing w:after="80"/>
+      </w:pPr>
+    </w:p>
+    <w:p>
+      <w:pPr>
+        <w:pStyle w:val="Heading1"/>
+      </w:pPr>
+      <w:r>
+        <w:t>The Map Area</w:t>
+      </w:r>
+    </w:p>
+    <w:p>
+      <w:r>
+        <w:t xml:space="preserve">The rest of the window is the </w:t>
+      </w:r>
+      <w:r>
+        <w:rPr>
+          <w:b/>
+        </w:rPr>
+        <w:t>map area</w:t>
+      </w:r>
+      <w:r>
+        <w:t xml:space="preserve"> — the live map where stations, objects, and weather appear. In its top-left corner is the </w:t>
+      </w:r>
+      <w:r>
+        <w:rPr>
+          <w:b/>
+        </w:rPr>
+        <w:t>base-map selector</w:t>
+      </w:r>
+      <w:r>
+        <w:t>, a dropdown that switches the background map:</w:t>
+      </w:r>
+    </w:p>
+    <w:p>
+      <w:pPr>
+        <w:tabs>
+          <w:tab w:pos="547" w:val="left"/>
+        </w:tabs>
+        <w:spacing w:after="80"/>
+        <w:ind w:left="547" w:hanging="288"/>
+      </w:pPr>
+      <w:r>
+        <w:rPr>
+          <w:color w:val="2E6DA4"/>
+        </w:rPr>
+        <w:t>▪</w:t>
+        <w:tab/>
+      </w:r>
+      <w:r>
+        <w:rPr>
+          <w:b/>
+        </w:rPr>
+        <w:t>OpenStreetMap</w:t>
+      </w:r>
+      <w:r>
+        <w:t xml:space="preserve"> — a clear street map (the default).</w:t>
+      </w:r>
+    </w:p>
+    <w:p>
+      <w:pPr>
+        <w:tabs>
+          <w:tab w:pos="547" w:val="left"/>
+        </w:tabs>
+        <w:spacing w:after="80"/>
+        <w:ind w:left="547" w:hanging="288"/>
+      </w:pPr>
+      <w:r>
+        <w:rPr>
+          <w:color w:val="2E6DA4"/>
+        </w:rPr>
+        <w:t>▪</w:t>
+        <w:tab/>
+      </w:r>
+      <w:r>
+        <w:rPr>
+          <w:b/>
+        </w:rPr>
+        <w:t>USGS Topo</w:t>
+      </w:r>
+      <w:r>
+        <w:t xml:space="preserve"> — topographic contour maps.</w:t>
+      </w:r>
+    </w:p>
+    <w:p>
+      <w:pPr>
+        <w:tabs>
+          <w:tab w:pos="547" w:val="left"/>
+        </w:tabs>
+        <w:spacing w:after="80"/>
+        <w:ind w:left="547" w:hanging="288"/>
+      </w:pPr>
+      <w:r>
+        <w:rPr>
+          <w:color w:val="2E6DA4"/>
+        </w:rPr>
+        <w:t>▪</w:t>
+        <w:tab/>
+      </w:r>
+      <w:r>
+        <w:rPr>
+          <w:b/>
+        </w:rPr>
+        <w:t>USGS Imagery</w:t>
+      </w:r>
+      <w:r>
+        <w:t xml:space="preserve"> — aerial/satellite photography.</w:t>
+      </w:r>
+    </w:p>
+    <w:p>
+      <w:pPr>
+        <w:tabs>
+          <w:tab w:pos="547" w:val="left"/>
+        </w:tabs>
+        <w:spacing w:after="80"/>
+        <w:ind w:left="547" w:hanging="288"/>
+      </w:pPr>
+      <w:r>
+        <w:rPr>
+          <w:color w:val="2E6DA4"/>
+        </w:rPr>
+        <w:t>▪</w:t>
+        <w:tab/>
+      </w:r>
+      <w:r>
+        <w:rPr>
+          <w:b/>
+        </w:rPr>
+        <w:t>USGS Imagery + Topo</w:t>
+      </w:r>
+      <w:r>
+        <w:t xml:space="preserve"> — aerial imagery with topographic labels on top.</w:t>
+      </w:r>
+    </w:p>
+    <w:p>
+      <w:r>
+        <w:t>Click a station, object, or weather marker to select it. Moving around the map (panning and zooming) and each base map are covered in the next chapter.</w:t>
+      </w:r>
+    </w:p>
+    <w:p>
+      <w:pPr>
+        <w:pStyle w:val="Heading1"/>
+      </w:pPr>
+      <w:r>
+        <w:t>Panels That Appear Only When Needed</w:t>
+      </w:r>
+    </w:p>
+    <w:p>
+      <w:r>
+        <w:t>Several small panels appear on the map only when they are relevant, then disappear again:</w:t>
+      </w:r>
+    </w:p>
+    <w:p>
+      <w:pPr>
+        <w:tabs>
+          <w:tab w:pos="547" w:val="left"/>
+        </w:tabs>
+        <w:spacing w:after="80"/>
+        <w:ind w:left="547" w:hanging="288"/>
+      </w:pPr>
+      <w:r>
+        <w:rPr>
+          <w:color w:val="2E6DA4"/>
+        </w:rPr>
+        <w:t>▪</w:t>
+        <w:tab/>
+      </w:r>
+      <w:r>
+        <w:rPr>
+          <w:b/>
+        </w:rPr>
+        <w:t>Station-details panel</w:t>
+      </w:r>
+      <w:r>
+        <w:t xml:space="preserve"> (bottom-left) — the selected station's details, shown when you click a marker.</w:t>
+      </w:r>
+    </w:p>
+    <w:p>
+      <w:pPr>
+        <w:tabs>
+          <w:tab w:pos="547" w:val="left"/>
+        </w:tabs>
+        <w:spacing w:after="80"/>
+        <w:ind w:left="547" w:hanging="288"/>
+      </w:pPr>
+      <w:r>
+        <w:rPr>
+          <w:color w:val="2E6DA4"/>
+        </w:rPr>
+        <w:t>▪</w:t>
+        <w:tab/>
+      </w:r>
+      <w:r>
+        <w:rPr>
+          <w:b/>
+        </w:rPr>
+        <w:t>Radar scrubber</w:t>
+      </w:r>
+      <w:r>
+        <w:t xml:space="preserve"> (bottom-center) — step or play through radar frames, shown when weather radar is on.</w:t>
+      </w:r>
+    </w:p>
+    <w:p>
+      <w:pPr>
+        <w:tabs>
+          <w:tab w:pos="547" w:val="left"/>
+        </w:tabs>
+        <w:spacing w:after="80"/>
+        <w:ind w:left="547" w:hanging="288"/>
+      </w:pPr>
+      <w:r>
+        <w:rPr>
+          <w:color w:val="2E6DA4"/>
+        </w:rPr>
+        <w:t>▪</w:t>
+        <w:tab/>
+      </w:r>
+      <w:r>
+        <w:rPr>
+          <w:b/>
+        </w:rPr>
+        <w:t>Object-placement overlay</w:t>
+      </w:r>
+      <w:r>
+        <w:t xml:space="preserve"> (top-right) — guides you while placing or moving an object.</w:t>
+      </w:r>
+    </w:p>
+    <w:p>
+      <w:pPr>
+        <w:tabs>
+          <w:tab w:pos="547" w:val="left"/>
+        </w:tabs>
+        <w:spacing w:after="80"/>
+        <w:ind w:left="547" w:hanging="288"/>
+      </w:pPr>
+      <w:r>
+        <w:rPr>
+          <w:color w:val="2E6DA4"/>
+        </w:rPr>
+        <w:t>▪</w:t>
+        <w:tab/>
+      </w:r>
+      <w:r>
+        <w:rPr>
+          <w:b/>
+        </w:rPr>
+        <w:t>Draw-mode banner</w:t>
+      </w:r>
+      <w:r>
+        <w:t xml:space="preserve"> (across the top) — shown while a drawing tool is active (see the Drawing chapter).</w:t>
+      </w:r>
+    </w:p>
+    <w:p>
+      <w:pPr>
+        <w:tabs>
+          <w:tab w:pos="547" w:val="left"/>
+        </w:tabs>
+        <w:spacing w:after="80"/>
+        <w:ind w:left="547" w:hanging="288"/>
+      </w:pPr>
+      <w:r>
+        <w:rPr>
+          <w:color w:val="2E6DA4"/>
+        </w:rPr>
+        <w:t>▪</w:t>
+        <w:tab/>
+      </w:r>
+      <w:r>
+        <w:rPr>
+          <w:b/>
+        </w:rPr>
+        <w:t>Weather-alert banner</w:t>
+      </w:r>
+      <w:r>
+        <w:t xml:space="preserve"> (full width) — announces an active National Weather Service alert; click it for details.</w:t>
+      </w:r>
+    </w:p>
+    <w:p>
+      <w:pPr>
+        <w:pStyle w:val="Heading1"/>
+      </w:pPr>
+      <w:r>
+        <w:t>The Status Bar</w:t>
+      </w:r>
+    </w:p>
+    <w:p>
+      <w:r>
+        <w:t xml:space="preserve">Along the very bottom is the </w:t>
+      </w:r>
+      <w:r>
+        <w:rPr>
+          <w:b/>
+        </w:rPr>
+        <w:t>status bar</w:t>
+      </w:r>
+      <w:r>
+        <w:t xml:space="preserve">, a quiet summary of the program's state — for example </w:t>
+      </w:r>
+      <w:r>
+        <w:rPr>
+          <w:rFonts w:ascii="Consolas" w:hAnsi="Consolas"/>
+          <w:sz w:val="19"/>
+        </w:rPr>
+        <w:t>Ready</w:t>
+      </w:r>
+      <w:r>
+        <w:t xml:space="preserve">, </w:t>
+      </w:r>
+      <w:r>
+        <w:rPr>
+          <w:rFonts w:ascii="Consolas" w:hAnsi="Consolas"/>
+          <w:sz w:val="19"/>
+        </w:rPr>
+        <w:t>APRS-IS Disconnected</w:t>
+      </w:r>
+      <w:r>
+        <w:t xml:space="preserve"> or </w:t>
+      </w:r>
+      <w:r>
+        <w:rPr>
+          <w:rFonts w:ascii="Consolas" w:hAnsi="Consolas"/>
+          <w:sz w:val="19"/>
+        </w:rPr>
+        <w:t>Connected</w:t>
+      </w:r>
+      <w:r>
+        <w:t xml:space="preserve">, and </w:t>
+      </w:r>
+      <w:r>
+        <w:rPr>
+          <w:rFonts w:ascii="Consolas" w:hAnsi="Consolas"/>
+          <w:sz w:val="19"/>
+        </w:rPr>
+        <w:t>RF TX Disabled</w:t>
+      </w:r>
+      <w:r>
+        <w:t xml:space="preserve"> or </w:t>
+      </w:r>
+      <w:r>
+        <w:rPr>
+          <w:rFonts w:ascii="Consolas" w:hAnsi="Consolas"/>
+          <w:sz w:val="19"/>
+        </w:rPr>
+        <w:t>Enabled</w:t>
+      </w:r>
+      <w:r>
+        <w:t>. It is a second, always-present confirmation of your transmit and connection state.</w:t>
+      </w:r>
+    </w:p>
+    <w:p>
+      <w:pPr>
+        <w:pStyle w:val="Heading1"/>
+      </w:pPr>
+      <w:r>
+        <w:t>How the Other Features Open</w:t>
+      </w:r>
+    </w:p>
+    <w:p>
+      <w:r>
+        <w:t xml:space="preserve">Everything beyond the map itself — the Station List, Messages, Objects, Weather, Replay, and the rest — opens from the menus as its own </w:t>
+      </w:r>
+      <w:r>
+        <w:rPr>
+          <w:b/>
+        </w:rPr>
+        <w:t>floating panel</w:t>
+      </w:r>
+      <w:r>
+        <w:t xml:space="preserve">: a movable window you can drag by its </w:t>
+      </w:r>
+      <w:r>
+        <w:rPr>
+          <w:b/>
+        </w:rPr>
+        <w:t>panel title bar</w:t>
+      </w:r>
+      <w:r>
+        <w:t xml:space="preserve"> (the coloured strip with the grip dots) and close with its </w:t>
+      </w:r>
+      <w:r>
+        <w:rPr>
+          <w:b/>
+        </w:rPr>
+        <w:t>✕</w:t>
+      </w:r>
+      <w:r>
+        <w:t>. You can have several open at once and arrange them around the map however suits you.</w:t>
+      </w:r>
+    </w:p>
+    <w:tbl>
+      <w:tblPr>
+        <w:tblW w:type="auto" w:w="0"/>
+        <w:jc w:val="center"/>
+        <w:tblLayout w:type="fixed"/>
+        <w:tblLook w:firstColumn="1" w:firstRow="1" w:lastColumn="0" w:lastRow="0" w:noHBand="0" w:noVBand="1" w:val="04A0"/>
+      </w:tblPr>
+      <w:tblGrid>
+        <w:gridCol w:w="9360"/>
+      </w:tblGrid>
+      <w:tr>
+        <w:tc>
+          <w:tcPr>
+            <w:tcW w:type="dxa" w:w="9360"/>
+            <w:shd w:val="clear" w:color="auto" w:fill="E8F5E9"/>
+            <w:tcBorders>
+              <w:top w:val="single" w:sz="4" w:space="0" w:color="43A047"/>
+              <w:left w:val="single" w:sz="30" w:space="0" w:color="43A047"/>
+              <w:bottom w:val="single" w:sz="4" w:space="0" w:color="43A047"/>
+              <w:right w:val="single" w:sz="4" w:space="0" w:color="43A047"/>
+            </w:tcBorders>
+            <w:tcMar>
+              <w:top w:w="110" w:type="dxa"/>
+              <w:start w:w="170" w:type="dxa"/>
+              <w:bottom w:w="110" w:type="dxa"/>
+              <w:end w:w="170" w:type="dxa"/>
+            </w:tcMar>
+          </w:tcPr>
+          <w:p>
+            <w:pPr>
+              <w:spacing w:after="0"/>
+            </w:pPr>
+            <w:r>
+              <w:rPr>
+                <w:b/>
+                <w:color w:val="2E7D32"/>
+                <w:sz w:val="21"/>
+              </w:rPr>
+              <w:t xml:space="preserve">Prefer a dark screen?   </w:t>
+            </w:r>
+            <w:r>
+              <w:rPr>
+                <w:color w:val="222B38"/>
+              </w:rPr>
+              <w:t>Choose View → Toggle Dark Mode to switch between light and dark themes at any time — handy for night operating.</w:t>
+            </w:r>
+          </w:p>
+        </w:tc>
+      </w:tr>
+    </w:tbl>
+    <w:p>
+      <w:pPr>
+        <w:spacing w:after="80"/>
+      </w:pPr>
+    </w:p>
+    <w:p>
+      <w:r>
+        <w:t xml:space="preserve">Now that the map page has names for all its parts, the next chapters put them to work — starting with </w:t>
+      </w:r>
+      <w:r>
+        <w:rPr>
+          <w:i/>
+        </w:rPr>
+        <w:t>moving around the map and choosing base maps</w:t>
+      </w:r>
+      <w:r>
+        <w:t>.</w:t>
+      </w:r>
+    </w:p>
+    <w:p>
+      <w:r>
+        <w:br w:type="page"/>
+      </w:r>
+    </w:p>
+    <w:p>
+      <w:pPr>
+        <w:spacing w:after="40"/>
+      </w:pPr>
+      <w:r>
+        <w:rPr>
+          <w:rFonts w:ascii="Segoe UI Semibold" w:hAnsi="Segoe UI Semibold"/>
+          <w:b/>
+          <w:color w:val="2E6DA4"/>
+          <w:sz w:val="20"/>
+        </w:rPr>
+        <w:t>CHAPTER 4</w:t>
+      </w:r>
+    </w:p>
+    <w:p>
+      <w:pPr>
+        <w:pStyle w:val="Heading1"/>
+        <w:spacing w:after="40"/>
+        <w:outlineLvl w:val="0"/>
+      </w:pPr>
+      <w:r>
+        <w:rPr>
+          <w:rFonts w:ascii="Segoe UI Semibold" w:hAnsi="Segoe UI Semibold"/>
+          <w:color w:val="1F4E79"/>
+          <w:sz w:val="56"/>
+        </w:rPr>
         <w:t>Drawing on the Map</w:t>
       </w:r>
     </w:p>
@@ -4233,7 +7832,7 @@
           <w:color w:val="2E6DA4"/>
           <w:sz w:val="20"/>
         </w:rPr>
-        <w:t>CHAPTER 3</w:t>
+        <w:t>CHAPTER 5</w:t>
       </w:r>
     </w:p>
     <w:p>
@@ -4786,13 +8385,22 @@
         <w:tab/>
       </w:r>
       <w:r>
-        <w:t xml:space="preserve">In the feature buttons area at the lower-right of the map page, click </w:t>
+        <w:t xml:space="preserve">From the </w:t>
       </w:r>
       <w:r>
         <w:rPr>
           <w:b/>
         </w:rPr>
-        <w:t>Replay</w:t>
+        <w:t>menu bar</w:t>
+      </w:r>
+      <w:r>
+        <w:t xml:space="preserve">, choose </w:t>
+      </w:r>
+      <w:r>
+        <w:rPr>
+          <w:b/>
+        </w:rPr>
+        <w:t>Tools → Replay</w:t>
       </w:r>
       <w:r>
         <w:t>.</w:t>

</xml_diff>

<commit_message>
Manual: rewrite Drawing chapter, fix Contents; standardize American English
Docs:
- Rewrote the User Manual's Drawing chapter for the new on-map toolbar
  workflow (tools, per-tool color/fill/width, color wheel, text drag-size +
  resize/move, eyedropper, measurements); regenerated USER_MANUAL.docx
- Front-matter section titles are now real headings, so the Contents nests
  their sub-entries correctly (new style.section_title helper)

American English (matches the app's own "Color"):
- Manual, app tooltips, and DrawMode hints: colour→color, centre→center,
  metres→meters, labelled→labeled ("Centre on my station" → "Center on my station")
- Swept code comments for consistency
- Added "American English everywhere" to CLAUDE.md Coding Standards

No behavior change; build clean, 1372 tests pass.
</commit_message>
<xml_diff>
--- a/docs/USER_MANUAL.docx
+++ b/docs/USER_MANUAL.docx
@@ -81,6 +81,10 @@
       </w:r>
     </w:p>
     <w:p>
+      <w:pPr>
+        <w:pStyle w:val="Heading1"/>
+        <w:outlineLvl w:val="0"/>
+      </w:pPr>
       <w:r>
         <w:rPr>
           <w:rFonts w:ascii="Segoe UI Semibold" w:hAnsi="Segoe UI Semibold"/>
@@ -169,6 +173,10 @@
       </w:r>
     </w:p>
     <w:p>
+      <w:pPr>
+        <w:pStyle w:val="Heading1"/>
+        <w:outlineLvl w:val="0"/>
+      </w:pPr>
       <w:r>
         <w:rPr>
           <w:rFonts w:ascii="Segoe UI Semibold" w:hAnsi="Segoe UI Semibold"/>
@@ -599,6 +607,10 @@
       </w:r>
     </w:p>
     <w:p>
+      <w:pPr>
+        <w:pStyle w:val="Heading1"/>
+        <w:outlineLvl w:val="0"/>
+      </w:pPr>
       <w:r>
         <w:rPr>
           <w:rFonts w:ascii="Segoe UI Semibold" w:hAnsi="Segoe UI Semibold"/>
@@ -5019,7 +5031,7 @@
               <w:rPr>
                 <w:sz w:val="19"/>
               </w:rPr>
-              <w:t>Centre on my station</w:t>
+              <w:t>Center on my station</w:t>
             </w:r>
           </w:p>
         </w:tc>
@@ -6045,7 +6057,7 @@
         <w:t>panel title bar</w:t>
       </w:r>
       <w:r>
-        <w:t xml:space="preserve"> (the coloured strip with the grip dots) and close with its </w:t>
+        <w:t xml:space="preserve"> (the colored strip with the grip dots) and close with its </w:t>
       </w:r>
       <w:r>
         <w:rPr>
@@ -6172,7 +6184,7 @@
           <w:color w:val="64748B"/>
           <w:sz w:val="23"/>
         </w:rPr>
-        <w:t>Mark up the map with lines, shapes, and circles for planning and situational awareness.</w:t>
+        <w:t>Annotate the map with lines, shapes, circles, and text — with color, fill, width, and real-world measurements.</w:t>
       </w:r>
     </w:p>
     <w:p>
@@ -6217,7 +6229,7 @@
           <w:color w:val="222B38"/>
           <w:sz w:val="20"/>
         </w:rPr>
-        <w:t>•  Finding the tools &amp; how draw mode works</w:t>
+        <w:t>•  Opening the drawing toolbar</w:t>
       </w:r>
     </w:p>
     <w:p>
@@ -6230,7 +6242,7 @@
           <w:color w:val="222B38"/>
           <w:sz w:val="20"/>
         </w:rPr>
-        <w:t>•  Line, polygon, and circle</w:t>
+        <w:t>•  A tour of the toolbar</w:t>
       </w:r>
     </w:p>
     <w:p>
@@ -6243,7 +6255,7 @@
           <w:color w:val="222B38"/>
           <w:sz w:val="20"/>
         </w:rPr>
-        <w:t>•  Erasing, clearing, and exiting</w:t>
+        <w:t>•  Choosing color, fill, and width</w:t>
       </w:r>
     </w:p>
     <w:p>
@@ -6256,7 +6268,7 @@
           <w:color w:val="222B38"/>
           <w:sz w:val="20"/>
         </w:rPr>
-        <w:t>•  Importing &amp; exporting (GPX / KML)</w:t>
+        <w:t>•  Lines, polygons, and circles</w:t>
       </w:r>
     </w:p>
     <w:p>
@@ -6269,7 +6281,59 @@
           <w:color w:val="222B38"/>
           <w:sz w:val="20"/>
         </w:rPr>
-        <w:t>•  Saving your work</w:t>
+        <w:t>•  Adding, sizing, and moving text</w:t>
+      </w:r>
+    </w:p>
+    <w:p>
+      <w:pPr>
+        <w:spacing w:after="20"/>
+        <w:ind w:left="288"/>
+      </w:pPr>
+      <w:r>
+        <w:rPr>
+          <w:color w:val="222B38"/>
+          <w:sz w:val="20"/>
+        </w:rPr>
+        <w:t>•  The eyedropper</w:t>
+      </w:r>
+    </w:p>
+    <w:p>
+      <w:pPr>
+        <w:spacing w:after="20"/>
+        <w:ind w:left="288"/>
+      </w:pPr>
+      <w:r>
+        <w:rPr>
+          <w:color w:val="222B38"/>
+          <w:sz w:val="20"/>
+        </w:rPr>
+        <w:t>•  Measurements</w:t>
+      </w:r>
+    </w:p>
+    <w:p>
+      <w:pPr>
+        <w:spacing w:after="20"/>
+        <w:ind w:left="288"/>
+      </w:pPr>
+      <w:r>
+        <w:rPr>
+          <w:color w:val="222B38"/>
+          <w:sz w:val="20"/>
+        </w:rPr>
+        <w:t>•  Erasing, clearing, and exiting</w:t>
+      </w:r>
+    </w:p>
+    <w:p>
+      <w:pPr>
+        <w:spacing w:after="20"/>
+        <w:ind w:left="288"/>
+      </w:pPr>
+      <w:r>
+        <w:rPr>
+          <w:color w:val="222B38"/>
+          <w:sz w:val="20"/>
+        </w:rPr>
+        <w:t>•  Importing &amp; exporting (GPX / KML)</w:t>
       </w:r>
     </w:p>
     <w:p>
@@ -6363,157 +6427,62 @@
         <w:pStyle w:val="Heading1"/>
       </w:pPr>
       <w:r>
-        <w:t>Finding the Drawing Tools</w:t>
-      </w:r>
-    </w:p>
-    <w:p>
-      <w:r>
-        <w:t xml:space="preserve">All of the drawing tools live in one place: the </w:t>
+        <w:t>Opening the Drawing Toolbar</w:t>
+      </w:r>
+    </w:p>
+    <w:p>
+      <w:r>
+        <w:t xml:space="preserve">All of the drawing is done from an on-map </w:t>
       </w:r>
       <w:r>
         <w:rPr>
           <w:b/>
         </w:rPr>
-        <w:t>menu bar</w:t>
-      </w:r>
-      <w:r>
-        <w:t xml:space="preserve">, under </w:t>
+        <w:t>drawing toolbar</w:t>
+      </w:r>
+      <w:r>
+        <w:t xml:space="preserve"> that appears only while you are drawing. To open it, choose </w:t>
       </w:r>
       <w:r>
         <w:rPr>
           <w:b/>
         </w:rPr>
-        <w:t>Map → Draw</w:t>
-      </w:r>
-      <w:r>
-        <w:t>. You will find:</w:t>
-      </w:r>
-    </w:p>
-    <w:p>
-      <w:pPr>
-        <w:tabs>
-          <w:tab w:pos="547" w:val="left"/>
-        </w:tabs>
-        <w:spacing w:after="80"/>
-        <w:ind w:left="547" w:hanging="288"/>
-      </w:pPr>
-      <w:r>
-        <w:rPr>
-          <w:color w:val="2E6DA4"/>
-        </w:rPr>
-        <w:t>▪</w:t>
-        <w:tab/>
+        <w:t>Map → Draw → Drawing Toolbar</w:t>
+      </w:r>
+      <w:r>
+        <w:t xml:space="preserve"> from the menu bar. The toolbar appears across the top of the map, and the map enters </w:t>
       </w:r>
       <w:r>
         <w:rPr>
           <w:b/>
         </w:rPr>
-        <w:t>Draw Line</w:t>
-      </w:r>
-      <w:r>
-        <w:t xml:space="preserve">, </w:t>
+        <w:t>draw mode</w:t>
+      </w:r>
+      <w:r>
+        <w:t>.</w:t>
+      </w:r>
+    </w:p>
+    <w:p>
+      <w:r>
+        <w:t xml:space="preserve">That same menu also holds </w:t>
       </w:r>
       <w:r>
         <w:rPr>
           <w:b/>
         </w:rPr>
-        <w:t>Draw Polygon</w:t>
-      </w:r>
-      <w:r>
-        <w:t xml:space="preserve">, </w:t>
+        <w:t>Import GPX / KML</w:t>
+      </w:r>
+      <w:r>
+        <w:t xml:space="preserve"> and </w:t>
       </w:r>
       <w:r>
         <w:rPr>
           <w:b/>
         </w:rPr>
-        <w:t>Draw Circle</w:t>
-      </w:r>
-      <w:r>
-        <w:t xml:space="preserve"> — the three drawing tools.</w:t>
-      </w:r>
-    </w:p>
-    <w:p>
-      <w:pPr>
-        <w:tabs>
-          <w:tab w:pos="547" w:val="left"/>
-        </w:tabs>
-        <w:spacing w:after="80"/>
-        <w:ind w:left="547" w:hanging="288"/>
-      </w:pPr>
-      <w:r>
-        <w:rPr>
-          <w:color w:val="2E6DA4"/>
-        </w:rPr>
-        <w:t>▪</w:t>
-        <w:tab/>
-      </w:r>
-      <w:r>
-        <w:rPr>
-          <w:b/>
-        </w:rPr>
-        <w:t>Erase Shape</w:t>
-      </w:r>
-      <w:r>
-        <w:t xml:space="preserve"> — remove one shape.</w:t>
-      </w:r>
-    </w:p>
-    <w:p>
-      <w:pPr>
-        <w:tabs>
-          <w:tab w:pos="547" w:val="left"/>
-        </w:tabs>
-        <w:spacing w:after="80"/>
-        <w:ind w:left="547" w:hanging="288"/>
-      </w:pPr>
-      <w:r>
-        <w:rPr>
-          <w:color w:val="2E6DA4"/>
-        </w:rPr>
-        <w:t>▪</w:t>
-        <w:tab/>
-      </w:r>
-      <w:r>
-        <w:rPr>
-          <w:b/>
-        </w:rPr>
-        <w:t>Clear All Drawings</w:t>
-      </w:r>
-      <w:r>
-        <w:t xml:space="preserve"> — remove everything you have drawn.</w:t>
-      </w:r>
-    </w:p>
-    <w:p>
-      <w:pPr>
-        <w:tabs>
-          <w:tab w:pos="547" w:val="left"/>
-        </w:tabs>
-        <w:spacing w:after="80"/>
-        <w:ind w:left="547" w:hanging="288"/>
-      </w:pPr>
-      <w:r>
-        <w:rPr>
-          <w:color w:val="2E6DA4"/>
-        </w:rPr>
-        <w:t>▪</w:t>
-        <w:tab/>
-      </w:r>
-      <w:r>
-        <w:rPr>
-          <w:b/>
-        </w:rPr>
-        <w:t>Import GPX / KML…</w:t>
-      </w:r>
-      <w:r>
-        <w:t xml:space="preserve"> and </w:t>
-      </w:r>
-      <w:r>
-        <w:rPr>
-          <w:b/>
-        </w:rPr>
-        <w:t>Export Drawings…</w:t>
-      </w:r>
-      <w:r>
-        <w:t xml:space="preserve"> — load shapes from, or save them to, a file.</w:t>
+        <w:t>Export Drawings</w:t>
+      </w:r>
+      <w:r>
+        <w:t xml:space="preserve"> (covered later) — everything else lives on the toolbar.</w:t>
       </w:r>
     </w:p>
     <w:tbl>
@@ -6569,7 +6538,7 @@
                 <w:color w:val="64748B"/>
                 <w:sz w:val="20"/>
               </w:rPr>
-              <w:t>The Map menu open, showing the Draw submenu with all of its items</w:t>
+              <w:t>The Map → Draw menu open, showing Drawing Toolbar, Import, and Export</w:t>
             </w:r>
           </w:p>
         </w:tc>
@@ -6579,55 +6548,6 @@
       <w:pPr>
         <w:spacing w:after="80"/>
       </w:pPr>
-    </w:p>
-    <w:p>
-      <w:pPr>
-        <w:pStyle w:val="Heading1"/>
-      </w:pPr>
-      <w:r>
-        <w:t>How Draw Mode Works</w:t>
-      </w:r>
-    </w:p>
-    <w:p>
-      <w:r>
-        <w:t xml:space="preserve">When you pick a drawing tool, APRS Command enters </w:t>
-      </w:r>
-      <w:r>
-        <w:rPr>
-          <w:b/>
-        </w:rPr>
-        <w:t>draw mode</w:t>
-      </w:r>
-      <w:r>
-        <w:t xml:space="preserve">. A </w:t>
-      </w:r>
-      <w:r>
-        <w:rPr>
-          <w:b/>
-        </w:rPr>
-        <w:t>draw-mode banner</w:t>
-      </w:r>
-      <w:r>
-        <w:t xml:space="preserve"> appears across the top of the map area, telling you what the current tool does and giving you </w:t>
-      </w:r>
-      <w:r>
-        <w:rPr>
-          <w:b/>
-        </w:rPr>
-        <w:t>Clear</w:t>
-      </w:r>
-      <w:r>
-        <w:t xml:space="preserve"> and </w:t>
-      </w:r>
-      <w:r>
-        <w:rPr>
-          <w:b/>
-        </w:rPr>
-        <w:t>✕ Exit</w:t>
-      </w:r>
-      <w:r>
-        <w:t xml:space="preserve"> buttons.</w:t>
-      </w:r>
     </w:p>
     <w:tbl>
       <w:tblPr>
@@ -6673,7 +6593,7 @@
               <w:rPr>
                 <w:color w:val="222B38"/>
               </w:rPr>
-              <w:t>While a drawing tool is active, clicking and dragging draws on the map instead of moving it — so your points land exactly where you click and the map never jumps out from under you. You can still zoom in and out with the mouse wheel. To pan the map again, finish your shape or click ✕ Exit to leave draw mode.</w:t>
+              <w:t>In draw mode, clicking and dragging draws on the map instead of moving it — so your points land exactly where you click and the map never jumps out from under you. You can still zoom with the mouse wheel. To pan the map again, click ✕ Exit on the toolbar to leave draw mode.</w:t>
             </w:r>
           </w:p>
         </w:tc>
@@ -6685,18 +6605,472 @@
       </w:pPr>
     </w:p>
     <w:p>
-      <w:r>
-        <w:t xml:space="preserve">Switching from one tool to another </w:t>
-      </w:r>
-      <w:r>
-        <w:rPr>
-          <w:b/>
-        </w:rPr>
-        <w:t>keeps</w:t>
-      </w:r>
-      <w:r>
-        <w:t xml:space="preserve"> the shape you just drew — picking the circle tool after drawing a line will not erase the line.</w:t>
-      </w:r>
+      <w:pPr>
+        <w:pStyle w:val="Heading1"/>
+      </w:pPr>
+      <w:r>
+        <w:t>A Tour of the Drawing Toolbar</w:t>
+      </w:r>
+    </w:p>
+    <w:p>
+      <w:r>
+        <w:t>The toolbar puts every drawing control in one place. The tool you are using is highlighted.</w:t>
+      </w:r>
+    </w:p>
+    <w:tbl>
+      <w:tblPr>
+        <w:tblW w:type="auto" w:w="0"/>
+        <w:jc w:val="center"/>
+        <w:tblLayout w:type="fixed"/>
+        <w:tblLook w:firstColumn="1" w:firstRow="1" w:lastColumn="0" w:lastRow="0" w:noHBand="0" w:noVBand="1" w:val="04A0"/>
+        <w:tblBorders>
+          <w:top w:val="single" w:sz="4" w:space="0" w:color="D7DEE7"/>
+          <w:left w:val="single" w:sz="4" w:space="0" w:color="D7DEE7"/>
+          <w:bottom w:val="single" w:sz="4" w:space="0" w:color="D7DEE7"/>
+          <w:right w:val="single" w:sz="4" w:space="0" w:color="D7DEE7"/>
+          <w:insideH w:val="single" w:sz="4" w:space="0" w:color="D7DEE7"/>
+          <w:insideV w:val="single" w:sz="4" w:space="0" w:color="D7DEE7"/>
+        </w:tblBorders>
+      </w:tblPr>
+      <w:tblGrid>
+        <w:gridCol w:w="4680"/>
+        <w:gridCol w:w="4680"/>
+      </w:tblGrid>
+      <w:tr>
+        <w:tc>
+          <w:tcPr>
+            <w:tcW w:type="dxa" w:w="1944"/>
+            <w:shd w:val="clear" w:color="auto" w:fill="1F4E79"/>
+            <w:tcMar>
+              <w:top w:w="70" w:type="dxa"/>
+              <w:start w:w="120" w:type="dxa"/>
+              <w:bottom w:w="70" w:type="dxa"/>
+              <w:end w:w="120" w:type="dxa"/>
+            </w:tcMar>
+          </w:tcPr>
+          <w:p>
+            <w:pPr>
+              <w:spacing w:after="0"/>
+            </w:pPr>
+            <w:r>
+              <w:rPr>
+                <w:rFonts w:ascii="Segoe UI Semibold" w:hAnsi="Segoe UI Semibold"/>
+                <w:b/>
+                <w:color w:val="FFFFFF"/>
+                <w:sz w:val="20"/>
+              </w:rPr>
+              <w:t>Control</w:t>
+            </w:r>
+          </w:p>
+        </w:tc>
+        <w:tc>
+          <w:tcPr>
+            <w:tcW w:type="dxa" w:w="7416"/>
+            <w:shd w:val="clear" w:color="auto" w:fill="1F4E79"/>
+            <w:tcMar>
+              <w:top w:w="70" w:type="dxa"/>
+              <w:start w:w="120" w:type="dxa"/>
+              <w:bottom w:w="70" w:type="dxa"/>
+              <w:end w:w="120" w:type="dxa"/>
+            </w:tcMar>
+          </w:tcPr>
+          <w:p>
+            <w:pPr>
+              <w:spacing w:after="0"/>
+            </w:pPr>
+            <w:r>
+              <w:rPr>
+                <w:rFonts w:ascii="Segoe UI Semibold" w:hAnsi="Segoe UI Semibold"/>
+                <w:b/>
+                <w:color w:val="FFFFFF"/>
+                <w:sz w:val="20"/>
+              </w:rPr>
+              <w:t>What it does</w:t>
+            </w:r>
+          </w:p>
+        </w:tc>
+      </w:tr>
+      <w:tr>
+        <w:tc>
+          <w:tcPr>
+            <w:tcW w:type="dxa" w:w="1944"/>
+            <w:tcMar>
+              <w:top w:w="60" w:type="dxa"/>
+              <w:start w:w="120" w:type="dxa"/>
+              <w:bottom w:w="60" w:type="dxa"/>
+              <w:end w:w="120" w:type="dxa"/>
+            </w:tcMar>
+          </w:tcPr>
+          <w:p>
+            <w:pPr>
+              <w:spacing w:after="0"/>
+            </w:pPr>
+            <w:r>
+              <w:rPr>
+                <w:sz w:val="19"/>
+              </w:rPr>
+              <w:t>Tool buttons</w:t>
+            </w:r>
+          </w:p>
+        </w:tc>
+        <w:tc>
+          <w:tcPr>
+            <w:tcW w:type="dxa" w:w="7416"/>
+            <w:tcMar>
+              <w:top w:w="60" w:type="dxa"/>
+              <w:start w:w="120" w:type="dxa"/>
+              <w:bottom w:w="60" w:type="dxa"/>
+              <w:end w:w="120" w:type="dxa"/>
+            </w:tcMar>
+          </w:tcPr>
+          <w:p>
+            <w:pPr>
+              <w:spacing w:after="0"/>
+            </w:pPr>
+            <w:r>
+              <w:rPr>
+                <w:sz w:val="19"/>
+              </w:rPr>
+              <w:t>Line, Polygon, Circle, Text, Resize/Move text, Eyedropper, and Erase. Click one to switch tools; the active tool lights up. (Switching tools never deletes what you have already drawn.)</w:t>
+            </w:r>
+          </w:p>
+        </w:tc>
+      </w:tr>
+      <w:tr>
+        <w:tc>
+          <w:tcPr>
+            <w:tcW w:type="dxa" w:w="1944"/>
+            <w:shd w:val="clear" w:color="auto" w:fill="F3F6FA"/>
+            <w:tcMar>
+              <w:top w:w="60" w:type="dxa"/>
+              <w:start w:w="120" w:type="dxa"/>
+              <w:bottom w:w="60" w:type="dxa"/>
+              <w:end w:w="120" w:type="dxa"/>
+            </w:tcMar>
+          </w:tcPr>
+          <w:p>
+            <w:pPr>
+              <w:spacing w:after="0"/>
+            </w:pPr>
+            <w:r>
+              <w:rPr>
+                <w:sz w:val="19"/>
+              </w:rPr>
+              <w:t>Color swatch</w:t>
+            </w:r>
+          </w:p>
+        </w:tc>
+        <w:tc>
+          <w:tcPr>
+            <w:tcW w:type="dxa" w:w="7416"/>
+            <w:shd w:val="clear" w:color="auto" w:fill="F3F6FA"/>
+            <w:tcMar>
+              <w:top w:w="60" w:type="dxa"/>
+              <w:start w:w="120" w:type="dxa"/>
+              <w:bottom w:w="60" w:type="dxa"/>
+              <w:end w:w="120" w:type="dxa"/>
+            </w:tcMar>
+          </w:tcPr>
+          <w:p>
+            <w:pPr>
+              <w:spacing w:after="0"/>
+            </w:pPr>
+            <w:r>
+              <w:rPr>
+                <w:sz w:val="19"/>
+              </w:rPr>
+              <w:t>Shows the current tool's color; click it to open the color wheel and choose any color.</w:t>
+            </w:r>
+          </w:p>
+        </w:tc>
+      </w:tr>
+      <w:tr>
+        <w:tc>
+          <w:tcPr>
+            <w:tcW w:type="dxa" w:w="1944"/>
+            <w:tcMar>
+              <w:top w:w="60" w:type="dxa"/>
+              <w:start w:w="120" w:type="dxa"/>
+              <w:bottom w:w="60" w:type="dxa"/>
+              <w:end w:w="120" w:type="dxa"/>
+            </w:tcMar>
+          </w:tcPr>
+          <w:p>
+            <w:pPr>
+              <w:spacing w:after="0"/>
+            </w:pPr>
+            <w:r>
+              <w:rPr>
+                <w:sz w:val="19"/>
+              </w:rPr>
+              <w:t>Fill</w:t>
+            </w:r>
+          </w:p>
+        </w:tc>
+        <w:tc>
+          <w:tcPr>
+            <w:tcW w:type="dxa" w:w="7416"/>
+            <w:tcMar>
+              <w:top w:w="60" w:type="dxa"/>
+              <w:start w:w="120" w:type="dxa"/>
+              <w:bottom w:w="60" w:type="dxa"/>
+              <w:end w:w="120" w:type="dxa"/>
+            </w:tcMar>
+          </w:tcPr>
+          <w:p>
+            <w:pPr>
+              <w:spacing w:after="0"/>
+            </w:pPr>
+            <w:r>
+              <w:rPr>
+                <w:sz w:val="19"/>
+              </w:rPr>
+              <w:t>The fill for polygons and circles: None (outline only), Solid, or a hatch / dot pattern.</w:t>
+            </w:r>
+          </w:p>
+        </w:tc>
+      </w:tr>
+      <w:tr>
+        <w:tc>
+          <w:tcPr>
+            <w:tcW w:type="dxa" w:w="1944"/>
+            <w:shd w:val="clear" w:color="auto" w:fill="F3F6FA"/>
+            <w:tcMar>
+              <w:top w:w="60" w:type="dxa"/>
+              <w:start w:w="120" w:type="dxa"/>
+              <w:bottom w:w="60" w:type="dxa"/>
+              <w:end w:w="120" w:type="dxa"/>
+            </w:tcMar>
+          </w:tcPr>
+          <w:p>
+            <w:pPr>
+              <w:spacing w:after="0"/>
+            </w:pPr>
+            <w:r>
+              <w:rPr>
+                <w:sz w:val="19"/>
+              </w:rPr>
+              <w:t>W (width)</w:t>
+            </w:r>
+          </w:p>
+        </w:tc>
+        <w:tc>
+          <w:tcPr>
+            <w:tcW w:type="dxa" w:w="7416"/>
+            <w:shd w:val="clear" w:color="auto" w:fill="F3F6FA"/>
+            <w:tcMar>
+              <w:top w:w="60" w:type="dxa"/>
+              <w:start w:w="120" w:type="dxa"/>
+              <w:bottom w:w="60" w:type="dxa"/>
+              <w:end w:w="120" w:type="dxa"/>
+            </w:tcMar>
+          </w:tcPr>
+          <w:p>
+            <w:pPr>
+              <w:spacing w:after="0"/>
+            </w:pPr>
+            <w:r>
+              <w:rPr>
+                <w:sz w:val="19"/>
+              </w:rPr>
+              <w:t>Line / outline thickness, from 1 to 12.</w:t>
+            </w:r>
+          </w:p>
+        </w:tc>
+      </w:tr>
+      <w:tr>
+        <w:tc>
+          <w:tcPr>
+            <w:tcW w:type="dxa" w:w="1944"/>
+            <w:tcMar>
+              <w:top w:w="60" w:type="dxa"/>
+              <w:start w:w="120" w:type="dxa"/>
+              <w:bottom w:w="60" w:type="dxa"/>
+              <w:end w:w="120" w:type="dxa"/>
+            </w:tcMar>
+          </w:tcPr>
+          <w:p>
+            <w:pPr>
+              <w:spacing w:after="0"/>
+            </w:pPr>
+            <w:r>
+              <w:rPr>
+                <w:sz w:val="19"/>
+              </w:rPr>
+              <w:t>Measure</w:t>
+            </w:r>
+          </w:p>
+        </w:tc>
+        <w:tc>
+          <w:tcPr>
+            <w:tcW w:type="dxa" w:w="7416"/>
+            <w:tcMar>
+              <w:top w:w="60" w:type="dxa"/>
+              <w:start w:w="120" w:type="dxa"/>
+              <w:bottom w:w="60" w:type="dxa"/>
+              <w:end w:w="120" w:type="dxa"/>
+            </w:tcMar>
+          </w:tcPr>
+          <w:p>
+            <w:pPr>
+              <w:spacing w:after="0"/>
+            </w:pPr>
+            <w:r>
+              <w:rPr>
+                <w:sz w:val="19"/>
+              </w:rPr>
+              <w:t>Turns the length / diameter / area labels on shapes on or off.</w:t>
+            </w:r>
+          </w:p>
+        </w:tc>
+      </w:tr>
+      <w:tr>
+        <w:tc>
+          <w:tcPr>
+            <w:tcW w:type="dxa" w:w="1944"/>
+            <w:shd w:val="clear" w:color="auto" w:fill="F3F6FA"/>
+            <w:tcMar>
+              <w:top w:w="60" w:type="dxa"/>
+              <w:start w:w="120" w:type="dxa"/>
+              <w:bottom w:w="60" w:type="dxa"/>
+              <w:end w:w="120" w:type="dxa"/>
+            </w:tcMar>
+          </w:tcPr>
+          <w:p>
+            <w:pPr>
+              <w:spacing w:after="0"/>
+            </w:pPr>
+            <w:r>
+              <w:rPr>
+                <w:sz w:val="19"/>
+              </w:rPr>
+              <w:t>Units</w:t>
+            </w:r>
+          </w:p>
+        </w:tc>
+        <w:tc>
+          <w:tcPr>
+            <w:tcW w:type="dxa" w:w="7416"/>
+            <w:shd w:val="clear" w:color="auto" w:fill="F3F6FA"/>
+            <w:tcMar>
+              <w:top w:w="60" w:type="dxa"/>
+              <w:start w:w="120" w:type="dxa"/>
+              <w:bottom w:w="60" w:type="dxa"/>
+              <w:end w:w="120" w:type="dxa"/>
+            </w:tcMar>
+          </w:tcPr>
+          <w:p>
+            <w:pPr>
+              <w:spacing w:after="0"/>
+            </w:pPr>
+            <w:r>
+              <w:rPr>
+                <w:sz w:val="19"/>
+              </w:rPr>
+              <w:t>Switches measurements between Imperial and Metric.</w:t>
+            </w:r>
+          </w:p>
+        </w:tc>
+      </w:tr>
+      <w:tr>
+        <w:tc>
+          <w:tcPr>
+            <w:tcW w:type="dxa" w:w="1944"/>
+            <w:tcMar>
+              <w:top w:w="60" w:type="dxa"/>
+              <w:start w:w="120" w:type="dxa"/>
+              <w:bottom w:w="60" w:type="dxa"/>
+              <w:end w:w="120" w:type="dxa"/>
+            </w:tcMar>
+          </w:tcPr>
+          <w:p>
+            <w:pPr>
+              <w:spacing w:after="0"/>
+            </w:pPr>
+            <w:r>
+              <w:rPr>
+                <w:sz w:val="19"/>
+              </w:rPr>
+              <w:t>Clear</w:t>
+            </w:r>
+          </w:p>
+        </w:tc>
+        <w:tc>
+          <w:tcPr>
+            <w:tcW w:type="dxa" w:w="7416"/>
+            <w:tcMar>
+              <w:top w:w="60" w:type="dxa"/>
+              <w:start w:w="120" w:type="dxa"/>
+              <w:bottom w:w="60" w:type="dxa"/>
+              <w:end w:w="120" w:type="dxa"/>
+            </w:tcMar>
+          </w:tcPr>
+          <w:p>
+            <w:pPr>
+              <w:spacing w:after="0"/>
+            </w:pPr>
+            <w:r>
+              <w:rPr>
+                <w:sz w:val="19"/>
+              </w:rPr>
+              <w:t>Deletes every drawing on the map.</w:t>
+            </w:r>
+          </w:p>
+        </w:tc>
+      </w:tr>
+      <w:tr>
+        <w:tc>
+          <w:tcPr>
+            <w:tcW w:type="dxa" w:w="1944"/>
+            <w:shd w:val="clear" w:color="auto" w:fill="F3F6FA"/>
+            <w:tcMar>
+              <w:top w:w="60" w:type="dxa"/>
+              <w:start w:w="120" w:type="dxa"/>
+              <w:bottom w:w="60" w:type="dxa"/>
+              <w:end w:w="120" w:type="dxa"/>
+            </w:tcMar>
+          </w:tcPr>
+          <w:p>
+            <w:pPr>
+              <w:spacing w:after="0"/>
+            </w:pPr>
+            <w:r>
+              <w:rPr>
+                <w:sz w:val="19"/>
+              </w:rPr>
+              <w:t>✕ Exit</w:t>
+            </w:r>
+          </w:p>
+        </w:tc>
+        <w:tc>
+          <w:tcPr>
+            <w:tcW w:type="dxa" w:w="7416"/>
+            <w:shd w:val="clear" w:color="auto" w:fill="F3F6FA"/>
+            <w:tcMar>
+              <w:top w:w="60" w:type="dxa"/>
+              <w:start w:w="120" w:type="dxa"/>
+              <w:bottom w:w="60" w:type="dxa"/>
+              <w:end w:w="120" w:type="dxa"/>
+            </w:tcMar>
+          </w:tcPr>
+          <w:p>
+            <w:pPr>
+              <w:spacing w:after="0"/>
+            </w:pPr>
+            <w:r>
+              <w:rPr>
+                <w:sz w:val="19"/>
+              </w:rPr>
+              <w:t>Leaves draw mode (your drawings stay).</w:t>
+            </w:r>
+          </w:p>
+        </w:tc>
+      </w:tr>
+    </w:tbl>
+    <w:p>
+      <w:pPr>
+        <w:spacing w:after="40"/>
+      </w:pPr>
     </w:p>
     <w:tbl>
       <w:tblPr>
@@ -6751,7 +7125,7 @@
                 <w:color w:val="64748B"/>
                 <w:sz w:val="20"/>
               </w:rPr>
-              <w:t>The draw-mode banner across the top of the map, with its Clear and ✕ Exit buttons</w:t>
+              <w:t>The drawing toolbar across the top of the map, with each control labeled</w:t>
             </w:r>
           </w:p>
         </w:tc>
@@ -6762,6 +7136,211 @@
         <w:spacing w:after="80"/>
       </w:pPr>
     </w:p>
+    <w:tbl>
+      <w:tblPr>
+        <w:tblW w:type="auto" w:w="0"/>
+        <w:jc w:val="center"/>
+        <w:tblLayout w:type="fixed"/>
+        <w:tblLook w:firstColumn="1" w:firstRow="1" w:lastColumn="0" w:lastRow="0" w:noHBand="0" w:noVBand="1" w:val="04A0"/>
+      </w:tblPr>
+      <w:tblGrid>
+        <w:gridCol w:w="9360"/>
+      </w:tblGrid>
+      <w:tr>
+        <w:tc>
+          <w:tcPr>
+            <w:tcW w:type="dxa" w:w="9360"/>
+            <w:shd w:val="clear" w:color="auto" w:fill="FFF4CC"/>
+            <w:tcBorders>
+              <w:top w:val="single" w:sz="4" w:space="0" w:color="E0A800"/>
+              <w:left w:val="single" w:sz="30" w:space="0" w:color="E0A800"/>
+              <w:bottom w:val="single" w:sz="4" w:space="0" w:color="E0A800"/>
+              <w:right w:val="single" w:sz="4" w:space="0" w:color="E0A800"/>
+            </w:tcBorders>
+            <w:tcMar>
+              <w:top w:w="110" w:type="dxa"/>
+              <w:start w:w="170" w:type="dxa"/>
+              <w:bottom w:w="110" w:type="dxa"/>
+              <w:end w:w="170" w:type="dxa"/>
+            </w:tcMar>
+          </w:tcPr>
+          <w:p>
+            <w:pPr>
+              <w:spacing w:after="0"/>
+            </w:pPr>
+            <w:r>
+              <w:rPr>
+                <w:b/>
+                <w:color w:val="8A6D00"/>
+                <w:sz w:val="21"/>
+              </w:rPr>
+              <w:t xml:space="preserve">Each tool remembers its own style.   </w:t>
+            </w:r>
+            <w:r>
+              <w:rPr>
+                <w:color w:val="222B38"/>
+              </w:rPr>
+              <w:t>Color, fill, and width are kept per tool. Your line can be a red 3-px line while your circle is a blue cross-hatch — switch tools and the toolbar shows that tool's settings. Changing a setting affects only the tool you are on.</w:t>
+            </w:r>
+          </w:p>
+        </w:tc>
+      </w:tr>
+    </w:tbl>
+    <w:p>
+      <w:pPr>
+        <w:spacing w:after="80"/>
+      </w:pPr>
+    </w:p>
+    <w:p>
+      <w:pPr>
+        <w:pStyle w:val="Heading1"/>
+      </w:pPr>
+      <w:r>
+        <w:t>Choosing Color, Fill, and Width</w:t>
+      </w:r>
+    </w:p>
+    <w:p>
+      <w:r>
+        <w:rPr>
+          <w:b/>
+        </w:rPr>
+        <w:t>Color.</w:t>
+      </w:r>
+      <w:r>
+        <w:t xml:space="preserve"> Click the color swatch on the toolbar to open the color wheel. Pick from the round spectrum, the Palette of preset swatches, or by typing a hex value — then click </w:t>
+      </w:r>
+      <w:r>
+        <w:rPr>
+          <w:b/>
+        </w:rPr>
+        <w:t>Done</w:t>
+      </w:r>
+      <w:r>
+        <w:t xml:space="preserve"> (or click outside the wheel) to close it. The color applies to whatever you draw next with the current tool.</w:t>
+      </w:r>
+    </w:p>
+    <w:p>
+      <w:r>
+        <w:rPr>
+          <w:b/>
+        </w:rPr>
+        <w:t>Fill.</w:t>
+      </w:r>
+      <w:r>
+        <w:t xml:space="preserve"> Polygons and circles can be filled. Click </w:t>
+      </w:r>
+      <w:r>
+        <w:rPr>
+          <w:b/>
+        </w:rPr>
+        <w:t>Fill</w:t>
+      </w:r>
+      <w:r>
+        <w:t xml:space="preserve"> and choose </w:t>
+      </w:r>
+      <w:r>
+        <w:rPr>
+          <w:b/>
+        </w:rPr>
+        <w:t>None</w:t>
+      </w:r>
+      <w:r>
+        <w:t xml:space="preserve"> (outline only), </w:t>
+      </w:r>
+      <w:r>
+        <w:rPr>
+          <w:b/>
+        </w:rPr>
+        <w:t>Solid</w:t>
+      </w:r>
+      <w:r>
+        <w:t xml:space="preserve"> (a soft tint of the shape's color), or a pattern — Diagonal hatch, Cross-hatch, Horizontal, Vertical, or Dotted (handy for telling zones apart).</w:t>
+      </w:r>
+    </w:p>
+    <w:p>
+      <w:r>
+        <w:rPr>
+          <w:b/>
+        </w:rPr>
+        <w:t>Width.</w:t>
+      </w:r>
+      <w:r>
+        <w:t xml:space="preserve"> The </w:t>
+      </w:r>
+      <w:r>
+        <w:rPr>
+          <w:b/>
+        </w:rPr>
+        <w:t>W</w:t>
+      </w:r>
+      <w:r>
+        <w:t xml:space="preserve"> box sets the line or outline thickness (1–12).</w:t>
+      </w:r>
+    </w:p>
+    <w:tbl>
+      <w:tblPr>
+        <w:tblW w:type="auto" w:w="0"/>
+        <w:jc w:val="center"/>
+        <w:tblLayout w:type="fixed"/>
+        <w:tblLook w:firstColumn="1" w:firstRow="1" w:lastColumn="0" w:lastRow="0" w:noHBand="0" w:noVBand="1" w:val="04A0"/>
+      </w:tblPr>
+      <w:tblGrid>
+        <w:gridCol w:w="9360"/>
+      </w:tblGrid>
+      <w:tr>
+        <w:tc>
+          <w:tcPr>
+            <w:tcW w:type="dxa" w:w="9360"/>
+            <w:shd w:val="clear" w:color="auto" w:fill="F1F5F9"/>
+            <w:tcBorders>
+              <w:top w:val="dashed" w:sz="8" w:space="0" w:color="94A3B8"/>
+              <w:left w:val="dashed" w:sz="8" w:space="0" w:color="94A3B8"/>
+              <w:bottom w:val="dashed" w:sz="8" w:space="0" w:color="94A3B8"/>
+              <w:right w:val="dashed" w:sz="8" w:space="0" w:color="94A3B8"/>
+            </w:tcBorders>
+            <w:tcMar>
+              <w:top w:w="220" w:type="dxa"/>
+              <w:start w:w="170" w:type="dxa"/>
+              <w:bottom w:w="220" w:type="dxa"/>
+              <w:end w:w="170" w:type="dxa"/>
+            </w:tcMar>
+          </w:tcPr>
+          <w:p>
+            <w:pPr>
+              <w:spacing w:after="40"/>
+              <w:jc w:val="center"/>
+            </w:pPr>
+            <w:r>
+              <w:rPr>
+                <w:b/>
+                <w:color w:val="64748B"/>
+                <w:sz w:val="18"/>
+              </w:rPr>
+              <w:t>SCREENSHOT</w:t>
+            </w:r>
+          </w:p>
+          <w:p>
+            <w:pPr>
+              <w:spacing w:after="0"/>
+              <w:jc w:val="center"/>
+            </w:pPr>
+            <w:r>
+              <w:rPr>
+                <w:i/>
+                <w:color w:val="64748B"/>
+                <w:sz w:val="20"/>
+              </w:rPr>
+              <w:t>The color wheel open from the toolbar swatch, with its Done button</w:t>
+            </w:r>
+          </w:p>
+        </w:tc>
+      </w:tr>
+    </w:tbl>
+    <w:p>
+      <w:pPr>
+        <w:spacing w:after="80"/>
+      </w:pPr>
+    </w:p>
     <w:p>
       <w:pPr>
         <w:pStyle w:val="Heading1"/>
@@ -6787,16 +7366,16 @@
         <w:tab/>
       </w:r>
       <w:r>
-        <w:t xml:space="preserve">Open </w:t>
+        <w:t xml:space="preserve">Click the </w:t>
       </w:r>
       <w:r>
         <w:rPr>
           <w:b/>
         </w:rPr>
-        <w:t>Map → Draw → Draw Line</w:t>
-      </w:r>
-      <w:r>
-        <w:t>.</w:t>
+        <w:t>Line</w:t>
+      </w:r>
+      <w:r>
+        <w:t xml:space="preserve"> tool on the toolbar.</w:t>
       </w:r>
     </w:p>
     <w:p>
@@ -6845,7 +7424,7 @@
         <w:tab/>
       </w:r>
       <w:r>
-        <w:t>Click again at each point you want the line to pass through. A preview segment follows your cursor so you can see the next piece before you place it.</w:t>
+        <w:t>Click at each point the line should pass through — a preview segment follows your cursor.</w:t>
       </w:r>
     </w:p>
     <w:p>
@@ -6921,7 +7500,7 @@
               <w:rPr>
                 <w:color w:val="222B38"/>
               </w:rPr>
-              <w:t>A line needs at least two points. If you change your mind before finishing, just pick another tool or click ✕ Exit — a line with only one point is discarded.</w:t>
+              <w:t>A line needs at least two points; a one-point line is discarded.</w:t>
             </w:r>
           </w:p>
         </w:tc>
@@ -7005,11 +7584,6 @@
       </w:r>
     </w:p>
     <w:p>
-      <w:r>
-        <w:t>A polygon is a closed, filled shape — good for outlining an area.</w:t>
-      </w:r>
-    </w:p>
-    <w:p>
       <w:pPr>
         <w:tabs>
           <w:tab w:pos="547" w:val="left"/>
@@ -7026,16 +7600,16 @@
         <w:tab/>
       </w:r>
       <w:r>
-        <w:t xml:space="preserve">Open </w:t>
+        <w:t xml:space="preserve">Click the </w:t>
       </w:r>
       <w:r>
         <w:rPr>
           <w:b/>
         </w:rPr>
-        <w:t>Map → Draw → Draw Polygon</w:t>
-      </w:r>
-      <w:r>
-        <w:t>.</w:t>
+        <w:t>Polygon</w:t>
+      </w:r>
+      <w:r>
+        <w:t xml:space="preserve"> tool.</w:t>
       </w:r>
     </w:p>
     <w:p>
@@ -7064,7 +7638,7 @@
         <w:t>corner</w:t>
       </w:r>
       <w:r>
-        <w:t xml:space="preserve"> of the area in turn. As with the line, a preview follows your cursor.</w:t>
+        <w:t xml:space="preserve"> of the area in turn — a preview follows your cursor.</w:t>
       </w:r>
     </w:p>
     <w:p>
@@ -7084,16 +7658,7 @@
         <w:tab/>
       </w:r>
       <w:r>
-        <w:t xml:space="preserve">When you have placed the last corner, </w:t>
-      </w:r>
-      <w:r>
-        <w:rPr>
-          <w:b/>
-        </w:rPr>
-        <w:t>double-click</w:t>
-      </w:r>
-      <w:r>
-        <w:t xml:space="preserve"> to close the shape. APRS Command connects the final corner back to the first and fills the area.</w:t>
+        <w:t>Double-click to close the shape; the last corner joins back to the first.</w:t>
       </w:r>
     </w:p>
     <w:tbl>
@@ -7140,7 +7705,7 @@
               <w:rPr>
                 <w:color w:val="222B38"/>
               </w:rPr>
-              <w:t>A polygon needs at least three corners to form an area.</w:t>
+              <w:t>A polygon needs at least three corners.</w:t>
             </w:r>
           </w:p>
         </w:tc>
@@ -7204,7 +7769,7 @@
                 <w:color w:val="64748B"/>
                 <w:sz w:val="20"/>
               </w:rPr>
-              <w:t>A polygon being drawn around an area, showing the filled shape after closing</w:t>
+              <w:t>A polygon being drawn around an area, with a hatch fill</w:t>
             </w:r>
           </w:p>
         </w:tc>
@@ -7224,11 +7789,6 @@
       </w:r>
     </w:p>
     <w:p>
-      <w:r>
-        <w:t>The circle tool works by dragging outward from the centre — the same way most mapping programs do it.</w:t>
-      </w:r>
-    </w:p>
-    <w:p>
       <w:pPr>
         <w:tabs>
           <w:tab w:pos="547" w:val="left"/>
@@ -7245,16 +7805,16 @@
         <w:tab/>
       </w:r>
       <w:r>
-        <w:t xml:space="preserve">Open </w:t>
+        <w:t xml:space="preserve">Click the </w:t>
       </w:r>
       <w:r>
         <w:rPr>
           <w:b/>
         </w:rPr>
-        <w:t>Map → Draw → Draw Circle</w:t>
-      </w:r>
-      <w:r>
-        <w:t>.</w:t>
+        <w:t>Circle</w:t>
+      </w:r>
+      <w:r>
+        <w:t xml:space="preserve"> tool.</w:t>
       </w:r>
     </w:p>
     <w:p>
@@ -7274,13 +7834,13 @@
         <w:tab/>
       </w:r>
       <w:r>
-        <w:t xml:space="preserve">Press and hold the mouse button at the </w:t>
+        <w:t xml:space="preserve">Press and hold at the </w:t>
       </w:r>
       <w:r>
         <w:rPr>
           <w:b/>
         </w:rPr>
-        <w:t>centre</w:t>
+        <w:t>center</w:t>
       </w:r>
       <w:r>
         <w:t xml:space="preserve"> of the circle.</w:t>
@@ -7312,27 +7872,7 @@
         <w:t>outward</w:t>
       </w:r>
       <w:r>
-        <w:t xml:space="preserve"> — a preview circle grows to follow your cursor, so you can size it by eye.</w:t>
-      </w:r>
-    </w:p>
-    <w:p>
-      <w:pPr>
-        <w:tabs>
-          <w:tab w:pos="547" w:val="left"/>
-        </w:tabs>
-        <w:spacing w:after="100"/>
-        <w:ind w:left="547" w:hanging="547"/>
-      </w:pPr>
-      <w:r>
-        <w:rPr>
-          <w:b/>
-          <w:color w:val="1F4E79"/>
-        </w:rPr>
-        <w:t>4.</w:t>
-        <w:tab/>
-      </w:r>
-      <w:r>
-        <w:t>Release the mouse button to set the radius and finish the circle.</w:t>
+        <w:t xml:space="preserve"> — a preview circle grows — and release to set the radius.</w:t>
       </w:r>
     </w:p>
     <w:tbl>
@@ -7379,7 +7919,7 @@
               <w:rPr>
                 <w:color w:val="222B38"/>
               </w:rPr>
-              <w:t>Drag out far enough to give the circle a real size. A quick click without dragging does not create a circle — so a stray tap in circle mode is simply ignored.</w:t>
+              <w:t>Drag out far enough to give the circle a real size. A quick click with no drag makes no circle.</w:t>
             </w:r>
           </w:p>
         </w:tc>
@@ -7443,7 +7983,7 @@
                 <w:color w:val="64748B"/>
                 <w:sz w:val="20"/>
               </w:rPr>
-              <w:t>A circle being dragged outward from its centre, with the live preview</w:t>
+              <w:t>A circle being dragged outward from its center</w:t>
             </w:r>
           </w:p>
         </w:tc>
@@ -7459,7 +7999,12 @@
         <w:pStyle w:val="Heading1"/>
       </w:pPr>
       <w:r>
-        <w:t>Erasing a Single Shape</w:t>
+        <w:t>Adding Text</w:t>
+      </w:r>
+    </w:p>
+    <w:p>
+      <w:r>
+        <w:t>Text labels are sized by dragging, and they are anchored to the map — they grow and shrink with it as you zoom, so a label stays the right size for the area it marks.</w:t>
       </w:r>
     </w:p>
     <w:p>
@@ -7479,16 +8024,16 @@
         <w:tab/>
       </w:r>
       <w:r>
-        <w:t xml:space="preserve">Open </w:t>
+        <w:t xml:space="preserve">Click the </w:t>
       </w:r>
       <w:r>
         <w:rPr>
           <w:b/>
         </w:rPr>
-        <w:t>Map → Draw → Erase Shape</w:t>
-      </w:r>
-      <w:r>
-        <w:t>.</w:t>
+        <w:t>Text</w:t>
+      </w:r>
+      <w:r>
+        <w:t xml:space="preserve"> tool.</w:t>
       </w:r>
     </w:p>
     <w:p>
@@ -7508,43 +8053,54 @@
         <w:tab/>
       </w:r>
       <w:r>
-        <w:t>Click on (or very near) the shape you want to remove. It disappears; every other drawing stays put.</w:t>
-      </w:r>
-    </w:p>
-    <w:p>
-      <w:r>
-        <w:t>Erase mode stays active, so you can click several shapes in a row to remove them one at a time.</w:t>
-      </w:r>
-    </w:p>
-    <w:p>
-      <w:pPr>
-        <w:pStyle w:val="Heading1"/>
-      </w:pPr>
-      <w:r>
-        <w:t>Clearing Everything at Once</w:t>
-      </w:r>
-    </w:p>
-    <w:p>
-      <w:r>
-        <w:t xml:space="preserve">To wipe all of your drawings in one step, use either </w:t>
+        <w:t xml:space="preserve">Press and </w:t>
       </w:r>
       <w:r>
         <w:rPr>
           <w:b/>
         </w:rPr>
-        <w:t>Map → Draw → Clear All Drawings</w:t>
-      </w:r>
-      <w:r>
-        <w:t xml:space="preserve"> or the </w:t>
-      </w:r>
+        <w:t>drag</w:t>
+      </w:r>
+      <w:r>
+        <w:t xml:space="preserve"> on the map — the further you drag, the larger the text.</w:t>
+      </w:r>
+    </w:p>
+    <w:p>
+      <w:pPr>
+        <w:tabs>
+          <w:tab w:pos="547" w:val="left"/>
+        </w:tabs>
+        <w:spacing w:after="100"/>
+        <w:ind w:left="547" w:hanging="547"/>
+      </w:pPr>
       <w:r>
         <w:rPr>
           <w:b/>
-        </w:rPr>
-        <w:t>Clear</w:t>
-      </w:r>
-      <w:r>
-        <w:t xml:space="preserve"> button on the draw-mode banner.</w:t>
+          <w:color w:val="1F4E79"/>
+        </w:rPr>
+        <w:t>3.</w:t>
+        <w:tab/>
+      </w:r>
+      <w:r>
+        <w:t xml:space="preserve">Release, type your label, choose a </w:t>
+      </w:r>
+      <w:r>
+        <w:rPr>
+          <w:b/>
+        </w:rPr>
+        <w:t>Background</w:t>
+      </w:r>
+      <w:r>
+        <w:t xml:space="preserve"> (None, White, Black, Yellow, or Light gray), and click </w:t>
+      </w:r>
+      <w:r>
+        <w:rPr>
+          <w:b/>
+        </w:rPr>
+        <w:t>Place</w:t>
+      </w:r>
+      <w:r>
+        <w:t>.</w:t>
       </w:r>
     </w:p>
     <w:tbl>
@@ -7561,12 +8117,12 @@
         <w:tc>
           <w:tcPr>
             <w:tcW w:type="dxa" w:w="9360"/>
-            <w:shd w:val="clear" w:color="auto" w:fill="FDECEA"/>
+            <w:shd w:val="clear" w:color="auto" w:fill="E7F0FA"/>
             <w:tcBorders>
-              <w:top w:val="single" w:sz="4" w:space="0" w:color="D9534F"/>
-              <w:left w:val="single" w:sz="30" w:space="0" w:color="D9534F"/>
-              <w:bottom w:val="single" w:sz="4" w:space="0" w:color="D9534F"/>
-              <w:right w:val="single" w:sz="4" w:space="0" w:color="D9534F"/>
+              <w:top w:val="single" w:sz="4" w:space="0" w:color="2E6DA4"/>
+              <w:left w:val="single" w:sz="30" w:space="0" w:color="2E6DA4"/>
+              <w:bottom w:val="single" w:sz="4" w:space="0" w:color="2E6DA4"/>
+              <w:right w:val="single" w:sz="4" w:space="0" w:color="2E6DA4"/>
             </w:tcBorders>
             <w:tcMar>
               <w:top w:w="110" w:type="dxa"/>
@@ -7582,16 +8138,16 @@
             <w:r>
               <w:rPr>
                 <w:b/>
-                <w:color w:val="A32A2A"/>
+                <w:color w:val="1F4E79"/>
                 <w:sz w:val="21"/>
               </w:rPr>
-              <w:t xml:space="preserve">WARNING — Clear cannot be undone.   </w:t>
+              <w:t xml:space="preserve">Text scales with the map.   </w:t>
             </w:r>
             <w:r>
               <w:rPr>
                 <w:color w:val="222B38"/>
               </w:rPr>
-              <w:t>Clear removes every drawing on the map at once, and there is no undo. If you might want your drawings later, export them first (see below).</w:t>
+              <w:t>Unlike a fixed on-screen label, map text is tied to the ground: zoom in and it grows with the map; zoom out and it shrinks. That keeps it the right size for the area it labels at every zoom level.</w:t>
             </w:r>
           </w:p>
         </w:tc>
@@ -7601,192 +8157,6 @@
       <w:pPr>
         <w:spacing w:after="80"/>
       </w:pPr>
-    </w:p>
-    <w:p>
-      <w:pPr>
-        <w:pStyle w:val="Heading1"/>
-      </w:pPr>
-      <w:r>
-        <w:t>Leaving Draw Mode</w:t>
-      </w:r>
-    </w:p>
-    <w:p>
-      <w:r>
-        <w:t xml:space="preserve">Click </w:t>
-      </w:r>
-      <w:r>
-        <w:rPr>
-          <w:b/>
-        </w:rPr>
-        <w:t>✕ Exit</w:t>
-      </w:r>
-      <w:r>
-        <w:t xml:space="preserve"> on the draw-mode banner (or choose the same tool again from the menu to toggle it off). This returns the map to normal panning and zooming.</w:t>
-      </w:r>
-    </w:p>
-    <w:tbl>
-      <w:tblPr>
-        <w:tblW w:type="auto" w:w="0"/>
-        <w:jc w:val="center"/>
-        <w:tblLayout w:type="fixed"/>
-        <w:tblLook w:firstColumn="1" w:firstRow="1" w:lastColumn="0" w:lastRow="0" w:noHBand="0" w:noVBand="1" w:val="04A0"/>
-      </w:tblPr>
-      <w:tblGrid>
-        <w:gridCol w:w="9360"/>
-      </w:tblGrid>
-      <w:tr>
-        <w:tc>
-          <w:tcPr>
-            <w:tcW w:type="dxa" w:w="9360"/>
-            <w:shd w:val="clear" w:color="auto" w:fill="FFF4CC"/>
-            <w:tcBorders>
-              <w:top w:val="single" w:sz="4" w:space="0" w:color="E0A800"/>
-              <w:left w:val="single" w:sz="30" w:space="0" w:color="E0A800"/>
-              <w:bottom w:val="single" w:sz="4" w:space="0" w:color="E0A800"/>
-              <w:right w:val="single" w:sz="4" w:space="0" w:color="E0A800"/>
-            </w:tcBorders>
-            <w:tcMar>
-              <w:top w:w="110" w:type="dxa"/>
-              <w:start w:w="170" w:type="dxa"/>
-              <w:bottom w:w="110" w:type="dxa"/>
-              <w:end w:w="170" w:type="dxa"/>
-            </w:tcMar>
-          </w:tcPr>
-          <w:p>
-            <w:pPr>
-              <w:spacing w:after="0"/>
-            </w:pPr>
-            <w:r>
-              <w:rPr>
-                <w:b/>
-                <w:color w:val="8A6D00"/>
-                <w:sz w:val="21"/>
-              </w:rPr>
-              <w:t xml:space="preserve">Exit vs. Clear — an important difference.   </w:t>
-            </w:r>
-            <w:r>
-              <w:rPr>
-                <w:color w:val="222B38"/>
-              </w:rPr>
-              <w:t>✕ Exit only leaves draw mode — all of your drawings stay on the map. Clear deletes the drawings. They sit side by side on the banner, so make sure you click the one you mean.</w:t>
-            </w:r>
-          </w:p>
-        </w:tc>
-      </w:tr>
-    </w:tbl>
-    <w:p>
-      <w:pPr>
-        <w:spacing w:after="80"/>
-      </w:pPr>
-    </w:p>
-    <w:p>
-      <w:pPr>
-        <w:pStyle w:val="Heading1"/>
-      </w:pPr>
-      <w:r>
-        <w:t>Importing Shapes from a File (GPX / KML)</w:t>
-      </w:r>
-    </w:p>
-    <w:p>
-      <w:r>
-        <w:t>You can bring in lines, tracks, polygons, and waypoints created in other mapping or GPS programs.</w:t>
-      </w:r>
-    </w:p>
-    <w:p>
-      <w:pPr>
-        <w:tabs>
-          <w:tab w:pos="547" w:val="left"/>
-        </w:tabs>
-        <w:spacing w:after="100"/>
-        <w:ind w:left="547" w:hanging="547"/>
-      </w:pPr>
-      <w:r>
-        <w:rPr>
-          <w:b/>
-          <w:color w:val="1F4E79"/>
-        </w:rPr>
-        <w:t>1.</w:t>
-        <w:tab/>
-      </w:r>
-      <w:r>
-        <w:t xml:space="preserve">Open </w:t>
-      </w:r>
-      <w:r>
-        <w:rPr>
-          <w:b/>
-        </w:rPr>
-        <w:t>Map → Draw → Import GPX / KML…</w:t>
-      </w:r>
-      <w:r>
-        <w:t>.</w:t>
-      </w:r>
-    </w:p>
-    <w:p>
-      <w:pPr>
-        <w:tabs>
-          <w:tab w:pos="547" w:val="left"/>
-        </w:tabs>
-        <w:spacing w:after="100"/>
-        <w:ind w:left="547" w:hanging="547"/>
-      </w:pPr>
-      <w:r>
-        <w:rPr>
-          <w:b/>
-          <w:color w:val="1F4E79"/>
-        </w:rPr>
-        <w:t>2.</w:t>
-        <w:tab/>
-      </w:r>
-      <w:r>
-        <w:t xml:space="preserve">Choose a </w:t>
-      </w:r>
-      <w:r>
-        <w:rPr>
-          <w:b/>
-        </w:rPr>
-        <w:t>.gpx</w:t>
-      </w:r>
-      <w:r>
-        <w:t xml:space="preserve"> or </w:t>
-      </w:r>
-      <w:r>
-        <w:rPr>
-          <w:b/>
-        </w:rPr>
-        <w:t>.kml</w:t>
-      </w:r>
-      <w:r>
-        <w:t xml:space="preserve"> file and click Open.</w:t>
-      </w:r>
-    </w:p>
-    <w:p>
-      <w:pPr>
-        <w:tabs>
-          <w:tab w:pos="547" w:val="left"/>
-        </w:tabs>
-        <w:spacing w:after="100"/>
-        <w:ind w:left="547" w:hanging="547"/>
-      </w:pPr>
-      <w:r>
-        <w:rPr>
-          <w:b/>
-          <w:color w:val="1F4E79"/>
-        </w:rPr>
-        <w:t>3.</w:t>
-        <w:tab/>
-      </w:r>
-      <w:r>
-        <w:t xml:space="preserve">The shapes appear on the map. Waypoints show as labelled dots; tracks and lines show as lines; areas show as polygons. Imported shapes are </w:t>
-      </w:r>
-      <w:r>
-        <w:rPr>
-          <w:b/>
-        </w:rPr>
-        <w:t>added</w:t>
-      </w:r>
-      <w:r>
-        <w:t xml:space="preserve"> to whatever you have already drawn.</w:t>
-      </w:r>
     </w:p>
     <w:tbl>
       <w:tblPr>
@@ -7841,7 +8211,7 @@
                 <w:color w:val="64748B"/>
                 <w:sz w:val="20"/>
               </w:rPr>
-              <w:t>The file picker for importing a GPX or KML file, and the shapes after they load</w:t>
+              <w:t>Placing text — dragging to size it, then the label dialog with the Background choice</w:t>
             </w:r>
           </w:p>
         </w:tc>
@@ -7857,7 +8227,7 @@
         <w:pStyle w:val="Heading1"/>
       </w:pPr>
       <w:r>
-        <w:t>Exporting Your Drawings</w:t>
+        <w:t>Resizing or Moving Text</w:t>
       </w:r>
     </w:p>
     <w:p>
@@ -7877,16 +8247,16 @@
         <w:tab/>
       </w:r>
       <w:r>
-        <w:t xml:space="preserve">Open </w:t>
+        <w:t xml:space="preserve">Click the </w:t>
       </w:r>
       <w:r>
         <w:rPr>
           <w:b/>
         </w:rPr>
-        <w:t>Map → Draw → Export Drawings…</w:t>
-      </w:r>
-      <w:r>
-        <w:t>.</w:t>
+        <w:t>Resize / Move text</w:t>
+      </w:r>
+      <w:r>
+        <w:t xml:space="preserve"> tool on the toolbar.</w:t>
       </w:r>
     </w:p>
     <w:p>
@@ -7906,25 +8276,16 @@
         <w:tab/>
       </w:r>
       <w:r>
-        <w:t xml:space="preserve">Choose a format — </w:t>
+        <w:t xml:space="preserve">Click a label to </w:t>
       </w:r>
       <w:r>
         <w:rPr>
           <w:b/>
         </w:rPr>
-        <w:t>GPX</w:t>
-      </w:r>
-      <w:r>
-        <w:t xml:space="preserve"> or </w:t>
-      </w:r>
-      <w:r>
-        <w:rPr>
-          <w:b/>
-        </w:rPr>
-        <w:t>KML</w:t>
-      </w:r>
-      <w:r>
-        <w:t xml:space="preserve"> — and a file name, then click Save.</w:t>
+        <w:t>select</w:t>
+      </w:r>
+      <w:r>
+        <w:t xml:space="preserve"> it — a small square handle appears.</w:t>
       </w:r>
     </w:p>
     <w:p>
@@ -7944,7 +8305,280 @@
         <w:tab/>
       </w:r>
       <w:r>
-        <w:t>Your drawn shapes are written to the file, ready to reuse here or share with another program.</w:t>
+        <w:t xml:space="preserve">Drag the </w:t>
+      </w:r>
+      <w:r>
+        <w:rPr>
+          <w:b/>
+        </w:rPr>
+        <w:t>handle</w:t>
+      </w:r>
+      <w:r>
+        <w:t xml:space="preserve"> to resize the text, or drag the </w:t>
+      </w:r>
+      <w:r>
+        <w:rPr>
+          <w:b/>
+        </w:rPr>
+        <w:t>label itself</w:t>
+      </w:r>
+      <w:r>
+        <w:t xml:space="preserve"> to move it.</w:t>
+      </w:r>
+    </w:p>
+    <w:tbl>
+      <w:tblPr>
+        <w:tblW w:type="auto" w:w="0"/>
+        <w:jc w:val="center"/>
+        <w:tblLayout w:type="fixed"/>
+        <w:tblLook w:firstColumn="1" w:firstRow="1" w:lastColumn="0" w:lastRow="0" w:noHBand="0" w:noVBand="1" w:val="04A0"/>
+      </w:tblPr>
+      <w:tblGrid>
+        <w:gridCol w:w="9360"/>
+      </w:tblGrid>
+      <w:tr>
+        <w:tc>
+          <w:tcPr>
+            <w:tcW w:type="dxa" w:w="9360"/>
+            <w:shd w:val="clear" w:color="auto" w:fill="F1F5F9"/>
+            <w:tcBorders>
+              <w:top w:val="dashed" w:sz="8" w:space="0" w:color="94A3B8"/>
+              <w:left w:val="dashed" w:sz="8" w:space="0" w:color="94A3B8"/>
+              <w:bottom w:val="dashed" w:sz="8" w:space="0" w:color="94A3B8"/>
+              <w:right w:val="dashed" w:sz="8" w:space="0" w:color="94A3B8"/>
+            </w:tcBorders>
+            <w:tcMar>
+              <w:top w:w="220" w:type="dxa"/>
+              <w:start w:w="170" w:type="dxa"/>
+              <w:bottom w:w="220" w:type="dxa"/>
+              <w:end w:w="170" w:type="dxa"/>
+            </w:tcMar>
+          </w:tcPr>
+          <w:p>
+            <w:pPr>
+              <w:spacing w:after="40"/>
+              <w:jc w:val="center"/>
+            </w:pPr>
+            <w:r>
+              <w:rPr>
+                <w:b/>
+                <w:color w:val="64748B"/>
+                <w:sz w:val="18"/>
+              </w:rPr>
+              <w:t>SCREENSHOT</w:t>
+            </w:r>
+          </w:p>
+          <w:p>
+            <w:pPr>
+              <w:spacing w:after="0"/>
+              <w:jc w:val="center"/>
+            </w:pPr>
+            <w:r>
+              <w:rPr>
+                <w:i/>
+                <w:color w:val="64748B"/>
+                <w:sz w:val="20"/>
+              </w:rPr>
+              <w:t>A selected text label showing its resize handle</w:t>
+            </w:r>
+          </w:p>
+        </w:tc>
+      </w:tr>
+    </w:tbl>
+    <w:p>
+      <w:pPr>
+        <w:spacing w:after="80"/>
+      </w:pPr>
+    </w:p>
+    <w:p>
+      <w:pPr>
+        <w:pStyle w:val="Heading1"/>
+      </w:pPr>
+      <w:r>
+        <w:t>The Eyedropper</w:t>
+      </w:r>
+    </w:p>
+    <w:p>
+      <w:r>
+        <w:t>The eyedropper matches a color that is already on the map — a station symbol, the terrain, another drawing.</w:t>
+      </w:r>
+    </w:p>
+    <w:p>
+      <w:pPr>
+        <w:tabs>
+          <w:tab w:pos="547" w:val="left"/>
+        </w:tabs>
+        <w:spacing w:after="100"/>
+        <w:ind w:left="547" w:hanging="547"/>
+      </w:pPr>
+      <w:r>
+        <w:rPr>
+          <w:b/>
+          <w:color w:val="1F4E79"/>
+        </w:rPr>
+        <w:t>1.</w:t>
+        <w:tab/>
+      </w:r>
+      <w:r>
+        <w:t xml:space="preserve">Click the </w:t>
+      </w:r>
+      <w:r>
+        <w:rPr>
+          <w:b/>
+        </w:rPr>
+        <w:t>Eyedropper</w:t>
+      </w:r>
+      <w:r>
+        <w:t xml:space="preserve"> tool.</w:t>
+      </w:r>
+    </w:p>
+    <w:p>
+      <w:pPr>
+        <w:tabs>
+          <w:tab w:pos="547" w:val="left"/>
+        </w:tabs>
+        <w:spacing w:after="100"/>
+        <w:ind w:left="547" w:hanging="547"/>
+      </w:pPr>
+      <w:r>
+        <w:rPr>
+          <w:b/>
+          <w:color w:val="1F4E79"/>
+        </w:rPr>
+        <w:t>2.</w:t>
+        <w:tab/>
+      </w:r>
+      <w:r>
+        <w:t>Click anywhere on the map. The color under your click becomes the current tool's color, and you return to your drawing tool automatically.</w:t>
+      </w:r>
+    </w:p>
+    <w:p>
+      <w:pPr>
+        <w:pStyle w:val="Heading1"/>
+      </w:pPr>
+      <w:r>
+        <w:t>Measurements</w:t>
+      </w:r>
+    </w:p>
+    <w:p>
+      <w:r>
+        <w:t xml:space="preserve">Turn on </w:t>
+      </w:r>
+      <w:r>
+        <w:rPr>
+          <w:b/>
+        </w:rPr>
+        <w:t>Measure</w:t>
+      </w:r>
+      <w:r>
+        <w:t xml:space="preserve"> on the toolbar to label each shape with its real-world size:</w:t>
+      </w:r>
+    </w:p>
+    <w:p>
+      <w:pPr>
+        <w:tabs>
+          <w:tab w:pos="547" w:val="left"/>
+        </w:tabs>
+        <w:spacing w:after="80"/>
+        <w:ind w:left="547" w:hanging="288"/>
+      </w:pPr>
+      <w:r>
+        <w:rPr>
+          <w:color w:val="2E6DA4"/>
+        </w:rPr>
+        <w:t>▪</w:t>
+        <w:tab/>
+      </w:r>
+      <w:r>
+        <w:rPr>
+          <w:b/>
+        </w:rPr>
+        <w:t>Line</w:t>
+      </w:r>
+      <w:r>
+        <w:t xml:space="preserve"> — its length.</w:t>
+      </w:r>
+    </w:p>
+    <w:p>
+      <w:pPr>
+        <w:tabs>
+          <w:tab w:pos="547" w:val="left"/>
+        </w:tabs>
+        <w:spacing w:after="80"/>
+        <w:ind w:left="547" w:hanging="288"/>
+      </w:pPr>
+      <w:r>
+        <w:rPr>
+          <w:color w:val="2E6DA4"/>
+        </w:rPr>
+        <w:t>▪</w:t>
+        <w:tab/>
+      </w:r>
+      <w:r>
+        <w:rPr>
+          <w:b/>
+        </w:rPr>
+        <w:t>Circle</w:t>
+      </w:r>
+      <w:r>
+        <w:t xml:space="preserve"> — its diameter and area.</w:t>
+      </w:r>
+    </w:p>
+    <w:p>
+      <w:pPr>
+        <w:tabs>
+          <w:tab w:pos="547" w:val="left"/>
+        </w:tabs>
+        <w:spacing w:after="80"/>
+        <w:ind w:left="547" w:hanging="288"/>
+      </w:pPr>
+      <w:r>
+        <w:rPr>
+          <w:color w:val="2E6DA4"/>
+        </w:rPr>
+        <w:t>▪</w:t>
+        <w:tab/>
+      </w:r>
+      <w:r>
+        <w:rPr>
+          <w:b/>
+        </w:rPr>
+        <w:t>Polygon</w:t>
+      </w:r>
+      <w:r>
+        <w:t xml:space="preserve"> — its area.</w:t>
+      </w:r>
+    </w:p>
+    <w:p>
+      <w:r>
+        <w:t xml:space="preserve">Use </w:t>
+      </w:r>
+      <w:r>
+        <w:rPr>
+          <w:b/>
+        </w:rPr>
+        <w:t>Units</w:t>
+      </w:r>
+      <w:r>
+        <w:t xml:space="preserve"> to switch between </w:t>
+      </w:r>
+      <w:r>
+        <w:rPr>
+          <w:b/>
+        </w:rPr>
+        <w:t>Imperial</w:t>
+      </w:r>
+      <w:r>
+        <w:t xml:space="preserve"> (feet, miles, acres) and </w:t>
+      </w:r>
+      <w:r>
+        <w:rPr>
+          <w:b/>
+        </w:rPr>
+        <w:t>Metric</w:t>
+      </w:r>
+      <w:r>
+        <w:t xml:space="preserve"> (meters, kilometers, hectares) — the unit auto-scales to the size. The value is the true distance on the ground, stays correct as you zoom, is the same on every base map, and updates live while you draw.</w:t>
       </w:r>
     </w:p>
     <w:tbl>
@@ -7991,7 +8625,7 @@
               <w:rPr>
                 <w:color w:val="222B38"/>
               </w:rPr>
-              <w:t>If you have not drawn anything yet, Export tells you there is nothing to save instead of writing an empty file.</w:t>
+              <w:t>Measurements are corrected for the map projection, so a mile measured near the poles reads the same as a mile at the equator — the on-screen size differs, but the real-world number is right.</w:t>
             </w:r>
           </w:p>
         </w:tc>
@@ -8002,12 +8636,161 @@
         <w:spacing w:after="80"/>
       </w:pPr>
     </w:p>
+    <w:tbl>
+      <w:tblPr>
+        <w:tblW w:type="auto" w:w="0"/>
+        <w:jc w:val="center"/>
+        <w:tblLayout w:type="fixed"/>
+        <w:tblLook w:firstColumn="1" w:firstRow="1" w:lastColumn="0" w:lastRow="0" w:noHBand="0" w:noVBand="1" w:val="04A0"/>
+      </w:tblPr>
+      <w:tblGrid>
+        <w:gridCol w:w="9360"/>
+      </w:tblGrid>
+      <w:tr>
+        <w:tc>
+          <w:tcPr>
+            <w:tcW w:type="dxa" w:w="9360"/>
+            <w:shd w:val="clear" w:color="auto" w:fill="F1F5F9"/>
+            <w:tcBorders>
+              <w:top w:val="dashed" w:sz="8" w:space="0" w:color="94A3B8"/>
+              <w:left w:val="dashed" w:sz="8" w:space="0" w:color="94A3B8"/>
+              <w:bottom w:val="dashed" w:sz="8" w:space="0" w:color="94A3B8"/>
+              <w:right w:val="dashed" w:sz="8" w:space="0" w:color="94A3B8"/>
+            </w:tcBorders>
+            <w:tcMar>
+              <w:top w:w="220" w:type="dxa"/>
+              <w:start w:w="170" w:type="dxa"/>
+              <w:bottom w:w="220" w:type="dxa"/>
+              <w:end w:w="170" w:type="dxa"/>
+            </w:tcMar>
+          </w:tcPr>
+          <w:p>
+            <w:pPr>
+              <w:spacing w:after="40"/>
+              <w:jc w:val="center"/>
+            </w:pPr>
+            <w:r>
+              <w:rPr>
+                <w:b/>
+                <w:color w:val="64748B"/>
+                <w:sz w:val="18"/>
+              </w:rPr>
+              <w:t>SCREENSHOT</w:t>
+            </w:r>
+          </w:p>
+          <w:p>
+            <w:pPr>
+              <w:spacing w:after="0"/>
+              <w:jc w:val="center"/>
+            </w:pPr>
+            <w:r>
+              <w:rPr>
+                <w:i/>
+                <w:color w:val="64748B"/>
+                <w:sz w:val="20"/>
+              </w:rPr>
+              <w:t>Shapes with measurement labels — a line's length, a circle's diameter and area, a polygon's area</w:t>
+            </w:r>
+          </w:p>
+        </w:tc>
+      </w:tr>
+    </w:tbl>
+    <w:p>
+      <w:pPr>
+        <w:spacing w:after="80"/>
+      </w:pPr>
+    </w:p>
     <w:p>
       <w:pPr>
         <w:pStyle w:val="Heading1"/>
       </w:pPr>
       <w:r>
-        <w:t>Saving Your Work Between Sessions</w:t>
+        <w:t>Erasing a Shape</w:t>
+      </w:r>
+    </w:p>
+    <w:p>
+      <w:pPr>
+        <w:tabs>
+          <w:tab w:pos="547" w:val="left"/>
+        </w:tabs>
+        <w:spacing w:after="100"/>
+        <w:ind w:left="547" w:hanging="547"/>
+      </w:pPr>
+      <w:r>
+        <w:rPr>
+          <w:b/>
+          <w:color w:val="1F4E79"/>
+        </w:rPr>
+        <w:t>1.</w:t>
+        <w:tab/>
+      </w:r>
+      <w:r>
+        <w:t xml:space="preserve">Click the </w:t>
+      </w:r>
+      <w:r>
+        <w:rPr>
+          <w:b/>
+        </w:rPr>
+        <w:t>Erase</w:t>
+      </w:r>
+      <w:r>
+        <w:t xml:space="preserve"> tool.</w:t>
+      </w:r>
+    </w:p>
+    <w:p>
+      <w:pPr>
+        <w:tabs>
+          <w:tab w:pos="547" w:val="left"/>
+        </w:tabs>
+        <w:spacing w:after="100"/>
+        <w:ind w:left="547" w:hanging="547"/>
+      </w:pPr>
+      <w:r>
+        <w:rPr>
+          <w:b/>
+          <w:color w:val="1F4E79"/>
+        </w:rPr>
+        <w:t>2.</w:t>
+        <w:tab/>
+      </w:r>
+      <w:r>
+        <w:t>Click on (or near) the shape to remove. It disappears; everything else stays.</w:t>
+      </w:r>
+    </w:p>
+    <w:p>
+      <w:r>
+        <w:t>Erase stays active, so you can remove several shapes one after another.</w:t>
+      </w:r>
+    </w:p>
+    <w:p>
+      <w:pPr>
+        <w:pStyle w:val="Heading1"/>
+      </w:pPr>
+      <w:r>
+        <w:t>Clearing Everything, and Leaving Draw Mode</w:t>
+      </w:r>
+    </w:p>
+    <w:p>
+      <w:r>
+        <w:t xml:space="preserve">The toolbar's </w:t>
+      </w:r>
+      <w:r>
+        <w:rPr>
+          <w:b/>
+        </w:rPr>
+        <w:t>Clear</w:t>
+      </w:r>
+      <w:r>
+        <w:t xml:space="preserve"> button deletes every drawing at once. The </w:t>
+      </w:r>
+      <w:r>
+        <w:rPr>
+          <w:b/>
+        </w:rPr>
+        <w:t>✕ Exit</w:t>
+      </w:r>
+      <w:r>
+        <w:t xml:space="preserve"> button leaves draw mode and returns the map to normal panning — your drawings stay.</w:t>
       </w:r>
     </w:p>
     <w:tbl>
@@ -8048,13 +8831,13 @@
                 <w:color w:val="8A6D00"/>
                 <w:sz w:val="21"/>
               </w:rPr>
-              <w:t xml:space="preserve">IMPORTANT — drawings are not saved automatically.   </w:t>
+              <w:t xml:space="preserve">Clear vs. Exit.   </w:t>
             </w:r>
             <w:r>
               <w:rPr>
                 <w:color w:val="222B38"/>
               </w:rPr>
-              <w:t>Drawings live only for the current session. They are cleared when you close APRS Command. If you want to keep a set of drawings, use Export Drawings… to save them to a GPX or KML file, then Import that file next time.</w:t>
+              <w:t>Clear deletes your drawings. ✕ Exit keeps them and just leaves draw mode. They sit next to each other on the toolbar, so click the one you mean. Clear cannot be undone — export first if you might want them later.</w:t>
             </w:r>
           </w:p>
         </w:tc>
@@ -8070,6 +8853,231 @@
         <w:pStyle w:val="Heading1"/>
       </w:pPr>
       <w:r>
+        <w:t>Importing Shapes from a File (GPX / KML)</w:t>
+      </w:r>
+    </w:p>
+    <w:p>
+      <w:pPr>
+        <w:tabs>
+          <w:tab w:pos="547" w:val="left"/>
+        </w:tabs>
+        <w:spacing w:after="100"/>
+        <w:ind w:left="547" w:hanging="547"/>
+      </w:pPr>
+      <w:r>
+        <w:rPr>
+          <w:b/>
+          <w:color w:val="1F4E79"/>
+        </w:rPr>
+        <w:t>1.</w:t>
+        <w:tab/>
+      </w:r>
+      <w:r>
+        <w:t xml:space="preserve">Choose </w:t>
+      </w:r>
+      <w:r>
+        <w:rPr>
+          <w:b/>
+        </w:rPr>
+        <w:t>Map → Draw → Import GPX / KML…</w:t>
+      </w:r>
+      <w:r>
+        <w:t>.</w:t>
+      </w:r>
+    </w:p>
+    <w:p>
+      <w:pPr>
+        <w:tabs>
+          <w:tab w:pos="547" w:val="left"/>
+        </w:tabs>
+        <w:spacing w:after="100"/>
+        <w:ind w:left="547" w:hanging="547"/>
+      </w:pPr>
+      <w:r>
+        <w:rPr>
+          <w:b/>
+          <w:color w:val="1F4E79"/>
+        </w:rPr>
+        <w:t>2.</w:t>
+        <w:tab/>
+      </w:r>
+      <w:r>
+        <w:t xml:space="preserve">Pick a </w:t>
+      </w:r>
+      <w:r>
+        <w:rPr>
+          <w:b/>
+        </w:rPr>
+        <w:t>.gpx</w:t>
+      </w:r>
+      <w:r>
+        <w:t xml:space="preserve"> or </w:t>
+      </w:r>
+      <w:r>
+        <w:rPr>
+          <w:b/>
+        </w:rPr>
+        <w:t>.kml</w:t>
+      </w:r>
+      <w:r>
+        <w:t xml:space="preserve"> file and open it.</w:t>
+      </w:r>
+    </w:p>
+    <w:p>
+      <w:pPr>
+        <w:tabs>
+          <w:tab w:pos="547" w:val="left"/>
+        </w:tabs>
+        <w:spacing w:after="100"/>
+        <w:ind w:left="547" w:hanging="547"/>
+      </w:pPr>
+      <w:r>
+        <w:rPr>
+          <w:b/>
+          <w:color w:val="1F4E79"/>
+        </w:rPr>
+        <w:t>3.</w:t>
+        <w:tab/>
+      </w:r>
+      <w:r>
+        <w:t>Lines, tracks, and areas appear on the map; waypoints show as labeled dots. Imported shapes are added to whatever you have already drawn.</w:t>
+      </w:r>
+    </w:p>
+    <w:p>
+      <w:pPr>
+        <w:pStyle w:val="Heading1"/>
+      </w:pPr>
+      <w:r>
+        <w:t>Exporting Your Drawings</w:t>
+      </w:r>
+    </w:p>
+    <w:p>
+      <w:pPr>
+        <w:tabs>
+          <w:tab w:pos="547" w:val="left"/>
+        </w:tabs>
+        <w:spacing w:after="100"/>
+        <w:ind w:left="547" w:hanging="547"/>
+      </w:pPr>
+      <w:r>
+        <w:rPr>
+          <w:b/>
+          <w:color w:val="1F4E79"/>
+        </w:rPr>
+        <w:t>1.</w:t>
+        <w:tab/>
+      </w:r>
+      <w:r>
+        <w:t xml:space="preserve">Choose </w:t>
+      </w:r>
+      <w:r>
+        <w:rPr>
+          <w:b/>
+        </w:rPr>
+        <w:t>Map → Draw → Export Drawings…</w:t>
+      </w:r>
+      <w:r>
+        <w:t>.</w:t>
+      </w:r>
+    </w:p>
+    <w:p>
+      <w:pPr>
+        <w:tabs>
+          <w:tab w:pos="547" w:val="left"/>
+        </w:tabs>
+        <w:spacing w:after="100"/>
+        <w:ind w:left="547" w:hanging="547"/>
+      </w:pPr>
+      <w:r>
+        <w:rPr>
+          <w:b/>
+          <w:color w:val="1F4E79"/>
+        </w:rPr>
+        <w:t>2.</w:t>
+        <w:tab/>
+      </w:r>
+      <w:r>
+        <w:t xml:space="preserve">Pick </w:t>
+      </w:r>
+      <w:r>
+        <w:rPr>
+          <w:b/>
+        </w:rPr>
+        <w:t>GPX</w:t>
+      </w:r>
+      <w:r>
+        <w:t xml:space="preserve"> or </w:t>
+      </w:r>
+      <w:r>
+        <w:rPr>
+          <w:b/>
+        </w:rPr>
+        <w:t>KML</w:t>
+      </w:r>
+      <w:r>
+        <w:t xml:space="preserve"> and a file name, then Save.</w:t>
+      </w:r>
+    </w:p>
+    <w:tbl>
+      <w:tblPr>
+        <w:tblW w:type="auto" w:w="0"/>
+        <w:jc w:val="center"/>
+        <w:tblLayout w:type="fixed"/>
+        <w:tblLook w:firstColumn="1" w:firstRow="1" w:lastColumn="0" w:lastRow="0" w:noHBand="0" w:noVBand="1" w:val="04A0"/>
+      </w:tblPr>
+      <w:tblGrid>
+        <w:gridCol w:w="9360"/>
+      </w:tblGrid>
+      <w:tr>
+        <w:tc>
+          <w:tcPr>
+            <w:tcW w:type="dxa" w:w="9360"/>
+            <w:shd w:val="clear" w:color="auto" w:fill="FFF4CC"/>
+            <w:tcBorders>
+              <w:top w:val="single" w:sz="4" w:space="0" w:color="E0A800"/>
+              <w:left w:val="single" w:sz="30" w:space="0" w:color="E0A800"/>
+              <w:bottom w:val="single" w:sz="4" w:space="0" w:color="E0A800"/>
+              <w:right w:val="single" w:sz="4" w:space="0" w:color="E0A800"/>
+            </w:tcBorders>
+            <w:tcMar>
+              <w:top w:w="110" w:type="dxa"/>
+              <w:start w:w="170" w:type="dxa"/>
+              <w:bottom w:w="110" w:type="dxa"/>
+              <w:end w:w="170" w:type="dxa"/>
+            </w:tcMar>
+          </w:tcPr>
+          <w:p>
+            <w:pPr>
+              <w:spacing w:after="0"/>
+            </w:pPr>
+            <w:r>
+              <w:rPr>
+                <w:b/>
+                <w:color w:val="8A6D00"/>
+                <w:sz w:val="21"/>
+              </w:rPr>
+              <w:t xml:space="preserve">Drawings are not saved automatically.   </w:t>
+            </w:r>
+            <w:r>
+              <w:rPr>
+                <w:color w:val="222B38"/>
+              </w:rPr>
+              <w:t>Your drawings live only for the current session and are cleared when you close APRS Command. To keep a set of drawings, Export them to a GPX or KML file and Import that file next time.</w:t>
+            </w:r>
+          </w:p>
+        </w:tc>
+      </w:tr>
+    </w:tbl>
+    <w:p>
+      <w:pPr>
+        <w:spacing w:after="80"/>
+      </w:pPr>
+    </w:p>
+    <w:p>
+      <w:pPr>
+        <w:pStyle w:val="Heading1"/>
+      </w:pPr>
+      <w:r>
         <w:t>Troubleshooting</w:t>
       </w:r>
     </w:p>
@@ -8095,7 +9103,7 @@
         <w:t>“I can’t pan the map.”</w:t>
       </w:r>
       <w:r>
-        <w:t xml:space="preserve"> You are in draw mode — dragging draws instead of panning. Click ✕ Exit on the draw-mode banner to return to normal map movement (you can still zoom with the wheel while drawing).</w:t>
+        <w:t xml:space="preserve"> You are in draw mode — dragging draws instead of panning. Click ✕ Exit on the toolbar (you can still zoom with the wheel while drawing).</w:t>
       </w:r>
     </w:p>
     <w:p>
@@ -8120,7 +9128,7 @@
         <w:t>“My circle didn’t appear.”</w:t>
       </w:r>
       <w:r>
-        <w:t xml:space="preserve"> Press at the centre and drag outward before releasing. A click with no drag makes no circle.</w:t>
+        <w:t xml:space="preserve"> Press at the center and drag outward before releasing; a click with no drag makes no circle.</w:t>
       </w:r>
     </w:p>
     <w:p>
@@ -8142,10 +9150,10 @@
         <w:rPr>
           <w:b/>
         </w:rPr>
-        <w:t>“My line or polygon vanished.”</w:t>
-      </w:r>
-      <w:r>
-        <w:t xml:space="preserve"> Finishing is a double-click; switching tools also keeps a finished shape. If everything is gone, you may have used Clear (which deletes) rather than ✕ Exit (which keeps your drawings).</w:t>
+        <w:t>“My color change affected only one tool.”</w:t>
+      </w:r>
+      <w:r>
+        <w:t xml:space="preserve"> That is by design — color, fill, and width are remembered per tool. Switch to the other tool and set its color there.</w:t>
       </w:r>
     </w:p>
     <w:p>
@@ -8170,7 +9178,7 @@
         <w:t>“I lost my drawings after restarting.”</w:t>
       </w:r>
       <w:r>
-        <w:t xml:space="preserve"> Drawings are session-only. Export them to a file before closing to keep them (see “Saving Your Work Between Sessions”).</w:t>
+        <w:t xml:space="preserve"> Drawings are session-only. Export them before closing to keep them.</w:t>
       </w:r>
     </w:p>
     <w:p>

</xml_diff>